<commit_message>
docs: informe, presentacion y README con las funciones nuevas y cifras actualizadas
- Informe: seccion de analisis entre medios (encuadre, primicia, tono por
  figura, mapa de medios, termometro), indicadores y pestañas nuevas,
  retencion de 30 dias, notebook, resultados con 5.302 notas.
- Presentacion: 24 diapositivas; termometro y resumen, encuadre y primicia,
  tono por figura y mapa de medios con capturas reales; titulos de rankings
  armados desde los datos.
- README: indicadores nuevos, notebook y hallazgos actualizados.

Co-Authored-By: Claude Opus 5.5 <noreply@anthropic.com>
</commit_message>
<xml_diff>
--- a/docs/informe-tp.docx
+++ b/docs/informe-tp.docx
@@ -625,12 +625,34 @@
         </w:p>
         <w:p>
           <w:pPr>
+            <w:pStyle w:val="TOC2"/>
+            <w:tabs>
+              <w:tab w:val="right" w:pos="9026" w:leader="dot"/>
+            </w:tabs>
+          </w:pPr>
+          <w:hyperlink w:history="1" w:anchor="_Toc22">
+            <w:r>
+              <w:t xml:space="preserve">7.6 Análisis entre medios</w:t>
+            </w:r>
+            <w:r>
+              <w:tab/>
+            </w:r>
+            <w:r>
+              <w:fldChar w:fldCharType="begin" w:dirty="true"/>
+              <w:instrText xml:space="preserve">PAGEREF _Toc22 \h</w:instrText>
+              <w:fldChar w:fldCharType="separate"/>
+              <w:fldChar w:fldCharType="end"/>
+            </w:r>
+          </w:hyperlink>
+        </w:p>
+        <w:p>
+          <w:pPr>
             <w:pStyle w:val="TOC1"/>
             <w:tabs>
               <w:tab w:val="right" w:pos="9026" w:leader="dot"/>
             </w:tabs>
           </w:pPr>
-          <w:hyperlink w:history="1" w:anchor="_Toc22">
+          <w:hyperlink w:history="1" w:anchor="_Toc23">
             <w:r>
               <w:t xml:space="preserve">8. Almacenamiento</w:t>
             </w:r>
@@ -639,7 +661,7 @@
             </w:r>
             <w:r>
               <w:fldChar w:fldCharType="begin" w:dirty="true"/>
-              <w:instrText xml:space="preserve">PAGEREF _Toc22 \h</w:instrText>
+              <w:instrText xml:space="preserve">PAGEREF _Toc23 \h</w:instrText>
               <w:fldChar w:fldCharType="separate"/>
               <w:fldChar w:fldCharType="end"/>
             </w:r>
@@ -652,31 +674,9 @@
               <w:tab w:val="right" w:pos="9026" w:leader="dot"/>
             </w:tabs>
           </w:pPr>
-          <w:hyperlink w:history="1" w:anchor="_Toc23">
+          <w:hyperlink w:history="1" w:anchor="_Toc24">
             <w:r>
               <w:t xml:space="preserve">Acceso a los datos</w:t>
-            </w:r>
-            <w:r>
-              <w:tab/>
-            </w:r>
-            <w:r>
-              <w:fldChar w:fldCharType="begin" w:dirty="true"/>
-              <w:instrText xml:space="preserve">PAGEREF _Toc23 \h</w:instrText>
-              <w:fldChar w:fldCharType="separate"/>
-              <w:fldChar w:fldCharType="end"/>
-            </w:r>
-          </w:hyperlink>
-        </w:p>
-        <w:p>
-          <w:pPr>
-            <w:pStyle w:val="TOC1"/>
-            <w:tabs>
-              <w:tab w:val="right" w:pos="9026" w:leader="dot"/>
-            </w:tabs>
-          </w:pPr>
-          <w:hyperlink w:history="1" w:anchor="_Toc24">
-            <w:r>
-              <w:t xml:space="preserve">9. Indicadores</w:t>
             </w:r>
             <w:r>
               <w:tab/>
@@ -698,7 +698,7 @@
           </w:pPr>
           <w:hyperlink w:history="1" w:anchor="_Toc25">
             <w:r>
-              <w:t xml:space="preserve">10. El tablero HTML</w:t>
+              <w:t xml:space="preserve">9. Indicadores</w:t>
             </w:r>
             <w:r>
               <w:tab/>
@@ -720,7 +720,7 @@
           </w:pPr>
           <w:hyperlink w:history="1" w:anchor="_Toc26">
             <w:r>
-              <w:t xml:space="preserve">11. Resultados preliminares</w:t>
+              <w:t xml:space="preserve">10. El tablero HTML</w:t>
             </w:r>
             <w:r>
               <w:tab/>
@@ -742,7 +742,7 @@
           </w:pPr>
           <w:hyperlink w:history="1" w:anchor="_Toc27">
             <w:r>
-              <w:t xml:space="preserve">12. Herramientas</w:t>
+              <w:t xml:space="preserve">11. Resultados preliminares</w:t>
             </w:r>
             <w:r>
               <w:tab/>
@@ -764,7 +764,7 @@
           </w:pPr>
           <w:hyperlink w:history="1" w:anchor="_Toc28">
             <w:r>
-              <w:t xml:space="preserve">13. Ética y aspectos legales</w:t>
+              <w:t xml:space="preserve">12. Herramientas</w:t>
             </w:r>
             <w:r>
               <w:tab/>
@@ -786,7 +786,7 @@
           </w:pPr>
           <w:hyperlink w:history="1" w:anchor="_Toc29">
             <w:r>
-              <w:t xml:space="preserve">14. Limitaciones</w:t>
+              <w:t xml:space="preserve">13. Ética y aspectos legales</w:t>
             </w:r>
             <w:r>
               <w:tab/>
@@ -808,7 +808,7 @@
           </w:pPr>
           <w:hyperlink w:history="1" w:anchor="_Toc30">
             <w:r>
-              <w:t xml:space="preserve">15. Trabajo futuro</w:t>
+              <w:t xml:space="preserve">14. Limitaciones</w:t>
             </w:r>
             <w:r>
               <w:tab/>
@@ -830,7 +830,7 @@
           </w:pPr>
           <w:hyperlink w:history="1" w:anchor="_Toc31">
             <w:r>
-              <w:t xml:space="preserve">16. Cómo reproducirlo</w:t>
+              <w:t xml:space="preserve">15. Trabajo futuro</w:t>
             </w:r>
             <w:r>
               <w:tab/>
@@ -852,7 +852,7 @@
           </w:pPr>
           <w:hyperlink w:history="1" w:anchor="_Toc32">
             <w:r>
-              <w:t xml:space="preserve">Anexo: consultas SQL de ejemplo</w:t>
+              <w:t xml:space="preserve">16. Cómo reproducirlo</w:t>
             </w:r>
             <w:r>
               <w:tab/>
@@ -860,6 +860,28 @@
             <w:r>
               <w:fldChar w:fldCharType="begin" w:dirty="true"/>
               <w:instrText xml:space="preserve">PAGEREF _Toc32 \h</w:instrText>
+              <w:fldChar w:fldCharType="separate"/>
+              <w:fldChar w:fldCharType="end"/>
+            </w:r>
+          </w:hyperlink>
+        </w:p>
+        <w:p>
+          <w:pPr>
+            <w:pStyle w:val="TOC1"/>
+            <w:tabs>
+              <w:tab w:val="right" w:pos="9026" w:leader="dot"/>
+            </w:tabs>
+          </w:pPr>
+          <w:hyperlink w:history="1" w:anchor="_Toc33">
+            <w:r>
+              <w:t xml:space="preserve">Anexo: consultas SQL de ejemplo</w:t>
+            </w:r>
+            <w:r>
+              <w:tab/>
+            </w:r>
+            <w:r>
+              <w:fldChar w:fldCharType="begin" w:dirty="true"/>
+              <w:instrText xml:space="preserve">PAGEREF _Toc33 \h</w:instrText>
               <w:fldChar w:fldCharType="separate"/>
               <w:fldChar w:fldCharType="end"/>
             </w:r>
@@ -999,10 +1021,10 @@
           <w:b/>
           <w:bCs/>
         </w:rPr>
-        <w:t xml:space="preserve">4.386 notas de 45 medios</w:t>
-      </w:r>
-      <w:r>
-        <w:t xml:space="preserve"> con funcionamiento continuo; el 94% ya había sido enriquecido entrando a la página de la nota.</w:t>
+        <w:t xml:space="preserve">5.302 notas de 45 medios</w:t>
+      </w:r>
+      <w:r>
+        <w:t xml:space="preserve">; el 99,9% ya había sido enriquecido entrando a la página de la nota. El tablero suma comparaciones entre medios: el encuadre de una misma noticia, quién la publica primero, cómo trata cada medio a cada figura y un mapa de las comunidades de medios que comparten agenda.</w:t>
       </w:r>
     </w:p>
     <w:p>
@@ -1742,7 +1764,7 @@
         <w:spacing w:after="120" w:line="300"/>
       </w:pPr>
       <w:r>
-        <w:t xml:space="preserve">En la base, 3.237 de las 4.386 notas llegaron por Google News. Sin un paso adicional, esas notas solo tendrían el título: por eso el sistema decodifica cada enlace y entra a la página real (sección 6.3).</w:t>
+        <w:t xml:space="preserve">En la base, 3.724 de las 5.302 notas llegaron por Google News. Sin un paso adicional, esas notas solo tendrían el título: por eso el sistema decodifica cada enlace y entra a la página real (sección 6.3).</w:t>
       </w:r>
     </w:p>
     <w:p>
@@ -3176,7 +3198,7 @@
         <w:spacing w:after="120" w:line="300"/>
       </w:pPr>
       <w:r>
-        <w:t xml:space="preserve">Resultado acumulado: 4.606 intentos de scraping, 4.147 páginas descargadas, 3.827 notas con bajada y 3.986 con JSON-LD.</w:t>
+        <w:t xml:space="preserve">Resultado acumulado: 5.548 intentos de scraping, 5.046 páginas descargadas, 4.613 notas con bajada y 4.803 con JSON-LD.</w:t>
       </w:r>
     </w:p>
     <w:p>
@@ -5497,15 +5519,174 @@
     </w:p>
     <w:p>
       <w:pPr>
+        <w:pStyle w:val="Heading2"/>
+        <w:keepNext/>
+      </w:pPr>
+      <w:bookmarkStart w:name="_Toc22" w:id="22"/>
+      <w:r>
+        <w:t xml:space="preserve">7.6 Análisis entre medios</w:t>
+      </w:r>
+      <w:bookmarkEnd w:id="22"/>
+    </w:p>
+    <w:p>
+      <w:pPr>
+        <w:spacing w:after="120" w:line="300"/>
+      </w:pPr>
+      <w:r>
+        <w:t xml:space="preserve">Además de clasificar cada nota, el sistema compara a los medios entre sí:</w:t>
+      </w:r>
+    </w:p>
+    <w:p>
+      <w:pPr>
+        <w:pStyle w:val="ListParagraph"/>
+        <w:numPr>
+          <w:ilvl w:val="0"/>
+          <w:numId w:val="2"/>
+        </w:numPr>
+        <w:spacing w:after="60" w:line="288"/>
+      </w:pPr>
+      <w:r>
+        <w:rPr>
+          <w:b/>
+          <w:bCs/>
+        </w:rPr>
+        <w:t xml:space="preserve">Historias compartidas:</w:t>
+      </w:r>
+      <w:r>
+        <w:t xml:space="preserve"> las notas de las últimas 48 horas se agrupan cuando cuentan lo mismo, por similitud coseno entre sus vectores TF-IDF (umbral 0,5, comparando cada nota contra la nota semilla del grupo para no encadenar temas distintos).</w:t>
+      </w:r>
+    </w:p>
+    <w:p>
+      <w:pPr>
+        <w:pStyle w:val="ListParagraph"/>
+        <w:numPr>
+          <w:ilvl w:val="0"/>
+          <w:numId w:val="2"/>
+        </w:numPr>
+        <w:spacing w:after="60" w:line="288"/>
+      </w:pPr>
+      <w:r>
+        <w:rPr>
+          <w:b/>
+          <w:bCs/>
+        </w:rPr>
+        <w:t xml:space="preserve">Encuadre:</w:t>
+      </w:r>
+      <w:r>
+        <w:t xml:space="preserve"> para cada historia compartida, el tablero muestra el título de cada medio en orden de publicación, con su tono, sus recursos de cebo y la demora respecto del primero.</w:t>
+      </w:r>
+    </w:p>
+    <w:p>
+      <w:pPr>
+        <w:pStyle w:val="ListParagraph"/>
+        <w:numPr>
+          <w:ilvl w:val="0"/>
+          <w:numId w:val="2"/>
+        </w:numPr>
+        <w:spacing w:after="60" w:line="288"/>
+      </w:pPr>
+      <w:r>
+        <w:rPr>
+          <w:b/>
+          <w:bCs/>
+        </w:rPr>
+        <w:t xml:space="preserve">Primicia:</w:t>
+      </w:r>
+      <w:r>
+        <w:t xml:space="preserve"> cuenta cuántas veces cada medio publicó primero una historia que después cubrieron otros.</w:t>
+      </w:r>
+    </w:p>
+    <w:p>
+      <w:pPr>
+        <w:pStyle w:val="ListParagraph"/>
+        <w:numPr>
+          <w:ilvl w:val="0"/>
+          <w:numId w:val="2"/>
+        </w:numPr>
+        <w:spacing w:after="60" w:line="288"/>
+      </w:pPr>
+      <w:r>
+        <w:rPr>
+          <w:b/>
+          <w:bCs/>
+        </w:rPr>
+        <w:t xml:space="preserve">Tono por figura:</w:t>
+      </w:r>
+      <w:r>
+        <w:t xml:space="preserve"> matriz medio × figura con el porcentaje de notas negativas, comparado con el promedio de los medios para esa figura.</w:t>
+      </w:r>
+    </w:p>
+    <w:p>
+      <w:pPr>
+        <w:pStyle w:val="ListParagraph"/>
+        <w:numPr>
+          <w:ilvl w:val="0"/>
+          <w:numId w:val="2"/>
+        </w:numPr>
+        <w:spacing w:after="60" w:line="288"/>
+      </w:pPr>
+      <w:r>
+        <w:rPr>
+          <w:b/>
+          <w:bCs/>
+        </w:rPr>
+        <w:t xml:space="preserve">Mapa de medios (minería de estructura):</w:t>
+      </w:r>
+      <w:r>
+        <w:t xml:space="preserve"> un grafo cuyos nodos son medios y cuyas aristas unen a los que cubren las mismas historias. El peso de una arista es la cantidad de historias compartidas dividida por las historias del medio más chico, y cada medio conserva sus 3 vínculos más fuertes. Las comunidades se detectan con </w:t>
+      </w:r>
+      <w:r>
+        <w:rPr>
+          <w:b/>
+          <w:bCs/>
+        </w:rPr>
+        <w:t xml:space="preserve">propagación de etiquetas</w:t>
+      </w:r>
+      <w:r>
+        <w:t xml:space="preserve"> ponderada y el grafo se dibuja con una disposición por fuerzas (Fruchterman-Reingold).</w:t>
+      </w:r>
+    </w:p>
+    <w:p>
+      <w:pPr>
+        <w:pStyle w:val="ListParagraph"/>
+        <w:numPr>
+          <w:ilvl w:val="0"/>
+          <w:numId w:val="2"/>
+        </w:numPr>
+        <w:spacing w:after="60" w:line="288"/>
+      </w:pPr>
+      <w:r>
+        <w:rPr>
+          <w:b/>
+          <w:bCs/>
+        </w:rPr>
+        <w:t xml:space="preserve">Termómetro de negatividad:</w:t>
+      </w:r>
+      <w:r>
+        <w:t xml:space="preserve"> el porcentaje estimado de notas negativas de las últimas 24 horas, en escala de 0 a 100 y con bandas (calmo, moderado, tenso, muy tenso), comparado con el promedio de los días anteriores. El tablero lo acompaña con un </w:t>
+      </w:r>
+      <w:r>
+        <w:rPr>
+          <w:b/>
+          <w:bCs/>
+        </w:rPr>
+        <w:t xml:space="preserve">resumen del día</w:t>
+      </w:r>
+      <w:r>
+        <w:t xml:space="preserve"> redactado con plantillas a partir de los datos.</w:t>
+      </w:r>
+    </w:p>
+    <w:p>
+      <w:pPr>
         <w:pStyle w:val="Heading1"/>
         <w:keepNext/>
         <w:spacing w:after="200" w:before="360"/>
       </w:pPr>
-      <w:bookmarkStart w:name="_Toc22" w:id="22"/>
+      <w:bookmarkStart w:name="_Toc23" w:id="23"/>
       <w:r>
         <w:t xml:space="preserve">8. Almacenamiento</w:t>
       </w:r>
-      <w:bookmarkEnd w:id="22"/>
+      <w:bookmarkEnd w:id="23"/>
     </w:p>
     <w:p>
       <w:pPr>
@@ -5533,7 +5714,7 @@
         <w:t xml:space="preserve">historico.db</w:t>
       </w:r>
       <w:r>
-        <w:t xml:space="preserve">) con retención de 90 días. Elegirlo simplifica la operación: no requiere servidor, se versiona como un archivo y se puede abrir en el navegador.</w:t>
+        <w:t xml:space="preserve">) con retención de 30 días (la versión comprimida debe quedar por debajo del límite de 100 MB por archivo de GitHub; el workflow falla con un aviso si supera 90 MB). Elegirlo simplifica la operación: no requiere servidor, se versiona como un archivo y se puede abrir en el navegador.</w:t>
       </w:r>
     </w:p>
     <w:tbl>
@@ -5917,11 +6098,11 @@
         <w:pStyle w:val="Heading2"/>
         <w:keepNext/>
       </w:pPr>
-      <w:bookmarkStart w:name="_Toc23" w:id="23"/>
+      <w:bookmarkStart w:name="_Toc24" w:id="24"/>
       <w:r>
         <w:t xml:space="preserve">Acceso a los datos</w:t>
       </w:r>
-      <w:bookmarkEnd w:id="23"/>
+      <w:bookmarkEnd w:id="24"/>
     </w:p>
     <w:p>
       <w:pPr>
@@ -6017,15 +6198,46 @@
     </w:p>
     <w:p>
       <w:pPr>
+        <w:pStyle w:val="ListParagraph"/>
+        <w:numPr>
+          <w:ilvl w:val="0"/>
+          <w:numId w:val="2"/>
+        </w:numPr>
+        <w:spacing w:after="60" w:line="288"/>
+      </w:pPr>
+      <w:r>
+        <w:rPr>
+          <w:b/>
+          <w:bCs/>
+        </w:rPr>
+        <w:t xml:space="preserve">Notebook:</w:t>
+      </w:r>
+      <w:r>
+        <w:t xml:space="preserve"> </w:t>
+      </w:r>
+      <w:r>
+        <w:rPr>
+          <w:rFonts w:ascii="Consolas" w:cs="Consolas" w:eastAsia="Consolas" w:hAnsi="Consolas"/>
+          <w:sz w:val="19"/>
+          <w:szCs w:val="19"/>
+        </w:rPr>
+        <w:t xml:space="preserve">diarios-del-pais/analisis.ipynb</w:t>
+      </w:r>
+      <w:r>
+        <w:t xml:space="preserve"> reproduce con SQL y pandas los análisis principales (tono, agenda, sensacionalismo, transparencia, tono por figura, evolución diaria). Sirve de respaldo para la presentación si falla la conexión.</w:t>
+      </w:r>
+    </w:p>
+    <w:p>
+      <w:pPr>
         <w:pStyle w:val="Heading1"/>
         <w:keepNext/>
         <w:spacing w:after="200" w:before="360"/>
       </w:pPr>
-      <w:bookmarkStart w:name="_Toc24" w:id="24"/>
+      <w:bookmarkStart w:name="_Toc25" w:id="25"/>
       <w:r>
         <w:t xml:space="preserve">9. Indicadores</w:t>
       </w:r>
-      <w:bookmarkEnd w:id="24"/>
+      <w:bookmarkEnd w:id="25"/>
     </w:p>
     <w:tbl>
       <w:tblPr>
@@ -6165,7 +6377,7 @@
                 <w:sz w:val="19"/>
                 <w:szCs w:val="19"/>
               </w:rPr>
-              <w:t xml:space="preserve">Volumen</w:t>
+              <w:t xml:space="preserve">Termómetro</w:t>
             </w:r>
           </w:p>
         </w:tc>
@@ -6191,7 +6403,7 @@
                 <w:sz w:val="19"/>
                 <w:szCs w:val="19"/>
               </w:rPr>
-              <w:t xml:space="preserve">Notas por medio, tema, día y hora (por fecha de publicación, hora argentina).</w:t>
+              <w:t xml:space="preserve">% estimado de notas negativas de las últimas 24 h, de 0 a 100, contra el promedio de los días anteriores.</w:t>
             </w:r>
           </w:p>
         </w:tc>
@@ -6217,7 +6429,7 @@
                 <w:sz w:val="19"/>
                 <w:szCs w:val="19"/>
               </w:rPr>
-              <w:t xml:space="preserve">Resumen, Tendencias, Análisis</w:t>
+              <w:t xml:space="preserve">Resumen</w:t>
             </w:r>
           </w:p>
         </w:tc>
@@ -6249,7 +6461,7 @@
                 <w:sz w:val="19"/>
                 <w:szCs w:val="19"/>
               </w:rPr>
-              <w:t xml:space="preserve">% negativo</w:t>
+              <w:t xml:space="preserve">Volumen</w:t>
             </w:r>
           </w:p>
         </w:tc>
@@ -6276,7 +6488,7 @@
                 <w:sz w:val="19"/>
                 <w:szCs w:val="19"/>
               </w:rPr>
-              <w:t xml:space="preserve">Reparto esperado de tono negativo, calibrado, con intervalo.</w:t>
+              <w:t xml:space="preserve">Notas por medio, tema, día y hora (por fecha de publicación, hora argentina).</w:t>
             </w:r>
           </w:p>
         </w:tc>
@@ -6303,7 +6515,7 @@
                 <w:sz w:val="19"/>
                 <w:szCs w:val="19"/>
               </w:rPr>
-              <w:t xml:space="preserve">Resumen, Análisis, Monitor</w:t>
+              <w:t xml:space="preserve">Resumen, Tendencias</w:t>
             </w:r>
           </w:p>
         </w:tc>
@@ -6334,7 +6546,7 @@
                 <w:sz w:val="19"/>
                 <w:szCs w:val="19"/>
               </w:rPr>
-              <w:t xml:space="preserve">Share of voice</w:t>
+              <w:t xml:space="preserve">Agenda</w:t>
             </w:r>
           </w:p>
         </w:tc>
@@ -6360,7 +6572,7 @@
                 <w:sz w:val="19"/>
                 <w:szCs w:val="19"/>
               </w:rPr>
-              <w:t xml:space="preserve">Menciones de una entidad por medio y tipo de medio, con su tono.</w:t>
+              <w:t xml:space="preserve">Parte de las notas de cada medio dedicada a cada tema, contra el promedio de los medios.</w:t>
             </w:r>
           </w:p>
         </w:tc>
@@ -6386,7 +6598,7 @@
                 <w:sz w:val="19"/>
                 <w:szCs w:val="19"/>
               </w:rPr>
-              <w:t xml:space="preserve">Monitor</w:t>
+              <w:t xml:space="preserve">Análisis</w:t>
             </w:r>
           </w:p>
         </w:tc>
@@ -6418,7 +6630,7 @@
                 <w:sz w:val="19"/>
                 <w:szCs w:val="19"/>
               </w:rPr>
-              <w:t xml:space="preserve">Cobertura cruzada</w:t>
+              <w:t xml:space="preserve">% negativo</w:t>
             </w:r>
           </w:p>
         </w:tc>
@@ -6445,7 +6657,7 @@
                 <w:sz w:val="19"/>
                 <w:szCs w:val="19"/>
               </w:rPr>
-              <w:t xml:space="preserve">Noticias que cuentan varios medios a la vez (agrupamiento por TF-IDF y similitud coseno ≥ 0,5).</w:t>
+              <w:t xml:space="preserve">Reparto esperado de tono negativo, calibrado, con intervalo.</w:t>
             </w:r>
           </w:p>
         </w:tc>
@@ -6472,7 +6684,7 @@
                 <w:sz w:val="19"/>
                 <w:szCs w:val="19"/>
               </w:rPr>
-              <w:t xml:space="preserve">Resumen, Análisis</w:t>
+              <w:t xml:space="preserve">Resumen, Análisis, Monitor</w:t>
             </w:r>
           </w:p>
         </w:tc>
@@ -6503,7 +6715,7 @@
                 <w:sz w:val="19"/>
                 <w:szCs w:val="19"/>
               </w:rPr>
-              <w:t xml:space="preserve">Alertas</w:t>
+              <w:t xml:space="preserve">Share of voice</w:t>
             </w:r>
           </w:p>
         </w:tc>
@@ -6529,7 +6741,7 @@
                 <w:sz w:val="19"/>
                 <w:szCs w:val="19"/>
               </w:rPr>
-              <w:t xml:space="preserve">Temas o entidades con un volumen hoy superior a 2 desvíos de su media diaria.</w:t>
+              <w:t xml:space="preserve">Menciones de una entidad por medio y tipo de medio, con su tono.</w:t>
             </w:r>
           </w:p>
         </w:tc>
@@ -6555,7 +6767,7 @@
                 <w:sz w:val="19"/>
                 <w:szCs w:val="19"/>
               </w:rPr>
-              <w:t xml:space="preserve">Tendencias</w:t>
+              <w:t xml:space="preserve">Monitor</w:t>
             </w:r>
           </w:p>
         </w:tc>
@@ -6587,7 +6799,7 @@
                 <w:sz w:val="19"/>
                 <w:szCs w:val="19"/>
               </w:rPr>
-              <w:t xml:space="preserve">Exageración</w:t>
+              <w:t xml:space="preserve">Cobertura cruzada y encuadre</w:t>
             </w:r>
           </w:p>
         </w:tc>
@@ -6614,7 +6826,7 @@
                 <w:sz w:val="19"/>
                 <w:szCs w:val="19"/>
               </w:rPr>
-              <w:t xml:space="preserve">Títulos negativos cuya bajada no es negativa, sobre los negativos con bajada.</w:t>
+              <w:t xml:space="preserve">Noticias que cuentan varios medios a la vez (TF-IDF y similitud coseno ≥ 0,5), comparadas título por título.</w:t>
             </w:r>
           </w:p>
         </w:tc>
@@ -6641,7 +6853,7 @@
                 <w:sz w:val="19"/>
                 <w:szCs w:val="19"/>
               </w:rPr>
-              <w:t xml:space="preserve">Cómo titulan</w:t>
+              <w:t xml:space="preserve">Resumen, Análisis</w:t>
             </w:r>
           </w:p>
         </w:tc>
@@ -6672,7 +6884,7 @@
                 <w:sz w:val="19"/>
                 <w:szCs w:val="19"/>
               </w:rPr>
-              <w:t xml:space="preserve">Cebo</w:t>
+              <w:t xml:space="preserve">Primicia</w:t>
             </w:r>
           </w:p>
         </w:tc>
@@ -6698,7 +6910,7 @@
                 <w:sz w:val="19"/>
                 <w:szCs w:val="19"/>
               </w:rPr>
-              <w:t xml:space="preserve">% de títulos con al menos un recurso de clickbait.</w:t>
+              <w:t xml:space="preserve">Veces que un medio publica primero una historia compartida.</w:t>
             </w:r>
           </w:p>
         </w:tc>
@@ -6724,7 +6936,7 @@
                 <w:sz w:val="19"/>
                 <w:szCs w:val="19"/>
               </w:rPr>
-              <w:t xml:space="preserve">Cómo titulan</w:t>
+              <w:t xml:space="preserve">Análisis</w:t>
             </w:r>
           </w:p>
         </w:tc>
@@ -6756,7 +6968,7 @@
                 <w:sz w:val="19"/>
                 <w:szCs w:val="19"/>
               </w:rPr>
-              <w:t xml:space="preserve">Transparencia</w:t>
+              <w:t xml:space="preserve">Tono por figura</w:t>
             </w:r>
           </w:p>
         </w:tc>
@@ -6783,7 +6995,7 @@
                 <w:sz w:val="19"/>
                 <w:szCs w:val="19"/>
               </w:rPr>
-              <w:t xml:space="preserve">% de notas firmadas por un periodista.</w:t>
+              <w:t xml:space="preserve">% negativo de cada medio al mencionar a cada figura, contra el promedio.</w:t>
             </w:r>
           </w:p>
         </w:tc>
@@ -6810,7 +7022,7 @@
                 <w:sz w:val="19"/>
                 <w:szCs w:val="19"/>
               </w:rPr>
-              <w:t xml:space="preserve">Cómo titulan</w:t>
+              <w:t xml:space="preserve">Análisis</w:t>
             </w:r>
           </w:p>
         </w:tc>
@@ -6841,7 +7053,7 @@
                 <w:sz w:val="19"/>
                 <w:szCs w:val="19"/>
               </w:rPr>
-              <w:t xml:space="preserve">Largo</w:t>
+              <w:t xml:space="preserve">Comunidades</w:t>
             </w:r>
           </w:p>
         </w:tc>
@@ -6867,7 +7079,7 @@
                 <w:sz w:val="19"/>
                 <w:szCs w:val="19"/>
               </w:rPr>
-              <w:t xml:space="preserve">Palabras promedio del cuerpo de las notas.</w:t>
+              <w:t xml:space="preserve">Grupos de medios que comparten agenda (propagación de etiquetas sobre el grafo de historias compartidas).</w:t>
             </w:r>
           </w:p>
         </w:tc>
@@ -6893,7 +7105,7 @@
                 <w:sz w:val="19"/>
                 <w:szCs w:val="19"/>
               </w:rPr>
-              <w:t xml:space="preserve">Cómo titulan</w:t>
+              <w:t xml:space="preserve">Análisis</w:t>
             </w:r>
           </w:p>
         </w:tc>
@@ -6925,6 +7137,429 @@
                 <w:sz w:val="19"/>
                 <w:szCs w:val="19"/>
               </w:rPr>
+              <w:t xml:space="preserve">Alertas</w:t>
+            </w:r>
+          </w:p>
+        </w:tc>
+        <w:tc>
+          <w:tcPr>
+            <w:tcW w:type="dxa" w:w="5026"/>
+            <w:tcBorders>
+              <w:top w:val="single" w:color="D9DCD5" w:sz="4"/>
+              <w:left w:val="single" w:color="D9DCD5" w:sz="4"/>
+              <w:bottom w:val="single" w:color="D9DCD5" w:sz="4"/>
+              <w:right w:val="single" w:color="D9DCD5" w:sz="4"/>
+            </w:tcBorders>
+            <w:shd w:fill="F6F7F4" w:val="clear"/>
+            <w:tcMar>
+              <w:top w:type="dxa" w:w="60"/>
+              <w:left w:type="dxa" w:w="100"/>
+              <w:bottom w:type="dxa" w:w="60"/>
+              <w:right w:type="dxa" w:w="100"/>
+            </w:tcMar>
+          </w:tcPr>
+          <w:p>
+            <w:r>
+              <w:rPr>
+                <w:sz w:val="19"/>
+                <w:szCs w:val="19"/>
+              </w:rPr>
+              <w:t xml:space="preserve">Temas o entidades con un volumen hoy superior a 2 desvíos de su media diaria.</w:t>
+            </w:r>
+          </w:p>
+        </w:tc>
+        <w:tc>
+          <w:tcPr>
+            <w:tcW w:type="dxa" w:w="2100"/>
+            <w:tcBorders>
+              <w:top w:val="single" w:color="D9DCD5" w:sz="4"/>
+              <w:left w:val="single" w:color="D9DCD5" w:sz="4"/>
+              <w:bottom w:val="single" w:color="D9DCD5" w:sz="4"/>
+              <w:right w:val="single" w:color="D9DCD5" w:sz="4"/>
+            </w:tcBorders>
+            <w:shd w:fill="F6F7F4" w:val="clear"/>
+            <w:tcMar>
+              <w:top w:type="dxa" w:w="60"/>
+              <w:left w:type="dxa" w:w="100"/>
+              <w:bottom w:type="dxa" w:w="60"/>
+              <w:right w:type="dxa" w:w="100"/>
+            </w:tcMar>
+          </w:tcPr>
+          <w:p>
+            <w:r>
+              <w:rPr>
+                <w:sz w:val="19"/>
+                <w:szCs w:val="19"/>
+              </w:rPr>
+              <w:t xml:space="preserve">Tendencias</w:t>
+            </w:r>
+          </w:p>
+        </w:tc>
+      </w:tr>
+      <w:tr>
+        <w:trPr>
+          <w:tblHeader w:val="off"/>
+        </w:trPr>
+        <w:tc>
+          <w:tcPr>
+            <w:tcW w:type="dxa" w:w="1900"/>
+            <w:tcBorders>
+              <w:top w:val="single" w:color="D9DCD5" w:sz="4"/>
+              <w:left w:val="single" w:color="D9DCD5" w:sz="4"/>
+              <w:bottom w:val="single" w:color="D9DCD5" w:sz="4"/>
+              <w:right w:val="single" w:color="D9DCD5" w:sz="4"/>
+            </w:tcBorders>
+            <w:tcMar>
+              <w:top w:type="dxa" w:w="60"/>
+              <w:left w:type="dxa" w:w="100"/>
+              <w:bottom w:type="dxa" w:w="60"/>
+              <w:right w:type="dxa" w:w="100"/>
+            </w:tcMar>
+          </w:tcPr>
+          <w:p>
+            <w:r>
+              <w:rPr>
+                <w:sz w:val="19"/>
+                <w:szCs w:val="19"/>
+              </w:rPr>
+              <w:t xml:space="preserve">Exageración</w:t>
+            </w:r>
+          </w:p>
+        </w:tc>
+        <w:tc>
+          <w:tcPr>
+            <w:tcW w:type="dxa" w:w="5026"/>
+            <w:tcBorders>
+              <w:top w:val="single" w:color="D9DCD5" w:sz="4"/>
+              <w:left w:val="single" w:color="D9DCD5" w:sz="4"/>
+              <w:bottom w:val="single" w:color="D9DCD5" w:sz="4"/>
+              <w:right w:val="single" w:color="D9DCD5" w:sz="4"/>
+            </w:tcBorders>
+            <w:tcMar>
+              <w:top w:type="dxa" w:w="60"/>
+              <w:left w:type="dxa" w:w="100"/>
+              <w:bottom w:type="dxa" w:w="60"/>
+              <w:right w:type="dxa" w:w="100"/>
+            </w:tcMar>
+          </w:tcPr>
+          <w:p>
+            <w:r>
+              <w:rPr>
+                <w:sz w:val="19"/>
+                <w:szCs w:val="19"/>
+              </w:rPr>
+              <w:t xml:space="preserve">Títulos negativos cuya bajada no es negativa, sobre los negativos con bajada.</w:t>
+            </w:r>
+          </w:p>
+        </w:tc>
+        <w:tc>
+          <w:tcPr>
+            <w:tcW w:type="dxa" w:w="2100"/>
+            <w:tcBorders>
+              <w:top w:val="single" w:color="D9DCD5" w:sz="4"/>
+              <w:left w:val="single" w:color="D9DCD5" w:sz="4"/>
+              <w:bottom w:val="single" w:color="D9DCD5" w:sz="4"/>
+              <w:right w:val="single" w:color="D9DCD5" w:sz="4"/>
+            </w:tcBorders>
+            <w:tcMar>
+              <w:top w:type="dxa" w:w="60"/>
+              <w:left w:type="dxa" w:w="100"/>
+              <w:bottom w:type="dxa" w:w="60"/>
+              <w:right w:type="dxa" w:w="100"/>
+            </w:tcMar>
+          </w:tcPr>
+          <w:p>
+            <w:r>
+              <w:rPr>
+                <w:sz w:val="19"/>
+                <w:szCs w:val="19"/>
+              </w:rPr>
+              <w:t xml:space="preserve">Cómo titulan</w:t>
+            </w:r>
+          </w:p>
+        </w:tc>
+      </w:tr>
+      <w:tr>
+        <w:trPr>
+          <w:tblHeader w:val="off"/>
+        </w:trPr>
+        <w:tc>
+          <w:tcPr>
+            <w:tcW w:type="dxa" w:w="1900"/>
+            <w:tcBorders>
+              <w:top w:val="single" w:color="D9DCD5" w:sz="4"/>
+              <w:left w:val="single" w:color="D9DCD5" w:sz="4"/>
+              <w:bottom w:val="single" w:color="D9DCD5" w:sz="4"/>
+              <w:right w:val="single" w:color="D9DCD5" w:sz="4"/>
+            </w:tcBorders>
+            <w:shd w:fill="F6F7F4" w:val="clear"/>
+            <w:tcMar>
+              <w:top w:type="dxa" w:w="60"/>
+              <w:left w:type="dxa" w:w="100"/>
+              <w:bottom w:type="dxa" w:w="60"/>
+              <w:right w:type="dxa" w:w="100"/>
+            </w:tcMar>
+          </w:tcPr>
+          <w:p>
+            <w:r>
+              <w:rPr>
+                <w:sz w:val="19"/>
+                <w:szCs w:val="19"/>
+              </w:rPr>
+              <w:t xml:space="preserve">Cebo</w:t>
+            </w:r>
+          </w:p>
+        </w:tc>
+        <w:tc>
+          <w:tcPr>
+            <w:tcW w:type="dxa" w:w="5026"/>
+            <w:tcBorders>
+              <w:top w:val="single" w:color="D9DCD5" w:sz="4"/>
+              <w:left w:val="single" w:color="D9DCD5" w:sz="4"/>
+              <w:bottom w:val="single" w:color="D9DCD5" w:sz="4"/>
+              <w:right w:val="single" w:color="D9DCD5" w:sz="4"/>
+            </w:tcBorders>
+            <w:shd w:fill="F6F7F4" w:val="clear"/>
+            <w:tcMar>
+              <w:top w:type="dxa" w:w="60"/>
+              <w:left w:type="dxa" w:w="100"/>
+              <w:bottom w:type="dxa" w:w="60"/>
+              <w:right w:type="dxa" w:w="100"/>
+            </w:tcMar>
+          </w:tcPr>
+          <w:p>
+            <w:r>
+              <w:rPr>
+                <w:sz w:val="19"/>
+                <w:szCs w:val="19"/>
+              </w:rPr>
+              <w:t xml:space="preserve">% de títulos con al menos un recurso de clickbait.</w:t>
+            </w:r>
+          </w:p>
+        </w:tc>
+        <w:tc>
+          <w:tcPr>
+            <w:tcW w:type="dxa" w:w="2100"/>
+            <w:tcBorders>
+              <w:top w:val="single" w:color="D9DCD5" w:sz="4"/>
+              <w:left w:val="single" w:color="D9DCD5" w:sz="4"/>
+              <w:bottom w:val="single" w:color="D9DCD5" w:sz="4"/>
+              <w:right w:val="single" w:color="D9DCD5" w:sz="4"/>
+            </w:tcBorders>
+            <w:shd w:fill="F6F7F4" w:val="clear"/>
+            <w:tcMar>
+              <w:top w:type="dxa" w:w="60"/>
+              <w:left w:type="dxa" w:w="100"/>
+              <w:bottom w:type="dxa" w:w="60"/>
+              <w:right w:type="dxa" w:w="100"/>
+            </w:tcMar>
+          </w:tcPr>
+          <w:p>
+            <w:r>
+              <w:rPr>
+                <w:sz w:val="19"/>
+                <w:szCs w:val="19"/>
+              </w:rPr>
+              <w:t xml:space="preserve">Cómo titulan</w:t>
+            </w:r>
+          </w:p>
+        </w:tc>
+      </w:tr>
+      <w:tr>
+        <w:trPr>
+          <w:tblHeader w:val="off"/>
+        </w:trPr>
+        <w:tc>
+          <w:tcPr>
+            <w:tcW w:type="dxa" w:w="1900"/>
+            <w:tcBorders>
+              <w:top w:val="single" w:color="D9DCD5" w:sz="4"/>
+              <w:left w:val="single" w:color="D9DCD5" w:sz="4"/>
+              <w:bottom w:val="single" w:color="D9DCD5" w:sz="4"/>
+              <w:right w:val="single" w:color="D9DCD5" w:sz="4"/>
+            </w:tcBorders>
+            <w:tcMar>
+              <w:top w:type="dxa" w:w="60"/>
+              <w:left w:type="dxa" w:w="100"/>
+              <w:bottom w:type="dxa" w:w="60"/>
+              <w:right w:type="dxa" w:w="100"/>
+            </w:tcMar>
+          </w:tcPr>
+          <w:p>
+            <w:r>
+              <w:rPr>
+                <w:sz w:val="19"/>
+                <w:szCs w:val="19"/>
+              </w:rPr>
+              <w:t xml:space="preserve">Transparencia</w:t>
+            </w:r>
+          </w:p>
+        </w:tc>
+        <w:tc>
+          <w:tcPr>
+            <w:tcW w:type="dxa" w:w="5026"/>
+            <w:tcBorders>
+              <w:top w:val="single" w:color="D9DCD5" w:sz="4"/>
+              <w:left w:val="single" w:color="D9DCD5" w:sz="4"/>
+              <w:bottom w:val="single" w:color="D9DCD5" w:sz="4"/>
+              <w:right w:val="single" w:color="D9DCD5" w:sz="4"/>
+            </w:tcBorders>
+            <w:tcMar>
+              <w:top w:type="dxa" w:w="60"/>
+              <w:left w:type="dxa" w:w="100"/>
+              <w:bottom w:type="dxa" w:w="60"/>
+              <w:right w:type="dxa" w:w="100"/>
+            </w:tcMar>
+          </w:tcPr>
+          <w:p>
+            <w:r>
+              <w:rPr>
+                <w:sz w:val="19"/>
+                <w:szCs w:val="19"/>
+              </w:rPr>
+              <w:t xml:space="preserve">% de notas firmadas por un periodista.</w:t>
+            </w:r>
+          </w:p>
+        </w:tc>
+        <w:tc>
+          <w:tcPr>
+            <w:tcW w:type="dxa" w:w="2100"/>
+            <w:tcBorders>
+              <w:top w:val="single" w:color="D9DCD5" w:sz="4"/>
+              <w:left w:val="single" w:color="D9DCD5" w:sz="4"/>
+              <w:bottom w:val="single" w:color="D9DCD5" w:sz="4"/>
+              <w:right w:val="single" w:color="D9DCD5" w:sz="4"/>
+            </w:tcBorders>
+            <w:tcMar>
+              <w:top w:type="dxa" w:w="60"/>
+              <w:left w:type="dxa" w:w="100"/>
+              <w:bottom w:type="dxa" w:w="60"/>
+              <w:right w:type="dxa" w:w="100"/>
+            </w:tcMar>
+          </w:tcPr>
+          <w:p>
+            <w:r>
+              <w:rPr>
+                <w:sz w:val="19"/>
+                <w:szCs w:val="19"/>
+              </w:rPr>
+              <w:t xml:space="preserve">Cómo titulan</w:t>
+            </w:r>
+          </w:p>
+        </w:tc>
+      </w:tr>
+      <w:tr>
+        <w:trPr>
+          <w:tblHeader w:val="off"/>
+        </w:trPr>
+        <w:tc>
+          <w:tcPr>
+            <w:tcW w:type="dxa" w:w="1900"/>
+            <w:tcBorders>
+              <w:top w:val="single" w:color="D9DCD5" w:sz="4"/>
+              <w:left w:val="single" w:color="D9DCD5" w:sz="4"/>
+              <w:bottom w:val="single" w:color="D9DCD5" w:sz="4"/>
+              <w:right w:val="single" w:color="D9DCD5" w:sz="4"/>
+            </w:tcBorders>
+            <w:shd w:fill="F6F7F4" w:val="clear"/>
+            <w:tcMar>
+              <w:top w:type="dxa" w:w="60"/>
+              <w:left w:type="dxa" w:w="100"/>
+              <w:bottom w:type="dxa" w:w="60"/>
+              <w:right w:type="dxa" w:w="100"/>
+            </w:tcMar>
+          </w:tcPr>
+          <w:p>
+            <w:r>
+              <w:rPr>
+                <w:sz w:val="19"/>
+                <w:szCs w:val="19"/>
+              </w:rPr>
+              <w:t xml:space="preserve">Largo</w:t>
+            </w:r>
+          </w:p>
+        </w:tc>
+        <w:tc>
+          <w:tcPr>
+            <w:tcW w:type="dxa" w:w="5026"/>
+            <w:tcBorders>
+              <w:top w:val="single" w:color="D9DCD5" w:sz="4"/>
+              <w:left w:val="single" w:color="D9DCD5" w:sz="4"/>
+              <w:bottom w:val="single" w:color="D9DCD5" w:sz="4"/>
+              <w:right w:val="single" w:color="D9DCD5" w:sz="4"/>
+            </w:tcBorders>
+            <w:shd w:fill="F6F7F4" w:val="clear"/>
+            <w:tcMar>
+              <w:top w:type="dxa" w:w="60"/>
+              <w:left w:type="dxa" w:w="100"/>
+              <w:bottom w:type="dxa" w:w="60"/>
+              <w:right w:type="dxa" w:w="100"/>
+            </w:tcMar>
+          </w:tcPr>
+          <w:p>
+            <w:r>
+              <w:rPr>
+                <w:sz w:val="19"/>
+                <w:szCs w:val="19"/>
+              </w:rPr>
+              <w:t xml:space="preserve">Palabras promedio del cuerpo de las notas.</w:t>
+            </w:r>
+          </w:p>
+        </w:tc>
+        <w:tc>
+          <w:tcPr>
+            <w:tcW w:type="dxa" w:w="2100"/>
+            <w:tcBorders>
+              <w:top w:val="single" w:color="D9DCD5" w:sz="4"/>
+              <w:left w:val="single" w:color="D9DCD5" w:sz="4"/>
+              <w:bottom w:val="single" w:color="D9DCD5" w:sz="4"/>
+              <w:right w:val="single" w:color="D9DCD5" w:sz="4"/>
+            </w:tcBorders>
+            <w:shd w:fill="F6F7F4" w:val="clear"/>
+            <w:tcMar>
+              <w:top w:type="dxa" w:w="60"/>
+              <w:left w:type="dxa" w:w="100"/>
+              <w:bottom w:type="dxa" w:w="60"/>
+              <w:right w:type="dxa" w:w="100"/>
+            </w:tcMar>
+          </w:tcPr>
+          <w:p>
+            <w:r>
+              <w:rPr>
+                <w:sz w:val="19"/>
+                <w:szCs w:val="19"/>
+              </w:rPr>
+              <w:t xml:space="preserve">Cómo titulan</w:t>
+            </w:r>
+          </w:p>
+        </w:tc>
+      </w:tr>
+      <w:tr>
+        <w:trPr>
+          <w:tblHeader w:val="off"/>
+        </w:trPr>
+        <w:tc>
+          <w:tcPr>
+            <w:tcW w:type="dxa" w:w="1900"/>
+            <w:tcBorders>
+              <w:top w:val="single" w:color="D9DCD5" w:sz="4"/>
+              <w:left w:val="single" w:color="D9DCD5" w:sz="4"/>
+              <w:bottom w:val="single" w:color="D9DCD5" w:sz="4"/>
+              <w:right w:val="single" w:color="D9DCD5" w:sz="4"/>
+            </w:tcBorders>
+            <w:tcMar>
+              <w:top w:type="dxa" w:w="60"/>
+              <w:left w:type="dxa" w:w="100"/>
+              <w:bottom w:type="dxa" w:w="60"/>
+              <w:right w:type="dxa" w:w="100"/>
+            </w:tcMar>
+          </w:tcPr>
+          <w:p>
+            <w:r>
+              <w:rPr>
+                <w:sz w:val="19"/>
+                <w:szCs w:val="19"/>
+              </w:rPr>
               <w:t xml:space="preserve">Salud de fuentes</w:t>
             </w:r>
           </w:p>
@@ -6938,7 +7573,6 @@
               <w:bottom w:val="single" w:color="D9DCD5" w:sz="4"/>
               <w:right w:val="single" w:color="D9DCD5" w:sz="4"/>
             </w:tcBorders>
-            <w:shd w:fill="F6F7F4" w:val="clear"/>
             <w:tcMar>
               <w:top w:type="dxa" w:w="60"/>
               <w:left w:type="dxa" w:w="100"/>
@@ -6965,7 +7599,6 @@
               <w:bottom w:val="single" w:color="D9DCD5" w:sz="4"/>
               <w:right w:val="single" w:color="D9DCD5" w:sz="4"/>
             </w:tcBorders>
-            <w:shd w:fill="F6F7F4" w:val="clear"/>
             <w:tcMar>
               <w:top w:type="dxa" w:w="60"/>
               <w:left w:type="dxa" w:w="100"/>
@@ -6991,11 +7624,11 @@
         <w:keepNext/>
         <w:spacing w:after="200" w:before="360"/>
       </w:pPr>
-      <w:bookmarkStart w:name="_Toc25" w:id="25"/>
+      <w:bookmarkStart w:name="_Toc26" w:id="26"/>
       <w:r>
         <w:t xml:space="preserve">10. El tablero HTML</w:t>
       </w:r>
-      <w:bookmarkEnd w:id="25"/>
+      <w:bookmarkEnd w:id="26"/>
     </w:p>
     <w:p>
       <w:pPr>
@@ -7149,7 +7782,7 @@
                 <w:sz w:val="19"/>
                 <w:szCs w:val="19"/>
               </w:rPr>
-              <w:t xml:space="preserve">Indicadores del día, temas con su tono, entidades más mencionadas y las noticias que cubrieron más medios.</w:t>
+              <w:t xml:space="preserve">Termómetro de negatividad, resumen del día, indicadores, temas con su tono, entidades más mencionadas y las noticias que cubrieron más medios.</w:t>
             </w:r>
           </w:p>
         </w:tc>
@@ -7381,7 +8014,7 @@
                 <w:sz w:val="19"/>
                 <w:szCs w:val="19"/>
               </w:rPr>
-              <w:t xml:space="preserve">Notas y tono por medio, noticias compartidas y palabras más repetidas.</w:t>
+              <w:t xml:space="preserve">Filtros por alcance, tipo, período (24 h a 30 días) y orden. Agenda de cada medio (mapa de calor), tono por medio (barras divergentes con reordenamiento animado), tono por figura, mapa de medios (grafo), temas día por día (carrera de barras), comparador de encuadre, primicia y palabras más repetidas. Al tocar un medio se abre su ficha.</w:t>
             </w:r>
           </w:p>
         </w:tc>
@@ -7568,11 +8201,11 @@
         <w:keepNext/>
         <w:spacing w:after="200" w:before="360"/>
       </w:pPr>
-      <w:bookmarkStart w:name="_Toc26" w:id="26"/>
+      <w:bookmarkStart w:name="_Toc27" w:id="27"/>
       <w:r>
         <w:t xml:space="preserve">11. Resultados preliminares</w:t>
       </w:r>
-      <w:bookmarkEnd w:id="26"/>
+      <w:bookmarkEnd w:id="27"/>
     </w:p>
     <w:p>
       <w:pPr>
@@ -7609,7 +8242,7 @@
         <w:t xml:space="preserve">Volumen:</w:t>
       </w:r>
       <w:r>
-        <w:t xml:space="preserve"> 4.386 notas de 45 medios. Los temas más frecuentes fueron fútbol, economía y trabajo, seguridad y justicia, y espectáculos.</w:t>
+        <w:t xml:space="preserve"> 5.302 notas de 45 medios en 11 corridas. Los temas más frecuentes fueron política, seguridad y justicia, fútbol, y economía y trabajo; las figuras más mencionadas, Javier Milei, Lionel Messi y el papa León XIV.</w:t>
       </w:r>
     </w:p>
     <w:p>
@@ -7629,7 +8262,7 @@
         <w:t xml:space="preserve">Tono:</w:t>
       </w:r>
       <w:r>
-        <w:t xml:space="preserve"> 39% negativo, 50% neutro y 12% positivo según el modelo combinado. Los medios con mayor proporción de notas negativas fueron Diario Chaco, Eldoce y La Voz (alrededor del 50%); los de menor, El Chubut, Uno Santa Fe y TN (20–26%).</w:t>
+        <w:t xml:space="preserve"> 39% negativo, 49% neutro y 13% positivo según el modelo combinado. Los medios con mayor proporción de notas negativas fueron Diario Chaco, La Voz y Eldoce (alrededor del 50%); los de menor, El Chubut (19%), Río Negro y TN (27%).</w:t>
       </w:r>
     </w:p>
     <w:p>
@@ -7649,7 +8282,7 @@
         <w:t xml:space="preserve">Cebo:</w:t>
       </w:r>
       <w:r>
-        <w:t xml:space="preserve"> A24 y El Trece encabezan con 21–23% de títulos con recursos de clickbait, seguidos por El Destape, Eldoce y C5N (17–18%). En el otro extremo, La Capital, Perfil y Elonce están por debajo del 3%.</w:t>
+        <w:t xml:space="preserve"> A24 encabeza con 22% de títulos con recursos de clickbait, seguido por El Destape, Radio Mitre y Eldoce (18–19%). En el otro extremo, Perfil, El Chubut y Rosario Nuestro están por debajo del 3%.</w:t>
       </w:r>
     </w:p>
     <w:p>
@@ -7669,7 +8302,7 @@
         <w:t xml:space="preserve">Exageración:</w:t>
       </w:r>
       <w:r>
-        <w:t xml:space="preserve"> El Cronista, Uno Santa Fe, Canal 26 y TN tienen la mayor proporción de títulos negativos con bajada no negativa (53–63%); Elonce, El Chubut y La Capital de Mar del Plata, la menor (8–20%).</w:t>
+        <w:t xml:space="preserve"> El Cronista, Canal 26, Uno Santa Fe y TN tienen la mayor proporción de títulos negativos con bajada no negativa (50–55%); Elonce (7%), El Chubut y Aire de Santa Fe (19–20%), la menor.</w:t>
       </w:r>
     </w:p>
     <w:p>
@@ -7689,7 +8322,7 @@
         <w:t xml:space="preserve">Transparencia:</w:t>
       </w:r>
       <w:r>
-        <w:t xml:space="preserve"> Perfil (91%), Misiones Online (74%), El Cronista y Eldoce (66%) firman la mayoría de sus notas; Elonce, Radio Mitre, Radio Continental y La Capital de Mar del Plata no firman ninguna. En total, 990 notas firmadas sobre 3.986 con JSON-LD.</w:t>
+        <w:t xml:space="preserve"> Perfil (92%), Misiones Online (78%), El Cronista (70%) y TN (65%) firman la mayoría de sus notas; Elonce, Radio Mitre, Radio Continental, Rosario3, Rosario Nuestro y La Capital de Mar del Plata no firman ninguna. En total, 1.276 notas firmadas sobre 4.803 con JSON-LD.</w:t>
       </w:r>
     </w:p>
     <w:p>
@@ -7706,10 +8339,50 @@
           <w:b/>
           <w:bCs/>
         </w:rPr>
+        <w:t xml:space="preserve">Encuadre y primicia:</w:t>
+      </w:r>
+      <w:r>
+        <w:t xml:space="preserve"> la historia más compartida del corte (el sobreseimiento de Javier y Karina Milei en la causa $Libra) la cubrieron 12 medios; la publicó primero El Cronista y el último llegó 8 horas después. Eldoce fue el medio que más veces publicó primero una historia compartida.</w:t>
+      </w:r>
+    </w:p>
+    <w:p>
+      <w:pPr>
+        <w:pStyle w:val="ListParagraph"/>
+        <w:numPr>
+          <w:ilvl w:val="0"/>
+          <w:numId w:val="2"/>
+        </w:numPr>
+        <w:spacing w:after="60" w:line="288"/>
+      </w:pPr>
+      <w:r>
+        <w:rPr>
+          <w:b/>
+          <w:bCs/>
+        </w:rPr>
+        <w:t xml:space="preserve">Comunidades:</w:t>
+      </w:r>
+      <w:r>
+        <w:t xml:space="preserve"> el mapa de medios separa grupos que comparten agenda; por ejemplo, una comunidad reúne a C5N, Canal 26, Clarín, La Nación y La Voz, y otra a medios del interior y de Rosario.</w:t>
+      </w:r>
+    </w:p>
+    <w:p>
+      <w:pPr>
+        <w:pStyle w:val="ListParagraph"/>
+        <w:numPr>
+          <w:ilvl w:val="0"/>
+          <w:numId w:val="2"/>
+        </w:numPr>
+        <w:spacing w:after="60" w:line="288"/>
+      </w:pPr>
+      <w:r>
+        <w:rPr>
+          <w:b/>
+          <w:bCs/>
+        </w:rPr>
         <w:t xml:space="preserve">Largo:</w:t>
       </w:r>
       <w:r>
-        <w:t xml:space="preserve"> Ámbito (1.254 palabras promedio) y La Nación (905) publican las notas más extensas.</w:t>
+        <w:t xml:space="preserve"> Ámbito (1.187 palabras promedio) y La Nación (888) publican las notas más extensas.</w:t>
       </w:r>
     </w:p>
     <w:p>
@@ -7718,11 +8391,11 @@
         <w:keepNext/>
         <w:spacing w:after="200" w:before="360"/>
       </w:pPr>
-      <w:bookmarkStart w:name="_Toc27" w:id="27"/>
+      <w:bookmarkStart w:name="_Toc28" w:id="28"/>
       <w:r>
         <w:t xml:space="preserve">12. Herramientas</w:t>
       </w:r>
-      <w:bookmarkEnd w:id="27"/>
+      <w:bookmarkEnd w:id="28"/>
     </w:p>
     <w:tbl>
       <w:tblPr>
@@ -8295,7 +8968,7 @@
                 <w:sz w:val="19"/>
                 <w:szCs w:val="19"/>
               </w:rPr>
-              <w:t xml:space="preserve">HTML, CSS y JavaScript sin frameworks</w:t>
+              <w:t xml:space="preserve">pandas, matplotlib, Jupyter</w:t>
             </w:r>
           </w:p>
         </w:tc>
@@ -8321,7 +8994,7 @@
                 <w:sz w:val="19"/>
                 <w:szCs w:val="19"/>
               </w:rPr>
-              <w:t xml:space="preserve">Tablero estático.</w:t>
+              <w:t xml:space="preserve">Notebook de análisis.</w:t>
             </w:r>
           </w:p>
         </w:tc>
@@ -8353,7 +9026,7 @@
                 <w:sz w:val="19"/>
                 <w:szCs w:val="19"/>
               </w:rPr>
-              <w:t xml:space="preserve">GitHub Actions</w:t>
+              <w:t xml:space="preserve">HTML, CSS y JavaScript sin frameworks</w:t>
             </w:r>
           </w:p>
         </w:tc>
@@ -8380,7 +9053,7 @@
                 <w:sz w:val="19"/>
                 <w:szCs w:val="19"/>
               </w:rPr>
-              <w:t xml:space="preserve">Ejecución horaria del pipeline.</w:t>
+              <w:t xml:space="preserve">Tablero estático.</w:t>
             </w:r>
           </w:p>
         </w:tc>
@@ -8411,7 +9084,7 @@
                 <w:sz w:val="19"/>
                 <w:szCs w:val="19"/>
               </w:rPr>
-              <w:t xml:space="preserve">GitHub Pages</w:t>
+              <w:t xml:space="preserve">GitHub Actions</w:t>
             </w:r>
           </w:p>
         </w:tc>
@@ -8437,7 +9110,7 @@
                 <w:sz w:val="19"/>
                 <w:szCs w:val="19"/>
               </w:rPr>
-              <w:t xml:space="preserve">Publicación del tablero, la base y el CSV.</w:t>
+              <w:t xml:space="preserve">Ejecución horaria del pipeline.</w:t>
             </w:r>
           </w:p>
         </w:tc>
@@ -8469,6 +9142,64 @@
                 <w:sz w:val="19"/>
                 <w:szCs w:val="19"/>
               </w:rPr>
+              <w:t xml:space="preserve">GitHub Pages</w:t>
+            </w:r>
+          </w:p>
+        </w:tc>
+        <w:tc>
+          <w:tcPr>
+            <w:tcW w:type="dxa" w:w="5826"/>
+            <w:tcBorders>
+              <w:top w:val="single" w:color="D9DCD5" w:sz="4"/>
+              <w:left w:val="single" w:color="D9DCD5" w:sz="4"/>
+              <w:bottom w:val="single" w:color="D9DCD5" w:sz="4"/>
+              <w:right w:val="single" w:color="D9DCD5" w:sz="4"/>
+            </w:tcBorders>
+            <w:shd w:fill="F6F7F4" w:val="clear"/>
+            <w:tcMar>
+              <w:top w:type="dxa" w:w="60"/>
+              <w:left w:type="dxa" w:w="100"/>
+              <w:bottom w:type="dxa" w:w="60"/>
+              <w:right w:type="dxa" w:w="100"/>
+            </w:tcMar>
+          </w:tcPr>
+          <w:p>
+            <w:r>
+              <w:rPr>
+                <w:sz w:val="19"/>
+                <w:szCs w:val="19"/>
+              </w:rPr>
+              <w:t xml:space="preserve">Publicación del tablero, la base y el CSV.</w:t>
+            </w:r>
+          </w:p>
+        </w:tc>
+      </w:tr>
+      <w:tr>
+        <w:trPr>
+          <w:tblHeader w:val="off"/>
+        </w:trPr>
+        <w:tc>
+          <w:tcPr>
+            <w:tcW w:type="dxa" w:w="3200"/>
+            <w:tcBorders>
+              <w:top w:val="single" w:color="D9DCD5" w:sz="4"/>
+              <w:left w:val="single" w:color="D9DCD5" w:sz="4"/>
+              <w:bottom w:val="single" w:color="D9DCD5" w:sz="4"/>
+              <w:right w:val="single" w:color="D9DCD5" w:sz="4"/>
+            </w:tcBorders>
+            <w:tcMar>
+              <w:top w:type="dxa" w:w="60"/>
+              <w:left w:type="dxa" w:w="100"/>
+              <w:bottom w:type="dxa" w:w="60"/>
+              <w:right w:type="dxa" w:w="100"/>
+            </w:tcMar>
+          </w:tcPr>
+          <w:p>
+            <w:r>
+              <w:rPr>
+                <w:sz w:val="19"/>
+                <w:szCs w:val="19"/>
+              </w:rPr>
               <w:t xml:space="preserve">Datasette Lite</w:t>
             </w:r>
           </w:p>
@@ -8482,7 +9213,6 @@
               <w:bottom w:val="single" w:color="D9DCD5" w:sz="4"/>
               <w:right w:val="single" w:color="D9DCD5" w:sz="4"/>
             </w:tcBorders>
-            <w:shd w:fill="F6F7F4" w:val="clear"/>
             <w:tcMar>
               <w:top w:type="dxa" w:w="60"/>
               <w:left w:type="dxa" w:w="100"/>
@@ -8508,11 +9238,11 @@
         <w:keepNext/>
         <w:spacing w:after="200" w:before="360"/>
       </w:pPr>
-      <w:bookmarkStart w:name="_Toc28" w:id="28"/>
+      <w:bookmarkStart w:name="_Toc29" w:id="29"/>
       <w:r>
         <w:t xml:space="preserve">13. Ética y aspectos legales</w:t>
       </w:r>
-      <w:bookmarkEnd w:id="28"/>
+      <w:bookmarkEnd w:id="29"/>
     </w:p>
     <w:p>
       <w:pPr>
@@ -8628,11 +9358,11 @@
         <w:keepNext/>
         <w:spacing w:after="200" w:before="360"/>
       </w:pPr>
-      <w:bookmarkStart w:name="_Toc29" w:id="29"/>
+      <w:bookmarkStart w:name="_Toc30" w:id="30"/>
       <w:r>
         <w:t xml:space="preserve">14. Limitaciones</w:t>
       </w:r>
-      <w:bookmarkEnd w:id="29"/>
+      <w:bookmarkEnd w:id="30"/>
     </w:p>
     <w:p>
       <w:pPr>
@@ -8731,7 +9461,7 @@
         <w:t xml:space="preserve">Histórico corto:</w:t>
       </w:r>
       <w:r>
-        <w:t xml:space="preserve"> las alertas necesitan al menos 3 días completos, y los rankings se estabilizan con semanas de datos.</w:t>
+        <w:t xml:space="preserve"> las alertas necesitan al menos 3 días completos, y los rankings se estabilizan con semanas de datos. La base guarda 30 días.</w:t>
       </w:r>
     </w:p>
     <w:p>
@@ -8751,20 +9481,8 @@
         <w:t xml:space="preserve">Cron de GitHub:</w:t>
       </w:r>
       <w:r>
-        <w:t xml:space="preserve"> las ejecuciones programadas pueden demorarse en horarios de mucha carga.</w:t>
-      </w:r>
-    </w:p>
-    <w:p>
-      <w:pPr>
-        <w:pStyle w:val="Heading1"/>
-        <w:keepNext/>
-        <w:spacing w:after="200" w:before="360"/>
-      </w:pPr>
-      <w:bookmarkStart w:name="_Toc30" w:id="30"/>
-      <w:r>
-        <w:t xml:space="preserve">15. Trabajo futuro</w:t>
-      </w:r>
-      <w:bookmarkEnd w:id="30"/>
+        <w:t xml:space="preserve"> las ejecuciones programadas se demoran o se saltean en horarios de mucha carga; un disparador externo (cron-job.org) lo resolvería.</w:t>
+      </w:r>
     </w:p>
     <w:p>
       <w:pPr>
@@ -8776,8 +9494,27 @@
         <w:spacing w:after="60" w:line="288"/>
       </w:pPr>
       <w:r>
-        <w:t xml:space="preserve">Reconocimiento de entidades con spaCy para descubrir personas e instituciones que no están en el diccionario.</w:t>
-      </w:r>
+        <w:rPr>
+          <w:b/>
+          <w:bCs/>
+        </w:rPr>
+        <w:t xml:space="preserve">Historias compartidas:</w:t>
+      </w:r>
+      <w:r>
+        <w:t xml:space="preserve"> el agrupamiento por TF-IDF solo mira los títulos; dos títulos muy distintos sobre la misma noticia pueden quedar en grupos separados.</w:t>
+      </w:r>
+    </w:p>
+    <w:p>
+      <w:pPr>
+        <w:pStyle w:val="Heading1"/>
+        <w:keepNext/>
+        <w:spacing w:after="200" w:before="360"/>
+      </w:pPr>
+      <w:bookmarkStart w:name="_Toc31" w:id="31"/>
+      <w:r>
+        <w:t xml:space="preserve">15. Trabajo futuro</w:t>
+      </w:r>
+      <w:bookmarkEnd w:id="31"/>
     </w:p>
     <w:p>
       <w:pPr>
@@ -8789,7 +9526,7 @@
         <w:spacing w:after="60" w:line="288"/>
       </w:pPr>
       <w:r>
-        <w:t xml:space="preserve">Sesgo de agenda: qué temas sobrerrepresenta cada medio respecto del promedio.</w:t>
+        <w:t xml:space="preserve">Reconocimiento de entidades con spaCy para descubrir personas e instituciones que no están en el diccionario.</w:t>
       </w:r>
     </w:p>
     <w:p>
@@ -8802,7 +9539,7 @@
         <w:spacing w:after="60" w:line="288"/>
       </w:pPr>
       <w:r>
-        <w:t xml:space="preserve">Tono por entidad y medio, para ver cómo trata cada medio a cada figura.</w:t>
+        <w:t xml:space="preserve">Seguir la evolución de las comunidades del mapa de medios a lo largo de las semanas.</w:t>
       </w:r>
     </w:p>
     <w:p>
@@ -8815,7 +9552,7 @@
         <w:spacing w:after="60" w:line="288"/>
       </w:pPr>
       <w:r>
-        <w:t xml:space="preserve">Mapa de medios: grafo de medios que cubren las mismas historias, con detección de comunidades (minería de estructura).</w:t>
+        <w:t xml:space="preserve">Cruzar el termómetro con datos externos (dólar, inflación, eventos) para ver si el clima mediático acompaña a la economía.</w:t>
       </w:r>
     </w:p>
     <w:p>
@@ -8828,7 +9565,7 @@
         <w:spacing w:after="60" w:line="288"/>
       </w:pPr>
       <w:r>
-        <w:t xml:space="preserve">Primicia: qué medio publica primero cada historia compartida y cuánto tarda el resto.</w:t>
+        <w:t xml:space="preserve">Resumen diario redactado con un modelo de lenguaje y enviado por correo o Telegram.</w:t>
       </w:r>
     </w:p>
     <w:p>
@@ -8841,19 +9578,6 @@
         <w:spacing w:after="60" w:line="288"/>
       </w:pPr>
       <w:r>
-        <w:t xml:space="preserve">Resumen diario redactado y termómetro mediático de 0 a 100.</w:t>
-      </w:r>
-    </w:p>
-    <w:p>
-      <w:pPr>
-        <w:pStyle w:val="ListParagraph"/>
-        <w:numPr>
-          <w:ilvl w:val="0"/>
-          <w:numId w:val="2"/>
-        </w:numPr>
-        <w:spacing w:after="60" w:line="288"/>
-      </w:pPr>
-      <w:r>
         <w:t xml:space="preserve">Ampliar las etiquetas manuales (con varios anotadores y acuerdo entre ellos) y ajustar un BERT en español con ellas.</w:t>
       </w:r>
     </w:p>
@@ -8863,11 +9587,11 @@
         <w:keepNext/>
         <w:spacing w:after="200" w:before="360"/>
       </w:pPr>
-      <w:bookmarkStart w:name="_Toc31" w:id="31"/>
+      <w:bookmarkStart w:name="_Toc32" w:id="32"/>
       <w:r>
         <w:t xml:space="preserve">16. Cómo reproducirlo</w:t>
       </w:r>
-      <w:bookmarkEnd w:id="31"/>
+      <w:bookmarkEnd w:id="32"/>
     </w:p>
     <w:p>
       <w:pPr>
@@ -8985,11 +9709,11 @@
         <w:keepNext/>
         <w:spacing w:after="200" w:before="360"/>
       </w:pPr>
-      <w:bookmarkStart w:name="_Toc32" w:id="32"/>
+      <w:bookmarkStart w:name="_Toc33" w:id="33"/>
       <w:r>
         <w:t xml:space="preserve">Anexo: consultas SQL de ejemplo</w:t>
       </w:r>
-      <w:bookmarkEnd w:id="32"/>
+      <w:bookmarkEnd w:id="33"/>
     </w:p>
     <w:p>
       <w:pPr>

</xml_diff>

<commit_message>
fix(diarios-del-pais): cron dos veces por hora, lejos de la hora en punto
GitHub demora y descarta corridas programadas en momentos de mucha carga,
sobre todo al comienzo de cada hora: con "7 * * * *" se perdio la mitad.
Ahora corre a los minutos 23 y 53; si se descarta una, corre la otra.

Co-Authored-By: Claude Opus 5.5 <noreply@anthropic.com>
</commit_message>
<xml_diff>
--- a/docs/informe-tp.docx
+++ b/docs/informe-tp.docx
@@ -2648,7 +2648,7 @@
         <w:t xml:space="preserve">.github/workflows/diarios-del-pais.yml</w:t>
       </w:r>
       <w:r>
-        <w:t xml:space="preserve"> se ejecuta cada hora (cron </w:t>
+        <w:t xml:space="preserve"> se ejecuta dos veces por hora (cron </w:t>
       </w:r>
       <w:r>
         <w:rPr>
@@ -2656,10 +2656,10 @@
           <w:sz w:val="19"/>
           <w:szCs w:val="19"/>
         </w:rPr>
-        <w:t xml:space="preserve">7 * * * *</w:t>
-      </w:r>
-      <w:r>
-        <w:t xml:space="preserve">), a mano desde la pestaña Actions y con cada cambio de código. Cada corrida:</w:t>
+        <w:t xml:space="preserve">23,53 * * * *</w:t>
+      </w:r>
+      <w:r>
+        <w:t xml:space="preserve">, lejos de la hora en punto porque GitHub demora y a veces descarta las corridas programadas en los momentos de mucha carga), a mano desde la pestaña Actions y con cada cambio de código. Cada corrida:</w:t>
       </w:r>
     </w:p>
     <w:p>

</xml_diff>

<commit_message>
docs: NER, busqueda por significado, aprendizaje activo y filtros en la documentacion
- Informe: NER con spaCy y figuras nuevas, aprendizaje activo del tono,
  seccion de busqueda por significado (embeddings MiniLM, notas parecidas,
  transformers.js), pestañas y herramientas actualizadas.
- Presentacion: diapositiva "El sistema aprende lo que no le enseñamos";
  pestañas, herramientas y proximos pasos actualizados.
- README: figuras nuevas, notas parecidas y busqueda por significado.

Co-Authored-By: Claude Opus 5.5 <noreply@anthropic.com>
</commit_message>
<xml_diff>
--- a/docs/informe-tp.docx
+++ b/docs/informe-tp.docx
@@ -632,7 +632,7 @@
           </w:pPr>
           <w:hyperlink w:history="1" w:anchor="_Toc22">
             <w:r>
-              <w:t xml:space="preserve">7.6 Análisis entre medios</w:t>
+              <w:t xml:space="preserve">7.6 Búsqueda por significado</w:t>
             </w:r>
             <w:r>
               <w:tab/>
@@ -640,6 +640,28 @@
             <w:r>
               <w:fldChar w:fldCharType="begin" w:dirty="true"/>
               <w:instrText xml:space="preserve">PAGEREF _Toc22 \h</w:instrText>
+              <w:fldChar w:fldCharType="separate"/>
+              <w:fldChar w:fldCharType="end"/>
+            </w:r>
+          </w:hyperlink>
+        </w:p>
+        <w:p>
+          <w:pPr>
+            <w:pStyle w:val="TOC2"/>
+            <w:tabs>
+              <w:tab w:val="right" w:pos="9026" w:leader="dot"/>
+            </w:tabs>
+          </w:pPr>
+          <w:hyperlink w:history="1" w:anchor="_Toc23">
+            <w:r>
+              <w:t xml:space="preserve">7.7 Análisis entre medios</w:t>
+            </w:r>
+            <w:r>
+              <w:tab/>
+            </w:r>
+            <w:r>
+              <w:fldChar w:fldCharType="begin" w:dirty="true"/>
+              <w:instrText xml:space="preserve">PAGEREF _Toc23 \h</w:instrText>
               <w:fldChar w:fldCharType="separate"/>
               <w:fldChar w:fldCharType="end"/>
             </w:r>
@@ -652,7 +674,7 @@
               <w:tab w:val="right" w:pos="9026" w:leader="dot"/>
             </w:tabs>
           </w:pPr>
-          <w:hyperlink w:history="1" w:anchor="_Toc23">
+          <w:hyperlink w:history="1" w:anchor="_Toc24">
             <w:r>
               <w:t xml:space="preserve">8. Almacenamiento</w:t>
             </w:r>
@@ -661,7 +683,7 @@
             </w:r>
             <w:r>
               <w:fldChar w:fldCharType="begin" w:dirty="true"/>
-              <w:instrText xml:space="preserve">PAGEREF _Toc23 \h</w:instrText>
+              <w:instrText xml:space="preserve">PAGEREF _Toc24 \h</w:instrText>
               <w:fldChar w:fldCharType="separate"/>
               <w:fldChar w:fldCharType="end"/>
             </w:r>
@@ -674,31 +696,9 @@
               <w:tab w:val="right" w:pos="9026" w:leader="dot"/>
             </w:tabs>
           </w:pPr>
-          <w:hyperlink w:history="1" w:anchor="_Toc24">
+          <w:hyperlink w:history="1" w:anchor="_Toc25">
             <w:r>
               <w:t xml:space="preserve">Acceso a los datos</w:t>
-            </w:r>
-            <w:r>
-              <w:tab/>
-            </w:r>
-            <w:r>
-              <w:fldChar w:fldCharType="begin" w:dirty="true"/>
-              <w:instrText xml:space="preserve">PAGEREF _Toc24 \h</w:instrText>
-              <w:fldChar w:fldCharType="separate"/>
-              <w:fldChar w:fldCharType="end"/>
-            </w:r>
-          </w:hyperlink>
-        </w:p>
-        <w:p>
-          <w:pPr>
-            <w:pStyle w:val="TOC1"/>
-            <w:tabs>
-              <w:tab w:val="right" w:pos="9026" w:leader="dot"/>
-            </w:tabs>
-          </w:pPr>
-          <w:hyperlink w:history="1" w:anchor="_Toc25">
-            <w:r>
-              <w:t xml:space="preserve">9. Indicadores</w:t>
             </w:r>
             <w:r>
               <w:tab/>
@@ -720,7 +720,7 @@
           </w:pPr>
           <w:hyperlink w:history="1" w:anchor="_Toc26">
             <w:r>
-              <w:t xml:space="preserve">10. El tablero HTML</w:t>
+              <w:t xml:space="preserve">9. Indicadores</w:t>
             </w:r>
             <w:r>
               <w:tab/>
@@ -742,7 +742,7 @@
           </w:pPr>
           <w:hyperlink w:history="1" w:anchor="_Toc27">
             <w:r>
-              <w:t xml:space="preserve">11. Resultados preliminares</w:t>
+              <w:t xml:space="preserve">10. El tablero HTML</w:t>
             </w:r>
             <w:r>
               <w:tab/>
@@ -764,7 +764,7 @@
           </w:pPr>
           <w:hyperlink w:history="1" w:anchor="_Toc28">
             <w:r>
-              <w:t xml:space="preserve">12. Herramientas</w:t>
+              <w:t xml:space="preserve">11. Resultados preliminares</w:t>
             </w:r>
             <w:r>
               <w:tab/>
@@ -786,7 +786,7 @@
           </w:pPr>
           <w:hyperlink w:history="1" w:anchor="_Toc29">
             <w:r>
-              <w:t xml:space="preserve">13. Ética y aspectos legales</w:t>
+              <w:t xml:space="preserve">12. Herramientas</w:t>
             </w:r>
             <w:r>
               <w:tab/>
@@ -808,7 +808,7 @@
           </w:pPr>
           <w:hyperlink w:history="1" w:anchor="_Toc30">
             <w:r>
-              <w:t xml:space="preserve">14. Limitaciones</w:t>
+              <w:t xml:space="preserve">13. Ética y aspectos legales</w:t>
             </w:r>
             <w:r>
               <w:tab/>
@@ -830,7 +830,7 @@
           </w:pPr>
           <w:hyperlink w:history="1" w:anchor="_Toc31">
             <w:r>
-              <w:t xml:space="preserve">15. Trabajo futuro</w:t>
+              <w:t xml:space="preserve">14. Limitaciones</w:t>
             </w:r>
             <w:r>
               <w:tab/>
@@ -852,7 +852,7 @@
           </w:pPr>
           <w:hyperlink w:history="1" w:anchor="_Toc32">
             <w:r>
-              <w:t xml:space="preserve">16. Cómo reproducirlo</w:t>
+              <w:t xml:space="preserve">15. Trabajo futuro</w:t>
             </w:r>
             <w:r>
               <w:tab/>
@@ -874,7 +874,7 @@
           </w:pPr>
           <w:hyperlink w:history="1" w:anchor="_Toc33">
             <w:r>
-              <w:t xml:space="preserve">Anexo: consultas SQL de ejemplo</w:t>
+              <w:t xml:space="preserve">16. Cómo reproducirlo</w:t>
             </w:r>
             <w:r>
               <w:tab/>
@@ -882,6 +882,28 @@
             <w:r>
               <w:fldChar w:fldCharType="begin" w:dirty="true"/>
               <w:instrText xml:space="preserve">PAGEREF _Toc33 \h</w:instrText>
+              <w:fldChar w:fldCharType="separate"/>
+              <w:fldChar w:fldCharType="end"/>
+            </w:r>
+          </w:hyperlink>
+        </w:p>
+        <w:p>
+          <w:pPr>
+            <w:pStyle w:val="TOC1"/>
+            <w:tabs>
+              <w:tab w:val="right" w:pos="9026" w:leader="dot"/>
+            </w:tabs>
+          </w:pPr>
+          <w:hyperlink w:history="1" w:anchor="_Toc34">
+            <w:r>
+              <w:t xml:space="preserve">Anexo: consultas SQL de ejemplo</w:t>
+            </w:r>
+            <w:r>
+              <w:tab/>
+            </w:r>
+            <w:r>
+              <w:fldChar w:fldCharType="begin" w:dirty="true"/>
+              <w:instrText xml:space="preserve">PAGEREF _Toc34 \h</w:instrText>
               <w:fldChar w:fldCharType="separate"/>
               <w:fldChar w:fldCharType="end"/>
             </w:r>
@@ -3991,7 +4013,50 @@
         <w:spacing w:after="120" w:line="300"/>
       </w:pPr>
       <w:r>
-        <w:t xml:space="preserve">Un diccionario de unas 35 personas, instituciones, clubes y empresas con sus alias (por ejemplo, "canalla" → Rosario Central) y reglas de desambiguación ("Banco Central" no es Rosario Central). Las más mencionadas en el corte fueron Javier Milei, Lionel Messi y el papa León XIV.</w:t>
+        <w:rPr>
+          <w:b/>
+          <w:bCs/>
+        </w:rPr>
+        <w:t xml:space="preserve">Diccionario:</w:t>
+      </w:r>
+      <w:r>
+        <w:t xml:space="preserve"> unas 35 personas, instituciones, clubes y empresas con sus alias (por ejemplo, "canalla" → Rosario Central) y reglas de desambiguación ("Banco Central" no es Rosario Central). Las más mencionadas en el corte fueron Javier Milei, Lionel Messi y el papa León XIV.</w:t>
+      </w:r>
+    </w:p>
+    <w:p>
+      <w:pPr>
+        <w:spacing w:after="120" w:line="300"/>
+      </w:pPr>
+      <w:r>
+        <w:rPr>
+          <w:b/>
+          <w:bCs/>
+        </w:rPr>
+        <w:t xml:space="preserve">Reconocimiento de entidades (NER) con spaCy:</w:t>
+      </w:r>
+      <w:r>
+        <w:t xml:space="preserve"> el modelo </w:t>
+      </w:r>
+      <w:r>
+        <w:rPr>
+          <w:rFonts w:ascii="Consolas" w:cs="Consolas" w:eastAsia="Consolas" w:hAnsi="Consolas"/>
+          <w:sz w:val="19"/>
+          <w:szCs w:val="19"/>
+        </w:rPr>
+        <w:t xml:space="preserve">es_core_news_md</w:t>
+      </w:r>
+      <w:r>
+        <w:t xml:space="preserve"> detecta personas e instituciones en título y bajada aunque no estén en el diccionario. Se limpian cargos y artículos ("el presidente Javier Milei" → "Javier Milei"), nombres de medios, días y genéricos, y se unifican variantes con la forma más larga ("Colapinto" → "Franco Colapinto"). Una figura se marca como </w:t>
+      </w:r>
+      <w:r>
+        <w:rPr>
+          <w:b/>
+          <w:bCs/>
+        </w:rPr>
+        <w:t xml:space="preserve">nueva</w:t>
+      </w:r>
+      <w:r>
+        <w:t xml:space="preserve"> si no está en el diccionario, aparece en al menos 4 notas de 3 medios en las últimas 24 horas y tuvo como mucho una mención en los 7 días anteriores. En el corte aparecieron, por ejemplo, la Fundación Faro, Marcelo Trepat y Gonzalo Belloso.</w:t>
       </w:r>
     </w:p>
     <w:p>
@@ -5430,6 +5495,43 @@
           <w:b/>
           <w:bCs/>
         </w:rPr>
+        <w:t xml:space="preserve">Aprendizaje activo:</w:t>
+      </w:r>
+      <w:r>
+        <w:t xml:space="preserve"> para ampliar las etiquetas donde más rinden, </w:t>
+      </w:r>
+      <w:r>
+        <w:rPr>
+          <w:rFonts w:ascii="Consolas" w:cs="Consolas" w:eastAsia="Consolas" w:hAnsi="Consolas"/>
+          <w:sz w:val="19"/>
+          <w:szCs w:val="19"/>
+        </w:rPr>
+        <w:t xml:space="preserve">tono_activo.py</w:t>
+      </w:r>
+      <w:r>
+        <w:t xml:space="preserve"> elige los titulares en los que el modelo está más inseguro (menor margen entre las dos clases más probables), descartando casi duplicados y con un máximo de 4 por medio, y arma una planilla para etiquetarlos a mano. Las etiquetas nuevas se suman al entrenamiento y </w:t>
+      </w:r>
+      <w:r>
+        <w:rPr>
+          <w:rFonts w:ascii="Consolas" w:cs="Consolas" w:eastAsia="Consolas" w:hAnsi="Consolas"/>
+          <w:sz w:val="19"/>
+          <w:szCs w:val="19"/>
+        </w:rPr>
+        <w:t xml:space="preserve">tono_bert_eval.py</w:t>
+      </w:r>
+      <w:r>
+        <w:t xml:space="preserve"> compara el modelo antes y después con los mismos pliegues de validación cruzada, sobre el conjunto ampliado y sobre los 340 originales. Es el esquema de aprendizaje activo visto en clase: el modelo pide ayuda donde duda.</w:t>
+      </w:r>
+    </w:p>
+    <w:p>
+      <w:pPr>
+        <w:spacing w:after="120" w:line="300"/>
+      </w:pPr>
+      <w:r>
+        <w:rPr>
+          <w:b/>
+          <w:bCs/>
+        </w:rPr>
         <w:t xml:space="preserve">Calibración:</w:t>
       </w:r>
       <w:r>
@@ -5524,7 +5626,7 @@
       </w:pPr>
       <w:bookmarkStart w:name="_Toc22" w:id="22"/>
       <w:r>
-        <w:t xml:space="preserve">7.6 Análisis entre medios</w:t>
+        <w:t xml:space="preserve">7.6 Búsqueda por significado</w:t>
       </w:r>
       <w:bookmarkEnd w:id="22"/>
     </w:p>
@@ -5533,7 +5635,28 @@
         <w:spacing w:after="120" w:line="300"/>
       </w:pPr>
       <w:r>
-        <w:t xml:space="preserve">Además de clasificar cada nota, el sistema compara a los medios entre sí:</w:t>
+        <w:t xml:space="preserve">Cada nota se representa con un </w:t>
+      </w:r>
+      <w:r>
+        <w:rPr>
+          <w:b/>
+          <w:bCs/>
+        </w:rPr>
+        <w:t xml:space="preserve">embedding de oración</w:t>
+      </w:r>
+      <w:r>
+        <w:t xml:space="preserve"> (vector de 384 dimensiones) calculado con </w:t>
+      </w:r>
+      <w:r>
+        <w:rPr>
+          <w:rFonts w:ascii="Consolas" w:cs="Consolas" w:eastAsia="Consolas" w:hAnsi="Consolas"/>
+          <w:sz w:val="19"/>
+          <w:szCs w:val="19"/>
+        </w:rPr>
+        <w:t xml:space="preserve">paraphrase-multilingual-MiniLM-L12-v2</w:t>
+      </w:r>
+      <w:r>
+        <w:t xml:space="preserve">, que se guarda en la base para las notas de los últimos 7 días. Con la similitud coseno entre embeddings:</w:t>
       </w:r>
     </w:p>
     <w:p>
@@ -5550,10 +5673,10 @@
           <w:b/>
           <w:bCs/>
         </w:rPr>
-        <w:t xml:space="preserve">Historias compartidas:</w:t>
-      </w:r>
-      <w:r>
-        <w:t xml:space="preserve"> las notas de las últimas 48 horas se agrupan cuando cuentan lo mismo, por similitud coseno entre sus vectores TF-IDF (umbral 0,5, comparando cada nota contra la nota semilla del grupo para no encadenar temas distintos).</w:t>
+        <w:t xml:space="preserve">Notas parecidas:</w:t>
+      </w:r>
+      <w:r>
+        <w:t xml:space="preserve"> cada titular muestra hasta 5 notas de otros medios que cuentan lo mismo (similitud ≥ 0,70), aunque no compartan palabras: por ejemplo, "Murió una joven embarazada tras ser atacada por su pareja" (Eldoce) y "Murió una joven embarazada que había sido quemada por su pareja en Santa Fe" (La Voz), con similitud 0,85.</w:t>
       </w:r>
     </w:p>
     <w:p>
@@ -5570,10 +5693,48 @@
           <w:b/>
           <w:bCs/>
         </w:rPr>
-        <w:t xml:space="preserve">Encuadre:</w:t>
-      </w:r>
-      <w:r>
-        <w:t xml:space="preserve"> para cada historia compartida, el tablero muestra el título de cada medio en orden de publicación, con su tono, sus recursos de cebo y la demora respecto del primero.</w:t>
+        <w:t xml:space="preserve">Búsqueda por significado:</w:t>
+      </w:r>
+      <w:r>
+        <w:t xml:space="preserve"> al activarla, el navegador descarga la versión cuantizada del mismo modelo (transformers.js) y los embeddings de las notas (</w:t>
+      </w:r>
+      <w:r>
+        <w:rPr>
+          <w:rFonts w:ascii="Consolas" w:cs="Consolas" w:eastAsia="Consolas" w:hAnsi="Consolas"/>
+          <w:sz w:val="19"/>
+          <w:szCs w:val="19"/>
+        </w:rPr>
+        <w:t xml:space="preserve">emb.bin</w:t>
+      </w:r>
+      <w:r>
+        <w:t xml:space="preserve">, 1,2 MB), y ordena las notas por parecido con la consulta. Se verificó que los vectores de Python y del navegador coinciden (coseno ≥ 0,99).</w:t>
+      </w:r>
+    </w:p>
+    <w:p>
+      <w:pPr>
+        <w:spacing w:after="120" w:line="300"/>
+      </w:pPr>
+      <w:r>
+        <w:t xml:space="preserve">Es el modelo vectorial de la clase llevado a un espacio denso: la similitud coseno sigue siendo la medida, pero los vectores capturan significado y no solo palabras compartidas.</w:t>
+      </w:r>
+    </w:p>
+    <w:p>
+      <w:pPr>
+        <w:pStyle w:val="Heading2"/>
+        <w:keepNext/>
+      </w:pPr>
+      <w:bookmarkStart w:name="_Toc23" w:id="23"/>
+      <w:r>
+        <w:t xml:space="preserve">7.7 Análisis entre medios</w:t>
+      </w:r>
+      <w:bookmarkEnd w:id="23"/>
+    </w:p>
+    <w:p>
+      <w:pPr>
+        <w:spacing w:after="120" w:line="300"/>
+      </w:pPr>
+      <w:r>
+        <w:t xml:space="preserve">Además de clasificar cada nota, el sistema compara a los medios entre sí:</w:t>
       </w:r>
     </w:p>
     <w:p>
@@ -5590,10 +5751,10 @@
           <w:b/>
           <w:bCs/>
         </w:rPr>
-        <w:t xml:space="preserve">Primicia:</w:t>
-      </w:r>
-      <w:r>
-        <w:t xml:space="preserve"> cuenta cuántas veces cada medio publicó primero una historia que después cubrieron otros.</w:t>
+        <w:t xml:space="preserve">Historias compartidas:</w:t>
+      </w:r>
+      <w:r>
+        <w:t xml:space="preserve"> las notas de las últimas 48 horas se agrupan cuando cuentan lo mismo, por similitud coseno entre sus vectores TF-IDF (umbral 0,5, comparando cada nota contra la nota semilla del grupo para no encadenar temas distintos).</w:t>
       </w:r>
     </w:p>
     <w:p>
@@ -5610,10 +5771,10 @@
           <w:b/>
           <w:bCs/>
         </w:rPr>
-        <w:t xml:space="preserve">Tono por figura:</w:t>
-      </w:r>
-      <w:r>
-        <w:t xml:space="preserve"> matriz medio × figura con el porcentaje de notas negativas, comparado con el promedio de los medios para esa figura.</w:t>
+        <w:t xml:space="preserve">Encuadre:</w:t>
+      </w:r>
+      <w:r>
+        <w:t xml:space="preserve"> para cada historia compartida, el tablero muestra el título de cada medio en orden de publicación, con su tono, sus recursos de cebo y la demora respecto del primero.</w:t>
       </w:r>
     </w:p>
     <w:p>
@@ -5630,20 +5791,10 @@
           <w:b/>
           <w:bCs/>
         </w:rPr>
-        <w:t xml:space="preserve">Mapa de medios (minería de estructura):</w:t>
-      </w:r>
-      <w:r>
-        <w:t xml:space="preserve"> un grafo cuyos nodos son medios y cuyas aristas unen a los que cubren las mismas historias. El peso de una arista es la cantidad de historias compartidas dividida por las historias del medio más chico, y cada medio conserva sus 3 vínculos más fuertes. Las comunidades se detectan con </w:t>
-      </w:r>
-      <w:r>
-        <w:rPr>
-          <w:b/>
-          <w:bCs/>
-        </w:rPr>
-        <w:t xml:space="preserve">propagación de etiquetas</w:t>
-      </w:r>
-      <w:r>
-        <w:t xml:space="preserve"> ponderada y el grafo se dibuja con una disposición por fuerzas (Fruchterman-Reingold).</w:t>
+        <w:t xml:space="preserve">Primicia:</w:t>
+      </w:r>
+      <w:r>
+        <w:t xml:space="preserve"> cuenta cuántas veces cada medio publicó primero una historia que después cubrieron otros.</w:t>
       </w:r>
     </w:p>
     <w:p>
@@ -5660,6 +5811,56 @@
           <w:b/>
           <w:bCs/>
         </w:rPr>
+        <w:t xml:space="preserve">Tono por figura:</w:t>
+      </w:r>
+      <w:r>
+        <w:t xml:space="preserve"> matriz medio × figura con el porcentaje de notas negativas, comparado con el promedio de los medios para esa figura.</w:t>
+      </w:r>
+    </w:p>
+    <w:p>
+      <w:pPr>
+        <w:pStyle w:val="ListParagraph"/>
+        <w:numPr>
+          <w:ilvl w:val="0"/>
+          <w:numId w:val="2"/>
+        </w:numPr>
+        <w:spacing w:after="60" w:line="288"/>
+      </w:pPr>
+      <w:r>
+        <w:rPr>
+          <w:b/>
+          <w:bCs/>
+        </w:rPr>
+        <w:t xml:space="preserve">Mapa de medios (minería de estructura):</w:t>
+      </w:r>
+      <w:r>
+        <w:t xml:space="preserve"> un grafo cuyos nodos son medios y cuyas aristas unen a los que cubren las mismas historias. El peso de una arista es la cantidad de historias compartidas dividida por las historias del medio más chico, y cada medio conserva sus 3 vínculos más fuertes. Las comunidades se detectan con </w:t>
+      </w:r>
+      <w:r>
+        <w:rPr>
+          <w:b/>
+          <w:bCs/>
+        </w:rPr>
+        <w:t xml:space="preserve">propagación de etiquetas</w:t>
+      </w:r>
+      <w:r>
+        <w:t xml:space="preserve"> ponderada y el grafo se dibuja con una disposición por fuerzas (Fruchterman-Reingold).</w:t>
+      </w:r>
+    </w:p>
+    <w:p>
+      <w:pPr>
+        <w:pStyle w:val="ListParagraph"/>
+        <w:numPr>
+          <w:ilvl w:val="0"/>
+          <w:numId w:val="2"/>
+        </w:numPr>
+        <w:spacing w:after="60" w:line="288"/>
+      </w:pPr>
+      <w:r>
+        <w:rPr>
+          <w:b/>
+          <w:bCs/>
+        </w:rPr>
         <w:t xml:space="preserve">Termómetro de negatividad:</w:t>
       </w:r>
       <w:r>
@@ -5682,11 +5883,11 @@
         <w:keepNext/>
         <w:spacing w:after="200" w:before="360"/>
       </w:pPr>
-      <w:bookmarkStart w:name="_Toc23" w:id="23"/>
+      <w:bookmarkStart w:name="_Toc24" w:id="24"/>
       <w:r>
         <w:t xml:space="preserve">8. Almacenamiento</w:t>
       </w:r>
-      <w:bookmarkEnd w:id="23"/>
+      <w:bookmarkEnd w:id="24"/>
     </w:p>
     <w:p>
       <w:pPr>
@@ -6098,11 +6299,11 @@
         <w:pStyle w:val="Heading2"/>
         <w:keepNext/>
       </w:pPr>
-      <w:bookmarkStart w:name="_Toc24" w:id="24"/>
+      <w:bookmarkStart w:name="_Toc25" w:id="25"/>
       <w:r>
         <w:t xml:space="preserve">Acceso a los datos</w:t>
       </w:r>
-      <w:bookmarkEnd w:id="24"/>
+      <w:bookmarkEnd w:id="25"/>
     </w:p>
     <w:p>
       <w:pPr>
@@ -6233,11 +6434,11 @@
         <w:keepNext/>
         <w:spacing w:after="200" w:before="360"/>
       </w:pPr>
-      <w:bookmarkStart w:name="_Toc25" w:id="25"/>
+      <w:bookmarkStart w:name="_Toc26" w:id="26"/>
       <w:r>
         <w:t xml:space="preserve">9. Indicadores</w:t>
       </w:r>
-      <w:bookmarkEnd w:id="25"/>
+      <w:bookmarkEnd w:id="26"/>
     </w:p>
     <w:tbl>
       <w:tblPr>
@@ -7624,11 +7825,11 @@
         <w:keepNext/>
         <w:spacing w:after="200" w:before="360"/>
       </w:pPr>
-      <w:bookmarkStart w:name="_Toc26" w:id="26"/>
+      <w:bookmarkStart w:name="_Toc27" w:id="27"/>
       <w:r>
         <w:t xml:space="preserve">10. El tablero HTML</w:t>
       </w:r>
-      <w:bookmarkEnd w:id="26"/>
+      <w:bookmarkEnd w:id="27"/>
     </w:p>
     <w:p>
       <w:pPr>
@@ -7841,7 +8042,7 @@
                 <w:sz w:val="19"/>
                 <w:szCs w:val="19"/>
               </w:rPr>
-              <w:t xml:space="preserve">Lista de notas con bajada y buscador; filtros por medio, alcance, tipo y tema.</w:t>
+              <w:t xml:space="preserve">Lista de notas con bajada, buscador por texto o por significado, filtros por medio, alcance, tipo y tema, y notas parecidas de otros medios.</w:t>
             </w:r>
           </w:p>
         </w:tc>
@@ -7957,7 +8158,7 @@
                 <w:sz w:val="19"/>
                 <w:szCs w:val="19"/>
               </w:rPr>
-              <w:t xml:space="preserve">Seguimiento de una persona, institución o marca (o un texto libre): menciones, medios, tono, temas asociados y últimas menciones.</w:t>
+              <w:t xml:space="preserve">Figuras nuevas en la agenda y otras figuras detectadas con NER; seguimiento de una persona, institución o marca (o un texto libre): menciones, medios, tono, temas asociados y últimas menciones.</w:t>
             </w:r>
           </w:p>
         </w:tc>
@@ -8073,7 +8274,7 @@
                 <w:sz w:val="19"/>
                 <w:szCs w:val="19"/>
               </w:rPr>
-              <w:t xml:space="preserve">Mapa del sensacionalismo (cebo contra exageración, con cuadrantes), rankings, ejemplos, transparencia, periodistas y largo de las notas.</w:t>
+              <w:t xml:space="preserve">Filtros por alcance, tipo y orden; mapa del sensacionalismo (cebo contra exageración, con cuadrantes), rankings, ejemplos, transparencia, periodistas y largo de las notas. Cada medio abre su ficha.</w:t>
             </w:r>
           </w:p>
         </w:tc>
@@ -8201,11 +8402,11 @@
         <w:keepNext/>
         <w:spacing w:after="200" w:before="360"/>
       </w:pPr>
-      <w:bookmarkStart w:name="_Toc27" w:id="27"/>
+      <w:bookmarkStart w:name="_Toc28" w:id="28"/>
       <w:r>
         <w:t xml:space="preserve">11. Resultados preliminares</w:t>
       </w:r>
-      <w:bookmarkEnd w:id="27"/>
+      <w:bookmarkEnd w:id="28"/>
     </w:p>
     <w:p>
       <w:pPr>
@@ -8391,11 +8592,11 @@
         <w:keepNext/>
         <w:spacing w:after="200" w:before="360"/>
       </w:pPr>
-      <w:bookmarkStart w:name="_Toc28" w:id="28"/>
+      <w:bookmarkStart w:name="_Toc29" w:id="29"/>
       <w:r>
         <w:t xml:space="preserve">12. Herramientas</w:t>
       </w:r>
-      <w:bookmarkEnd w:id="28"/>
+      <w:bookmarkEnd w:id="29"/>
     </w:p>
     <w:tbl>
       <w:tblPr>
@@ -9026,7 +9227,7 @@
                 <w:sz w:val="19"/>
                 <w:szCs w:val="19"/>
               </w:rPr>
-              <w:t xml:space="preserve">HTML, CSS y JavaScript sin frameworks</w:t>
+              <w:t xml:space="preserve">spaCy (es_core_news_md)</w:t>
             </w:r>
           </w:p>
         </w:tc>
@@ -9053,7 +9254,7 @@
                 <w:sz w:val="19"/>
                 <w:szCs w:val="19"/>
               </w:rPr>
-              <w:t xml:space="preserve">Tablero estático.</w:t>
+              <w:t xml:space="preserve">Reconocimiento de entidades.</w:t>
             </w:r>
           </w:p>
         </w:tc>
@@ -9084,7 +9285,7 @@
                 <w:sz w:val="19"/>
                 <w:szCs w:val="19"/>
               </w:rPr>
-              <w:t xml:space="preserve">GitHub Actions</w:t>
+              <w:t xml:space="preserve">MiniLM multilingüe + transformers.js</w:t>
             </w:r>
           </w:p>
         </w:tc>
@@ -9110,7 +9311,7 @@
                 <w:sz w:val="19"/>
                 <w:szCs w:val="19"/>
               </w:rPr>
-              <w:t xml:space="preserve">Ejecución horaria del pipeline.</w:t>
+              <w:t xml:space="preserve">Embeddings de oraciones: notas parecidas y búsqueda por significado en el navegador.</w:t>
             </w:r>
           </w:p>
         </w:tc>
@@ -9142,7 +9343,7 @@
                 <w:sz w:val="19"/>
                 <w:szCs w:val="19"/>
               </w:rPr>
-              <w:t xml:space="preserve">GitHub Pages</w:t>
+              <w:t xml:space="preserve">HTML, CSS y JavaScript sin frameworks</w:t>
             </w:r>
           </w:p>
         </w:tc>
@@ -9169,7 +9370,7 @@
                 <w:sz w:val="19"/>
                 <w:szCs w:val="19"/>
               </w:rPr>
-              <w:t xml:space="preserve">Publicación del tablero, la base y el CSV.</w:t>
+              <w:t xml:space="preserve">Tablero estático.</w:t>
             </w:r>
           </w:p>
         </w:tc>
@@ -9200,6 +9401,122 @@
                 <w:sz w:val="19"/>
                 <w:szCs w:val="19"/>
               </w:rPr>
+              <w:t xml:space="preserve">GitHub Actions</w:t>
+            </w:r>
+          </w:p>
+        </w:tc>
+        <w:tc>
+          <w:tcPr>
+            <w:tcW w:type="dxa" w:w="5826"/>
+            <w:tcBorders>
+              <w:top w:val="single" w:color="D9DCD5" w:sz="4"/>
+              <w:left w:val="single" w:color="D9DCD5" w:sz="4"/>
+              <w:bottom w:val="single" w:color="D9DCD5" w:sz="4"/>
+              <w:right w:val="single" w:color="D9DCD5" w:sz="4"/>
+            </w:tcBorders>
+            <w:tcMar>
+              <w:top w:type="dxa" w:w="60"/>
+              <w:left w:type="dxa" w:w="100"/>
+              <w:bottom w:type="dxa" w:w="60"/>
+              <w:right w:type="dxa" w:w="100"/>
+            </w:tcMar>
+          </w:tcPr>
+          <w:p>
+            <w:r>
+              <w:rPr>
+                <w:sz w:val="19"/>
+                <w:szCs w:val="19"/>
+              </w:rPr>
+              <w:t xml:space="preserve">Ejecución horaria del pipeline.</w:t>
+            </w:r>
+          </w:p>
+        </w:tc>
+      </w:tr>
+      <w:tr>
+        <w:trPr>
+          <w:tblHeader w:val="off"/>
+        </w:trPr>
+        <w:tc>
+          <w:tcPr>
+            <w:tcW w:type="dxa" w:w="3200"/>
+            <w:tcBorders>
+              <w:top w:val="single" w:color="D9DCD5" w:sz="4"/>
+              <w:left w:val="single" w:color="D9DCD5" w:sz="4"/>
+              <w:bottom w:val="single" w:color="D9DCD5" w:sz="4"/>
+              <w:right w:val="single" w:color="D9DCD5" w:sz="4"/>
+            </w:tcBorders>
+            <w:shd w:fill="F6F7F4" w:val="clear"/>
+            <w:tcMar>
+              <w:top w:type="dxa" w:w="60"/>
+              <w:left w:type="dxa" w:w="100"/>
+              <w:bottom w:type="dxa" w:w="60"/>
+              <w:right w:type="dxa" w:w="100"/>
+            </w:tcMar>
+          </w:tcPr>
+          <w:p>
+            <w:r>
+              <w:rPr>
+                <w:sz w:val="19"/>
+                <w:szCs w:val="19"/>
+              </w:rPr>
+              <w:t xml:space="preserve">GitHub Pages</w:t>
+            </w:r>
+          </w:p>
+        </w:tc>
+        <w:tc>
+          <w:tcPr>
+            <w:tcW w:type="dxa" w:w="5826"/>
+            <w:tcBorders>
+              <w:top w:val="single" w:color="D9DCD5" w:sz="4"/>
+              <w:left w:val="single" w:color="D9DCD5" w:sz="4"/>
+              <w:bottom w:val="single" w:color="D9DCD5" w:sz="4"/>
+              <w:right w:val="single" w:color="D9DCD5" w:sz="4"/>
+            </w:tcBorders>
+            <w:shd w:fill="F6F7F4" w:val="clear"/>
+            <w:tcMar>
+              <w:top w:type="dxa" w:w="60"/>
+              <w:left w:type="dxa" w:w="100"/>
+              <w:bottom w:type="dxa" w:w="60"/>
+              <w:right w:type="dxa" w:w="100"/>
+            </w:tcMar>
+          </w:tcPr>
+          <w:p>
+            <w:r>
+              <w:rPr>
+                <w:sz w:val="19"/>
+                <w:szCs w:val="19"/>
+              </w:rPr>
+              <w:t xml:space="preserve">Publicación del tablero, la base y el CSV.</w:t>
+            </w:r>
+          </w:p>
+        </w:tc>
+      </w:tr>
+      <w:tr>
+        <w:trPr>
+          <w:tblHeader w:val="off"/>
+        </w:trPr>
+        <w:tc>
+          <w:tcPr>
+            <w:tcW w:type="dxa" w:w="3200"/>
+            <w:tcBorders>
+              <w:top w:val="single" w:color="D9DCD5" w:sz="4"/>
+              <w:left w:val="single" w:color="D9DCD5" w:sz="4"/>
+              <w:bottom w:val="single" w:color="D9DCD5" w:sz="4"/>
+              <w:right w:val="single" w:color="D9DCD5" w:sz="4"/>
+            </w:tcBorders>
+            <w:tcMar>
+              <w:top w:type="dxa" w:w="60"/>
+              <w:left w:type="dxa" w:w="100"/>
+              <w:bottom w:type="dxa" w:w="60"/>
+              <w:right w:type="dxa" w:w="100"/>
+            </w:tcMar>
+          </w:tcPr>
+          <w:p>
+            <w:r>
+              <w:rPr>
+                <w:sz w:val="19"/>
+                <w:szCs w:val="19"/>
+              </w:rPr>
               <w:t xml:space="preserve">Datasette Lite</w:t>
             </w:r>
           </w:p>
@@ -9238,11 +9555,11 @@
         <w:keepNext/>
         <w:spacing w:after="200" w:before="360"/>
       </w:pPr>
-      <w:bookmarkStart w:name="_Toc29" w:id="29"/>
+      <w:bookmarkStart w:name="_Toc30" w:id="30"/>
       <w:r>
         <w:t xml:space="preserve">13. Ética y aspectos legales</w:t>
       </w:r>
-      <w:bookmarkEnd w:id="29"/>
+      <w:bookmarkEnd w:id="30"/>
     </w:p>
     <w:p>
       <w:pPr>
@@ -9358,11 +9675,11 @@
         <w:keepNext/>
         <w:spacing w:after="200" w:before="360"/>
       </w:pPr>
-      <w:bookmarkStart w:name="_Toc30" w:id="30"/>
+      <w:bookmarkStart w:name="_Toc31" w:id="31"/>
       <w:r>
         <w:t xml:space="preserve">14. Limitaciones</w:t>
       </w:r>
-      <w:bookmarkEnd w:id="30"/>
+      <w:bookmarkEnd w:id="31"/>
     </w:p>
     <w:p>
       <w:pPr>
@@ -9438,10 +9755,10 @@
           <w:b/>
           <w:bCs/>
         </w:rPr>
-        <w:t xml:space="preserve">Temas y entidades por diccionario:</w:t>
-      </w:r>
-      <w:r>
-        <w:t xml:space="preserve"> requieren mantenimiento cuando aparecen personas o temas nuevos.</w:t>
+        <w:t xml:space="preserve">Temas por diccionario:</w:t>
+      </w:r>
+      <w:r>
+        <w:t xml:space="preserve"> requieren mantenimiento; el NER descubre entidades nuevas, pero todavía mezcla algo de ruido (apodos, secciones de los sitios).</w:t>
       </w:r>
     </w:p>
     <w:p>
@@ -9510,11 +9827,11 @@
         <w:keepNext/>
         <w:spacing w:after="200" w:before="360"/>
       </w:pPr>
-      <w:bookmarkStart w:name="_Toc31" w:id="31"/>
+      <w:bookmarkStart w:name="_Toc32" w:id="32"/>
       <w:r>
         <w:t xml:space="preserve">15. Trabajo futuro</w:t>
       </w:r>
-      <w:bookmarkEnd w:id="31"/>
+      <w:bookmarkEnd w:id="32"/>
     </w:p>
     <w:p>
       <w:pPr>
@@ -9526,7 +9843,7 @@
         <w:spacing w:after="60" w:line="288"/>
       </w:pPr>
       <w:r>
-        <w:t xml:space="preserve">Reconocimiento de entidades con spaCy para descubrir personas e instituciones que no están en el diccionario.</w:t>
+        <w:t xml:space="preserve">Seguir la evolución de las comunidades del mapa de medios a lo largo de las semanas.</w:t>
       </w:r>
     </w:p>
     <w:p>
@@ -9539,7 +9856,7 @@
         <w:spacing w:after="60" w:line="288"/>
       </w:pPr>
       <w:r>
-        <w:t xml:space="preserve">Seguir la evolución de las comunidades del mapa de medios a lo largo de las semanas.</w:t>
+        <w:t xml:space="preserve">Cruzar el termómetro con datos externos (dólar, inflación, eventos) para ver si el clima mediático acompaña a la economía.</w:t>
       </w:r>
     </w:p>
     <w:p>
@@ -9552,7 +9869,7 @@
         <w:spacing w:after="60" w:line="288"/>
       </w:pPr>
       <w:r>
-        <w:t xml:space="preserve">Cruzar el termómetro con datos externos (dólar, inflación, eventos) para ver si el clima mediático acompaña a la economía.</w:t>
+        <w:t xml:space="preserve">Resumen diario redactado con un modelo de lenguaje y enviado por correo o Telegram.</w:t>
       </w:r>
     </w:p>
     <w:p>
@@ -9565,19 +9882,6 @@
         <w:spacing w:after="60" w:line="288"/>
       </w:pPr>
       <w:r>
-        <w:t xml:space="preserve">Resumen diario redactado con un modelo de lenguaje y enviado por correo o Telegram.</w:t>
-      </w:r>
-    </w:p>
-    <w:p>
-      <w:pPr>
-        <w:pStyle w:val="ListParagraph"/>
-        <w:numPr>
-          <w:ilvl w:val="0"/>
-          <w:numId w:val="2"/>
-        </w:numPr>
-        <w:spacing w:after="60" w:line="288"/>
-      </w:pPr>
-      <w:r>
         <w:t xml:space="preserve">Ampliar las etiquetas manuales (con varios anotadores y acuerdo entre ellos) y ajustar un BERT en español con ellas.</w:t>
       </w:r>
     </w:p>
@@ -9587,11 +9891,11 @@
         <w:keepNext/>
         <w:spacing w:after="200" w:before="360"/>
       </w:pPr>
-      <w:bookmarkStart w:name="_Toc32" w:id="32"/>
+      <w:bookmarkStart w:name="_Toc33" w:id="33"/>
       <w:r>
         <w:t xml:space="preserve">16. Cómo reproducirlo</w:t>
       </w:r>
-      <w:bookmarkEnd w:id="32"/>
+      <w:bookmarkEnd w:id="33"/>
     </w:p>
     <w:p>
       <w:pPr>
@@ -9709,11 +10013,11 @@
         <w:keepNext/>
         <w:spacing w:after="200" w:before="360"/>
       </w:pPr>
-      <w:bookmarkStart w:name="_Toc33" w:id="33"/>
+      <w:bookmarkStart w:name="_Toc34" w:id="34"/>
       <w:r>
         <w:t xml:space="preserve">Anexo: consultas SQL de ejemplo</w:t>
       </w:r>
-      <w:bookmarkEnd w:id="33"/>
+      <w:bookmarkEnd w:id="34"/>
     </w:p>
     <w:p>
       <w:pPr>

</xml_diff>

<commit_message>
feat(diarios-del-pais): primera ronda de aprendizaje activo del tono
- 60 titulares elegidos por incertidumbre, etiquetados a mano
  (labels_activo.json). El modelo coincidia con la etiqueta humana en el 42%.
- Reentrenado con 400 titulares: acierto sobre la muestra representativa
  76% -> 76% (recall de negativas 84% -> 85%); en los casos activos 37%,
  casi el azar: son titulares ambiguos, no errores aprendibles.
- El acierto y la calibracion se miden solo sobre los 340 originales.
- Informe y presentacion con el resultado de la ronda.

Co-Authored-By: Claude Opus 5.5 <noreply@anthropic.com>
</commit_message>
<xml_diff>
--- a/docs/informe-tp.docx
+++ b/docs/informe-tp.docx
@@ -5521,6 +5521,21 @@
       </w:r>
       <w:r>
         <w:t xml:space="preserve"> compara el modelo antes y después con los mismos pliegues de validación cruzada, sobre el conjunto ampliado y sobre los 340 originales. Es el esquema de aprendizaje activo visto en clase: el modelo pide ayuda donde duda.</w:t>
+      </w:r>
+    </w:p>
+    <w:p>
+      <w:pPr>
+        <w:spacing w:after="120" w:line="300"/>
+      </w:pPr>
+      <w:r>
+        <w:rPr>
+          <w:b/>
+          <w:bCs/>
+        </w:rPr>
+        <w:t xml:space="preserve">Primera ronda (60 titulares):</w:t>
+      </w:r>
+      <w:r>
+        <w:t xml:space="preserve"> el modelo coincidía con la etiqueta humana solo en el 42% de esos casos, y al reentrenar con ellos el acierto sobre la muestra representativa se mantuvo en 76% (recall de negativas 84% → 85%). En los 60 casos difíciles el acierto quedó en 37%, casi el azar entre tres clases: son titulares genuinamente ambiguos, donde el tono depende de la interpretación. La ronda no mejoró el modelo, pero delimitó la frontera de ambigüedad del criterio. El acierto y la calibración se siguen midiendo solo sobre los 340 originales, porque los casos activos no son representativos.</w:t>
       </w:r>
     </w:p>
     <w:p>

</xml_diff>

<commit_message>
feat(diarios-del-pais): dolar contra clima mediatico, pruebas, acciones nuevas y limpieza
- Dolar: tabla dolar (blue y oficial, historico diario de argentinadatos.com
  y valor del dia de dolarapi.com) y seccion "Clima mediatico y dolar" en
  Tendencias: dos graficos con el mismo eje de dias y correlacion de Pearson
  con la variacion diaria del blue cuando hay al menos 8 dias.
- Pruebas: tests/test_extraccion.py (bajadas, mojibake, JSON-LD, firma,
  robots.txt simulado, cebo, entidades, temas, limpieza NER) y un trabajo
  "pruebas" en el workflow que corre en paralelo sin frenar los datos.
- Acciones actualizadas a Node 24: checkout v7, setup-python v7, cache v6,
  upload-pages-artifact v5, deploy-pages v5.
- Limpieza: se quitan tono_entrenar.py, crear_planilla_validacion.py,
  labels_respaldo.json, Actualizar.bat y archivar.py.
- Documentacion: autodisparo cada 30 minutos, pruebas y dolar.

Co-Authored-By: Claude Opus 5.5 <noreply@anthropic.com>
</commit_message>
<xml_diff>
--- a/docs/informe-tp.docx
+++ b/docs/informe-tp.docx
@@ -948,7 +948,7 @@
         <w:t xml:space="preserve">monitor de medios</w:t>
       </w:r>
       <w:r>
-        <w:t xml:space="preserve"> que cada hora recolecta los titulares de 46 medios argentinos (diarios, portales digitales, canales de TV, radios y dos fuentes oficiales), </w:t>
+        <w:t xml:space="preserve"> que cada 30 minutos recolecta los titulares de 46 medios argentinos (diarios, portales digitales, canales de TV, radios y dos fuentes oficiales), </w:t>
       </w:r>
       <w:r>
         <w:rPr>
@@ -1006,7 +1006,7 @@
         <w:spacing w:after="120" w:line="300"/>
       </w:pPr>
       <w:r>
-        <w:t xml:space="preserve">Todo corre solo en </w:t>
+        <w:t xml:space="preserve">Todo corre solo cada 30 minutos en </w:t>
       </w:r>
       <w:r>
         <w:rPr>
@@ -1824,7 +1824,7 @@
         <w:spacing w:after="120" w:line="300"/>
       </w:pPr>
       <w:r>
-        <w:t xml:space="preserve">El sistema es un pipeline por lotes que corre cada hora. Todo está en </w:t>
+        <w:t xml:space="preserve">El sistema es un pipeline por lotes que corre cada 30 minutos. Todo está en </w:t>
       </w:r>
       <w:r>
         <w:rPr>
@@ -2670,7 +2670,7 @@
         <w:t xml:space="preserve">.github/workflows/diarios-del-pais.yml</w:t>
       </w:r>
       <w:r>
-        <w:t xml:space="preserve"> se ejecuta dos veces por hora (cron </w:t>
+        <w:t xml:space="preserve"> se ejecuta cada 30 minutos por autodisparo (ver más abajo), con un cron de respaldo (</w:t>
       </w:r>
       <w:r>
         <w:rPr>
@@ -2681,7 +2681,7 @@
         <w:t xml:space="preserve">23,53 * * * *</w:t>
       </w:r>
       <w:r>
-        <w:t xml:space="preserve">, lejos de la hora en punto porque GitHub demora y a veces descarta las corridas programadas en los momentos de mucha carga), a mano desde la pestaña Actions y con cada cambio de código. Cada corrida:</w:t>
+        <w:t xml:space="preserve">), a mano desde la pestaña Actions y con cada cambio de código. Cada corrida:</w:t>
       </w:r>
     </w:p>
     <w:p>
@@ -2820,7 +2820,59 @@
         <w:spacing w:after="120" w:line="300"/>
       </w:pPr>
       <w:r>
-        <w:t xml:space="preserve">La primera corrida con BERT tarda unos 10 minutos (descarga el modelo y procesa el histórico); las siguientes, unos 2 minutos.</w:t>
+        <w:t xml:space="preserve">La primera corrida con BERT tarda unos 10 minutos (descarga el modelo y procesa el histórico); las siguientes, entre 3 y 6 minutos.</w:t>
+      </w:r>
+    </w:p>
+    <w:p>
+      <w:pPr>
+        <w:spacing w:after="120" w:line="300"/>
+      </w:pPr>
+      <w:r>
+        <w:rPr>
+          <w:b/>
+          <w:bCs/>
+        </w:rPr>
+        <w:t xml:space="preserve">Autodisparo cada 30 minutos:</w:t>
+      </w:r>
+      <w:r>
+        <w:t xml:space="preserve"> el cron de GitHub resultó muy irregular en este repositorio (un día corrió 1 de cada 8 veces: GitHub demora y descarta corridas programadas en momentos de carga). Por eso cada corrida, al terminar, espera hasta completar 30 minutos desde su inicio y relanza el workflow con </w:t>
+      </w:r>
+      <w:r>
+        <w:rPr>
+          <w:rFonts w:ascii="Consolas" w:cs="Consolas" w:eastAsia="Consolas" w:hAnsi="Consolas"/>
+          <w:sz w:val="19"/>
+          <w:szCs w:val="19"/>
+        </w:rPr>
+        <w:t xml:space="preserve">workflow_dispatch</w:t>
+      </w:r>
+      <w:r>
+        <w:t xml:space="preserve">, que no pasa por el programador del cron. La corrida más nueva es la dueña de la cadena (si aparece otra mientras se espera, la vieja no lanza nada), la cadena sigue aunque el pipeline falle y el cron queda como respaldo.</w:t>
+      </w:r>
+    </w:p>
+    <w:p>
+      <w:pPr>
+        <w:spacing w:after="120" w:line="300"/>
+      </w:pPr>
+      <w:r>
+        <w:rPr>
+          <w:b/>
+          <w:bCs/>
+        </w:rPr>
+        <w:t xml:space="preserve">Pruebas automáticas:</w:t>
+      </w:r>
+      <w:r>
+        <w:t xml:space="preserve"> </w:t>
+      </w:r>
+      <w:r>
+        <w:rPr>
+          <w:rFonts w:ascii="Consolas" w:cs="Consolas" w:eastAsia="Consolas" w:hAnsi="Consolas"/>
+          <w:sz w:val="19"/>
+          <w:szCs w:val="19"/>
+        </w:rPr>
+        <w:t xml:space="preserve">tests/</w:t>
+      </w:r>
+      <w:r>
+        <w:t xml:space="preserve"> verifica las funciones de extracción y limpieza (bajadas con código, entidades HTML, caracteres mal decodificados, JSON-LD, robots.txt, firma, cebo, entidades, temas). Corren en paralelo en cada corrida y no frenan la recolección: si fallan, la corrida queda marcada para revisar el scraper.</w:t>
       </w:r>
     </w:p>
     <w:p>
@@ -6272,6 +6324,64 @@
                 <w:sz w:val="19"/>
                 <w:szCs w:val="19"/>
               </w:rPr>
+              <w:t xml:space="preserve">dolar</w:t>
+            </w:r>
+          </w:p>
+        </w:tc>
+        <w:tc>
+          <w:tcPr>
+            <w:tcW w:type="dxa" w:w="7426"/>
+            <w:tcBorders>
+              <w:top w:val="single" w:color="D9DCD5" w:sz="4"/>
+              <w:left w:val="single" w:color="D9DCD5" w:sz="4"/>
+              <w:bottom w:val="single" w:color="D9DCD5" w:sz="4"/>
+              <w:right w:val="single" w:color="D9DCD5" w:sz="4"/>
+            </w:tcBorders>
+            <w:tcMar>
+              <w:top w:type="dxa" w:w="60"/>
+              <w:left w:type="dxa" w:w="100"/>
+              <w:bottom w:type="dxa" w:w="60"/>
+              <w:right w:type="dxa" w:w="100"/>
+            </w:tcMar>
+          </w:tcPr>
+          <w:p>
+            <w:r>
+              <w:rPr>
+                <w:sz w:val="19"/>
+                <w:szCs w:val="19"/>
+              </w:rPr>
+              <w:t xml:space="preserve">Cotización diaria del dólar blue y oficial (argentinadatos.com y dolarapi.com), para cruzar con el clima mediático.</w:t>
+            </w:r>
+          </w:p>
+        </w:tc>
+      </w:tr>
+      <w:tr>
+        <w:trPr>
+          <w:tblHeader w:val="off"/>
+        </w:trPr>
+        <w:tc>
+          <w:tcPr>
+            <w:tcW w:type="dxa" w:w="1600"/>
+            <w:tcBorders>
+              <w:top w:val="single" w:color="D9DCD5" w:sz="4"/>
+              <w:left w:val="single" w:color="D9DCD5" w:sz="4"/>
+              <w:bottom w:val="single" w:color="D9DCD5" w:sz="4"/>
+              <w:right w:val="single" w:color="D9DCD5" w:sz="4"/>
+            </w:tcBorders>
+            <w:shd w:fill="F6F7F4" w:val="clear"/>
+            <w:tcMar>
+              <w:top w:type="dxa" w:w="60"/>
+              <w:left w:type="dxa" w:w="100"/>
+              <w:bottom w:type="dxa" w:w="60"/>
+              <w:right w:type="dxa" w:w="100"/>
+            </w:tcMar>
+          </w:tcPr>
+          <w:p>
+            <w:r>
+              <w:rPr>
+                <w:sz w:val="19"/>
+                <w:szCs w:val="19"/>
+              </w:rPr>
               <w:t xml:space="preserve">meta</w:t>
             </w:r>
           </w:p>
@@ -6285,6 +6395,7 @@
               <w:bottom w:val="single" w:color="D9DCD5" w:sz="4"/>
               <w:right w:val="single" w:color="D9DCD5" w:sz="4"/>
             </w:tcBorders>
+            <w:shd w:fill="F6F7F4" w:val="clear"/>
             <w:tcMar>
               <w:top w:type="dxa" w:w="60"/>
               <w:left w:type="dxa" w:w="100"/>
@@ -7776,6 +7887,90 @@
                 <w:sz w:val="19"/>
                 <w:szCs w:val="19"/>
               </w:rPr>
+              <w:t xml:space="preserve">Clima mediático y dólar</w:t>
+            </w:r>
+          </w:p>
+        </w:tc>
+        <w:tc>
+          <w:tcPr>
+            <w:tcW w:type="dxa" w:w="5026"/>
+            <w:tcBorders>
+              <w:top w:val="single" w:color="D9DCD5" w:sz="4"/>
+              <w:left w:val="single" w:color="D9DCD5" w:sz="4"/>
+              <w:bottom w:val="single" w:color="D9DCD5" w:sz="4"/>
+              <w:right w:val="single" w:color="D9DCD5" w:sz="4"/>
+            </w:tcBorders>
+            <w:tcMar>
+              <w:top w:type="dxa" w:w="60"/>
+              <w:left w:type="dxa" w:w="100"/>
+              <w:bottom w:type="dxa" w:w="60"/>
+              <w:right w:type="dxa" w:w="100"/>
+            </w:tcMar>
+          </w:tcPr>
+          <w:p>
+            <w:r>
+              <w:rPr>
+                <w:sz w:val="19"/>
+                <w:szCs w:val="19"/>
+              </w:rPr>
+              <w:t xml:space="preserve">% de notas negativas por día junto al dólar blue (dos gráficos con el mismo eje de días) y correlación de Pearson con la variación diaria del blue cuando hay al menos 8 días.</w:t>
+            </w:r>
+          </w:p>
+        </w:tc>
+        <w:tc>
+          <w:tcPr>
+            <w:tcW w:type="dxa" w:w="2100"/>
+            <w:tcBorders>
+              <w:top w:val="single" w:color="D9DCD5" w:sz="4"/>
+              <w:left w:val="single" w:color="D9DCD5" w:sz="4"/>
+              <w:bottom w:val="single" w:color="D9DCD5" w:sz="4"/>
+              <w:right w:val="single" w:color="D9DCD5" w:sz="4"/>
+            </w:tcBorders>
+            <w:tcMar>
+              <w:top w:type="dxa" w:w="60"/>
+              <w:left w:type="dxa" w:w="100"/>
+              <w:bottom w:type="dxa" w:w="60"/>
+              <w:right w:type="dxa" w:w="100"/>
+            </w:tcMar>
+          </w:tcPr>
+          <w:p>
+            <w:r>
+              <w:rPr>
+                <w:sz w:val="19"/>
+                <w:szCs w:val="19"/>
+              </w:rPr>
+              <w:t xml:space="preserve">Tendencias</w:t>
+            </w:r>
+          </w:p>
+        </w:tc>
+      </w:tr>
+      <w:tr>
+        <w:trPr>
+          <w:tblHeader w:val="off"/>
+        </w:trPr>
+        <w:tc>
+          <w:tcPr>
+            <w:tcW w:type="dxa" w:w="1900"/>
+            <w:tcBorders>
+              <w:top w:val="single" w:color="D9DCD5" w:sz="4"/>
+              <w:left w:val="single" w:color="D9DCD5" w:sz="4"/>
+              <w:bottom w:val="single" w:color="D9DCD5" w:sz="4"/>
+              <w:right w:val="single" w:color="D9DCD5" w:sz="4"/>
+            </w:tcBorders>
+            <w:shd w:fill="F6F7F4" w:val="clear"/>
+            <w:tcMar>
+              <w:top w:type="dxa" w:w="60"/>
+              <w:left w:type="dxa" w:w="100"/>
+              <w:bottom w:type="dxa" w:w="60"/>
+              <w:right w:type="dxa" w:w="100"/>
+            </w:tcMar>
+          </w:tcPr>
+          <w:p>
+            <w:r>
+              <w:rPr>
+                <w:sz w:val="19"/>
+                <w:szCs w:val="19"/>
+              </w:rPr>
               <w:t xml:space="preserve">Salud de fuentes</w:t>
             </w:r>
           </w:p>
@@ -7789,6 +7984,7 @@
               <w:bottom w:val="single" w:color="D9DCD5" w:sz="4"/>
               <w:right w:val="single" w:color="D9DCD5" w:sz="4"/>
             </w:tcBorders>
+            <w:shd w:fill="F6F7F4" w:val="clear"/>
             <w:tcMar>
               <w:top w:type="dxa" w:w="60"/>
               <w:left w:type="dxa" w:w="100"/>
@@ -7815,6 +8011,7 @@
               <w:bottom w:val="single" w:color="D9DCD5" w:sz="4"/>
               <w:right w:val="single" w:color="D9DCD5" w:sz="4"/>
             </w:tcBorders>
+            <w:shd w:fill="F6F7F4" w:val="clear"/>
             <w:tcMar>
               <w:top w:type="dxa" w:w="60"/>
               <w:left w:type="dxa" w:w="100"/>
@@ -8346,7 +8543,7 @@
                 <w:sz w:val="19"/>
                 <w:szCs w:val="19"/>
               </w:rPr>
-              <w:t xml:space="preserve">Alertas, notas por hora con detalle, notas por día con % negativo y mapa de calor de temas.</w:t>
+              <w:t xml:space="preserve">Alertas, notas por hora con detalle, notas por día con % negativo, mapa de calor de temas y clima mediático contra el dólar.</w:t>
             </w:r>
           </w:p>
         </w:tc>
@@ -9871,7 +10068,7 @@
         <w:spacing w:after="60" w:line="288"/>
       </w:pPr>
       <w:r>
-        <w:t xml:space="preserve">Cruzar el termómetro con datos externos (dólar, inflación, eventos) para ver si el clima mediático acompaña a la economía.</w:t>
+        <w:t xml:space="preserve">Con semanas de datos, medir si el clima mediático acompaña al dólar y sumar otros indicadores (inflación, riesgo país).</w:t>
       </w:r>
     </w:p>
     <w:p>
@@ -10019,7 +10216,7 @@
         <w:spacing w:after="120" w:line="300"/>
       </w:pPr>
       <w:r>
-        <w:t xml:space="preserve">En la nube no hace falta nada: el workflow corre solo cada hora y se puede lanzar a mano desde la pestaña Actions del repositorio.</w:t>
+        <w:t xml:space="preserve">En la nube no hace falta nada: el workflow corre solo cada 30 minutos y se puede lanzar a mano desde la pestaña Actions del repositorio.</w:t>
       </w:r>
     </w:p>
     <w:p>

</xml_diff>

<commit_message>
docs: informe A4 mas compacto
Margenes de 2 cm (antes 2,54), interlineado 1,15 y menos espacio entre
parrafos y titulos; las tablas se escalan al ancho util. Pasa de 15 a 14
paginas, con menos espacio en blanco.

Co-Authored-By: Claude Opus 5.5 <noreply@anthropic.com>
</commit_message>
<xml_diff>
--- a/docs/informe-tp.docx
+++ b/docs/informe-tp.docx
@@ -4,7 +4,7 @@
   <w:body>
     <w:p>
       <w:pPr>
-        <w:spacing w:before="2400"/>
+        <w:spacing w:before="1800"/>
       </w:pPr>
     </w:p>
     <w:p>
@@ -58,7 +58,7 @@
     </w:p>
     <w:p>
       <w:pPr>
-        <w:spacing w:after="120" w:line="300"/>
+        <w:spacing w:after="100" w:line="276"/>
       </w:pPr>
       <w:r>
         <w:rPr>
@@ -73,7 +73,7 @@
     </w:p>
     <w:p>
       <w:pPr>
-        <w:spacing w:after="120" w:line="300"/>
+        <w:spacing w:after="100" w:line="276"/>
       </w:pPr>
       <w:r>
         <w:rPr>
@@ -88,7 +88,7 @@
     </w:p>
     <w:p>
       <w:pPr>
-        <w:spacing w:after="120" w:line="300"/>
+        <w:spacing w:after="100" w:line="276"/>
       </w:pPr>
       <w:r>
         <w:rPr>
@@ -103,7 +103,7 @@
     </w:p>
     <w:p>
       <w:pPr>
-        <w:spacing w:after="120" w:line="300"/>
+        <w:spacing w:after="100" w:line="276"/>
       </w:pPr>
       <w:r>
         <w:rPr>
@@ -118,7 +118,7 @@
     </w:p>
     <w:p>
       <w:pPr>
-        <w:spacing w:after="120" w:line="300"/>
+        <w:spacing w:after="100" w:line="276"/>
       </w:pPr>
       <w:r>
         <w:rPr>
@@ -160,7 +160,7 @@
           <w:pPr>
             <w:pStyle w:val="TOC1"/>
             <w:tabs>
-              <w:tab w:val="right" w:pos="9026" w:leader="dot"/>
+              <w:tab w:val="right" w:pos="9638" w:leader="dot"/>
             </w:tabs>
           </w:pPr>
           <w:r>
@@ -187,7 +187,7 @@
           <w:pPr>
             <w:pStyle w:val="TOC1"/>
             <w:tabs>
-              <w:tab w:val="right" w:pos="9026" w:leader="dot"/>
+              <w:tab w:val="right" w:pos="9638" w:leader="dot"/>
             </w:tabs>
           </w:pPr>
           <w:hyperlink w:history="1" w:anchor="_Toc2">
@@ -209,7 +209,7 @@
           <w:pPr>
             <w:pStyle w:val="TOC1"/>
             <w:tabs>
-              <w:tab w:val="right" w:pos="9026" w:leader="dot"/>
+              <w:tab w:val="right" w:pos="9638" w:leader="dot"/>
             </w:tabs>
           </w:pPr>
           <w:hyperlink w:history="1" w:anchor="_Toc3">
@@ -231,7 +231,7 @@
           <w:pPr>
             <w:pStyle w:val="TOC2"/>
             <w:tabs>
-              <w:tab w:val="right" w:pos="9026" w:leader="dot"/>
+              <w:tab w:val="right" w:pos="9638" w:leader="dot"/>
             </w:tabs>
           </w:pPr>
           <w:hyperlink w:history="1" w:anchor="_Toc4">
@@ -253,7 +253,7 @@
           <w:pPr>
             <w:pStyle w:val="TOC2"/>
             <w:tabs>
-              <w:tab w:val="right" w:pos="9026" w:leader="dot"/>
+              <w:tab w:val="right" w:pos="9638" w:leader="dot"/>
             </w:tabs>
           </w:pPr>
           <w:hyperlink w:history="1" w:anchor="_Toc5">
@@ -275,7 +275,7 @@
           <w:pPr>
             <w:pStyle w:val="TOC1"/>
             <w:tabs>
-              <w:tab w:val="right" w:pos="9026" w:leader="dot"/>
+              <w:tab w:val="right" w:pos="9638" w:leader="dot"/>
             </w:tabs>
           </w:pPr>
           <w:hyperlink w:history="1" w:anchor="_Toc6">
@@ -297,7 +297,7 @@
           <w:pPr>
             <w:pStyle w:val="TOC2"/>
             <w:tabs>
-              <w:tab w:val="right" w:pos="9026" w:leader="dot"/>
+              <w:tab w:val="right" w:pos="9638" w:leader="dot"/>
             </w:tabs>
           </w:pPr>
           <w:hyperlink w:history="1" w:anchor="_Toc7">
@@ -319,7 +319,7 @@
           <w:pPr>
             <w:pStyle w:val="TOC1"/>
             <w:tabs>
-              <w:tab w:val="right" w:pos="9026" w:leader="dot"/>
+              <w:tab w:val="right" w:pos="9638" w:leader="dot"/>
             </w:tabs>
           </w:pPr>
           <w:hyperlink w:history="1" w:anchor="_Toc8">
@@ -341,7 +341,7 @@
           <w:pPr>
             <w:pStyle w:val="TOC2"/>
             <w:tabs>
-              <w:tab w:val="right" w:pos="9026" w:leader="dot"/>
+              <w:tab w:val="right" w:pos="9638" w:leader="dot"/>
             </w:tabs>
           </w:pPr>
           <w:hyperlink w:history="1" w:anchor="_Toc9">
@@ -363,7 +363,7 @@
           <w:pPr>
             <w:pStyle w:val="TOC1"/>
             <w:tabs>
-              <w:tab w:val="right" w:pos="9026" w:leader="dot"/>
+              <w:tab w:val="right" w:pos="9638" w:leader="dot"/>
             </w:tabs>
           </w:pPr>
           <w:hyperlink w:history="1" w:anchor="_Toc10">
@@ -385,7 +385,7 @@
           <w:pPr>
             <w:pStyle w:val="TOC2"/>
             <w:tabs>
-              <w:tab w:val="right" w:pos="9026" w:leader="dot"/>
+              <w:tab w:val="right" w:pos="9638" w:leader="dot"/>
             </w:tabs>
           </w:pPr>
           <w:hyperlink w:history="1" w:anchor="_Toc11">
@@ -407,7 +407,7 @@
           <w:pPr>
             <w:pStyle w:val="TOC2"/>
             <w:tabs>
-              <w:tab w:val="right" w:pos="9026" w:leader="dot"/>
+              <w:tab w:val="right" w:pos="9638" w:leader="dot"/>
             </w:tabs>
           </w:pPr>
           <w:hyperlink w:history="1" w:anchor="_Toc12">
@@ -429,7 +429,7 @@
           <w:pPr>
             <w:pStyle w:val="TOC2"/>
             <w:tabs>
-              <w:tab w:val="right" w:pos="9026" w:leader="dot"/>
+              <w:tab w:val="right" w:pos="9638" w:leader="dot"/>
             </w:tabs>
           </w:pPr>
           <w:hyperlink w:history="1" w:anchor="_Toc13">
@@ -451,7 +451,7 @@
           <w:pPr>
             <w:pStyle w:val="TOC2"/>
             <w:tabs>
-              <w:tab w:val="right" w:pos="9026" w:leader="dot"/>
+              <w:tab w:val="right" w:pos="9638" w:leader="dot"/>
             </w:tabs>
           </w:pPr>
           <w:hyperlink w:history="1" w:anchor="_Toc14">
@@ -473,7 +473,7 @@
           <w:pPr>
             <w:pStyle w:val="TOC2"/>
             <w:tabs>
-              <w:tab w:val="right" w:pos="9026" w:leader="dot"/>
+              <w:tab w:val="right" w:pos="9638" w:leader="dot"/>
             </w:tabs>
           </w:pPr>
           <w:hyperlink w:history="1" w:anchor="_Toc15">
@@ -495,7 +495,7 @@
           <w:pPr>
             <w:pStyle w:val="TOC1"/>
             <w:tabs>
-              <w:tab w:val="right" w:pos="9026" w:leader="dot"/>
+              <w:tab w:val="right" w:pos="9638" w:leader="dot"/>
             </w:tabs>
           </w:pPr>
           <w:hyperlink w:history="1" w:anchor="_Toc16">
@@ -517,7 +517,7 @@
           <w:pPr>
             <w:pStyle w:val="TOC2"/>
             <w:tabs>
-              <w:tab w:val="right" w:pos="9026" w:leader="dot"/>
+              <w:tab w:val="right" w:pos="9638" w:leader="dot"/>
             </w:tabs>
           </w:pPr>
           <w:hyperlink w:history="1" w:anchor="_Toc17">
@@ -539,7 +539,7 @@
           <w:pPr>
             <w:pStyle w:val="TOC2"/>
             <w:tabs>
-              <w:tab w:val="right" w:pos="9026" w:leader="dot"/>
+              <w:tab w:val="right" w:pos="9638" w:leader="dot"/>
             </w:tabs>
           </w:pPr>
           <w:hyperlink w:history="1" w:anchor="_Toc18">
@@ -561,7 +561,7 @@
           <w:pPr>
             <w:pStyle w:val="TOC2"/>
             <w:tabs>
-              <w:tab w:val="right" w:pos="9026" w:leader="dot"/>
+              <w:tab w:val="right" w:pos="9638" w:leader="dot"/>
             </w:tabs>
           </w:pPr>
           <w:hyperlink w:history="1" w:anchor="_Toc19">
@@ -583,7 +583,7 @@
           <w:pPr>
             <w:pStyle w:val="TOC2"/>
             <w:tabs>
-              <w:tab w:val="right" w:pos="9026" w:leader="dot"/>
+              <w:tab w:val="right" w:pos="9638" w:leader="dot"/>
             </w:tabs>
           </w:pPr>
           <w:hyperlink w:history="1" w:anchor="_Toc20">
@@ -605,7 +605,7 @@
           <w:pPr>
             <w:pStyle w:val="TOC2"/>
             <w:tabs>
-              <w:tab w:val="right" w:pos="9026" w:leader="dot"/>
+              <w:tab w:val="right" w:pos="9638" w:leader="dot"/>
             </w:tabs>
           </w:pPr>
           <w:hyperlink w:history="1" w:anchor="_Toc21">
@@ -627,7 +627,7 @@
           <w:pPr>
             <w:pStyle w:val="TOC2"/>
             <w:tabs>
-              <w:tab w:val="right" w:pos="9026" w:leader="dot"/>
+              <w:tab w:val="right" w:pos="9638" w:leader="dot"/>
             </w:tabs>
           </w:pPr>
           <w:hyperlink w:history="1" w:anchor="_Toc22">
@@ -649,7 +649,7 @@
           <w:pPr>
             <w:pStyle w:val="TOC2"/>
             <w:tabs>
-              <w:tab w:val="right" w:pos="9026" w:leader="dot"/>
+              <w:tab w:val="right" w:pos="9638" w:leader="dot"/>
             </w:tabs>
           </w:pPr>
           <w:hyperlink w:history="1" w:anchor="_Toc23">
@@ -671,7 +671,7 @@
           <w:pPr>
             <w:pStyle w:val="TOC1"/>
             <w:tabs>
-              <w:tab w:val="right" w:pos="9026" w:leader="dot"/>
+              <w:tab w:val="right" w:pos="9638" w:leader="dot"/>
             </w:tabs>
           </w:pPr>
           <w:hyperlink w:history="1" w:anchor="_Toc24">
@@ -693,7 +693,7 @@
           <w:pPr>
             <w:pStyle w:val="TOC2"/>
             <w:tabs>
-              <w:tab w:val="right" w:pos="9026" w:leader="dot"/>
+              <w:tab w:val="right" w:pos="9638" w:leader="dot"/>
             </w:tabs>
           </w:pPr>
           <w:hyperlink w:history="1" w:anchor="_Toc25">
@@ -715,7 +715,7 @@
           <w:pPr>
             <w:pStyle w:val="TOC1"/>
             <w:tabs>
-              <w:tab w:val="right" w:pos="9026" w:leader="dot"/>
+              <w:tab w:val="right" w:pos="9638" w:leader="dot"/>
             </w:tabs>
           </w:pPr>
           <w:hyperlink w:history="1" w:anchor="_Toc26">
@@ -737,7 +737,7 @@
           <w:pPr>
             <w:pStyle w:val="TOC1"/>
             <w:tabs>
-              <w:tab w:val="right" w:pos="9026" w:leader="dot"/>
+              <w:tab w:val="right" w:pos="9638" w:leader="dot"/>
             </w:tabs>
           </w:pPr>
           <w:hyperlink w:history="1" w:anchor="_Toc27">
@@ -759,7 +759,7 @@
           <w:pPr>
             <w:pStyle w:val="TOC1"/>
             <w:tabs>
-              <w:tab w:val="right" w:pos="9026" w:leader="dot"/>
+              <w:tab w:val="right" w:pos="9638" w:leader="dot"/>
             </w:tabs>
           </w:pPr>
           <w:hyperlink w:history="1" w:anchor="_Toc28">
@@ -781,7 +781,7 @@
           <w:pPr>
             <w:pStyle w:val="TOC1"/>
             <w:tabs>
-              <w:tab w:val="right" w:pos="9026" w:leader="dot"/>
+              <w:tab w:val="right" w:pos="9638" w:leader="dot"/>
             </w:tabs>
           </w:pPr>
           <w:hyperlink w:history="1" w:anchor="_Toc29">
@@ -803,7 +803,7 @@
           <w:pPr>
             <w:pStyle w:val="TOC1"/>
             <w:tabs>
-              <w:tab w:val="right" w:pos="9026" w:leader="dot"/>
+              <w:tab w:val="right" w:pos="9638" w:leader="dot"/>
             </w:tabs>
           </w:pPr>
           <w:hyperlink w:history="1" w:anchor="_Toc30">
@@ -825,7 +825,7 @@
           <w:pPr>
             <w:pStyle w:val="TOC1"/>
             <w:tabs>
-              <w:tab w:val="right" w:pos="9026" w:leader="dot"/>
+              <w:tab w:val="right" w:pos="9638" w:leader="dot"/>
             </w:tabs>
           </w:pPr>
           <w:hyperlink w:history="1" w:anchor="_Toc31">
@@ -847,7 +847,7 @@
           <w:pPr>
             <w:pStyle w:val="TOC1"/>
             <w:tabs>
-              <w:tab w:val="right" w:pos="9026" w:leader="dot"/>
+              <w:tab w:val="right" w:pos="9638" w:leader="dot"/>
             </w:tabs>
           </w:pPr>
           <w:hyperlink w:history="1" w:anchor="_Toc32">
@@ -869,7 +869,7 @@
           <w:pPr>
             <w:pStyle w:val="TOC1"/>
             <w:tabs>
-              <w:tab w:val="right" w:pos="9026" w:leader="dot"/>
+              <w:tab w:val="right" w:pos="9638" w:leader="dot"/>
             </w:tabs>
           </w:pPr>
           <w:hyperlink w:history="1" w:anchor="_Toc33">
@@ -891,7 +891,7 @@
           <w:pPr>
             <w:pStyle w:val="TOC1"/>
             <w:tabs>
-              <w:tab w:val="right" w:pos="9026" w:leader="dot"/>
+              <w:tab w:val="right" w:pos="9638" w:leader="dot"/>
             </w:tabs>
           </w:pPr>
           <w:hyperlink w:history="1" w:anchor="_Toc34">
@@ -925,7 +925,7 @@
       <w:pPr>
         <w:pStyle w:val="Heading1"/>
         <w:keepNext/>
-        <w:spacing w:after="200" w:before="360"/>
+        <w:spacing w:after="140" w:before="300"/>
       </w:pPr>
       <w:bookmarkStart w:name="_Toc1" w:id="1"/>
       <w:r>
@@ -935,7 +935,7 @@
     </w:p>
     <w:p>
       <w:pPr>
-        <w:spacing w:after="120" w:line="300"/>
+        <w:spacing w:after="100" w:line="276"/>
       </w:pPr>
       <w:r>
         <w:t xml:space="preserve">El trabajo construye un </w:t>
@@ -1003,7 +1003,7 @@
     </w:p>
     <w:p>
       <w:pPr>
-        <w:spacing w:after="120" w:line="300"/>
+        <w:spacing w:after="100" w:line="276"/>
       </w:pPr>
       <w:r>
         <w:t xml:space="preserve">Todo corre solo cada 30 minutos en </w:t>
@@ -1051,7 +1051,7 @@
     </w:p>
     <w:p>
       <w:pPr>
-        <w:spacing w:after="120" w:line="300"/>
+        <w:spacing w:after="100" w:line="276"/>
       </w:pPr>
       <w:r>
         <w:t xml:space="preserve">El modelo de tono combina una regresión logística sobre palabras con las probabilidades de </w:t>
@@ -1091,7 +1091,7 @@
       <w:pPr>
         <w:pStyle w:val="Heading1"/>
         <w:keepNext/>
-        <w:spacing w:after="200" w:before="360"/>
+        <w:spacing w:after="140" w:before="300"/>
       </w:pPr>
       <w:bookmarkStart w:name="_Toc2" w:id="2"/>
       <w:r>
@@ -1101,7 +1101,7 @@
     </w:p>
     <w:p>
       <w:pPr>
-        <w:spacing w:after="120" w:line="300"/>
+        <w:spacing w:after="100" w:line="276"/>
       </w:pPr>
       <w:r>
         <w:t xml:space="preserve">Leer las noticias de un día implica recorrer decenas de portadas que cuentan los mismos hechos con énfasis distintos. Para un lector, un equipo de comunicación o un investigador, las preguntas interesantes no están en una nota aislada sino en el conjunto:</w:t>
@@ -1114,7 +1114,7 @@
           <w:ilvl w:val="0"/>
           <w:numId w:val="2"/>
         </w:numPr>
-        <w:spacing w:after="60" w:line="288"/>
+        <w:spacing w:after="40" w:line="264"/>
       </w:pPr>
       <w:r>
         <w:t xml:space="preserve">¿De qué se habla hoy y qué temas crecen respecto de lo habitual?</w:t>
@@ -1127,7 +1127,7 @@
           <w:ilvl w:val="0"/>
           <w:numId w:val="2"/>
         </w:numPr>
-        <w:spacing w:after="60" w:line="288"/>
+        <w:spacing w:after="40" w:line="264"/>
       </w:pPr>
       <w:r>
         <w:t xml:space="preserve">¿Qué medios cubren más un tema, una persona o una institución, y con qué tono?</w:t>
@@ -1140,7 +1140,7 @@
           <w:ilvl w:val="0"/>
           <w:numId w:val="2"/>
         </w:numPr>
-        <w:spacing w:after="60" w:line="288"/>
+        <w:spacing w:after="40" w:line="264"/>
       </w:pPr>
       <w:r>
         <w:t xml:space="preserve">¿Qué noticias cubre casi todo el ecosistema y cuáles son exclusivas de un medio?</w:t>
@@ -1153,7 +1153,7 @@
           <w:ilvl w:val="0"/>
           <w:numId w:val="2"/>
         </w:numPr>
-        <w:spacing w:after="60" w:line="288"/>
+        <w:spacing w:after="40" w:line="264"/>
       </w:pPr>
       <w:r>
         <w:t xml:space="preserve">¿Qué medios titulan de forma más alarmista o con más recursos de clickbait?</w:t>
@@ -1166,7 +1166,7 @@
           <w:ilvl w:val="0"/>
           <w:numId w:val="2"/>
         </w:numPr>
-        <w:spacing w:after="60" w:line="288"/>
+        <w:spacing w:after="40" w:line="264"/>
       </w:pPr>
       <w:r>
         <w:t xml:space="preserve">¿Cuánto del contenido está firmado y cuánto sale como "Redacción"?</w:t>
@@ -1174,7 +1174,7 @@
     </w:p>
     <w:p>
       <w:pPr>
-        <w:spacing w:after="120" w:line="300"/>
+        <w:spacing w:after="100" w:line="276"/>
       </w:pPr>
       <w:r>
         <w:t xml:space="preserve">Responderlas a mano es inviable: el sistema procesa unas 3.000 notas por corrida. La web es, además, un ambiente dinámico: los sitios cambian de estructura, algunos no publican RSS y otros cambian de codificación o de plantilla, lo que obliga a pensar el scraping como un sistema que se monitorea y se mantiene, no como un script que se corre una vez.</w:t>
@@ -1184,7 +1184,7 @@
       <w:pPr>
         <w:pStyle w:val="Heading1"/>
         <w:keepNext/>
-        <w:spacing w:after="200" w:before="360"/>
+        <w:spacing w:after="140" w:before="300"/>
       </w:pPr>
       <w:bookmarkStart w:name="_Toc3" w:id="3"/>
       <w:r>
@@ -1205,7 +1205,7 @@
     </w:p>
     <w:p>
       <w:pPr>
-        <w:spacing w:after="120" w:line="300"/>
+        <w:spacing w:after="100" w:line="276"/>
       </w:pPr>
       <w:r>
         <w:t xml:space="preserve">Construir un sistema automático y reproducible que extraiga información de medios argentinos desde la web, la estructure en una base consultable y la convierta en indicadores de agenda, tono y estilo de titulación publicados en un tablero de acceso público.</w:t>
@@ -1229,7 +1229,7 @@
           <w:ilvl w:val="0"/>
           <w:numId w:val="3"/>
         </w:numPr>
-        <w:spacing w:after="60" w:line="288"/>
+        <w:spacing w:after="40" w:line="264"/>
       </w:pPr>
       <w:r>
         <w:t xml:space="preserve">Recolectar titulares de 46 medios combinando RSS propios y búsquedas de Google News por sitio, con validación y deduplicación.</w:t>
@@ -1242,7 +1242,7 @@
           <w:ilvl w:val="0"/>
           <w:numId w:val="3"/>
         </w:numPr>
-        <w:spacing w:after="60" w:line="288"/>
+        <w:spacing w:after="40" w:line="264"/>
       </w:pPr>
       <w:r>
         <w:t xml:space="preserve">Enriquecer cada nota con datos que el RSS no trae: URL real, bajada, autor, sección, palabras clave y largo, extraídos del HTML y del JSON-LD de la página.</w:t>
@@ -1255,7 +1255,7 @@
           <w:ilvl w:val="0"/>
           <w:numId w:val="3"/>
         </w:numPr>
-        <w:spacing w:after="60" w:line="288"/>
+        <w:spacing w:after="40" w:line="264"/>
       </w:pPr>
       <w:r>
         <w:t xml:space="preserve">Clasificar tema, tono y entidades, y evaluar el modelo de tono contra etiquetas manuales con validación cruzada.</w:t>
@@ -1268,7 +1268,7 @@
           <w:ilvl w:val="0"/>
           <w:numId w:val="3"/>
         </w:numPr>
-        <w:spacing w:after="60" w:line="288"/>
+        <w:spacing w:after="40" w:line="264"/>
       </w:pPr>
       <w:r>
         <w:t xml:space="preserve">Definir indicadores comparables entre medios (agenda, tono, exageración, cebo, transparencia) y publicarlos en un tablero.</w:t>
@@ -1281,7 +1281,7 @@
           <w:ilvl w:val="0"/>
           <w:numId w:val="3"/>
         </w:numPr>
-        <w:spacing w:after="60" w:line="288"/>
+        <w:spacing w:after="40" w:line="264"/>
       </w:pPr>
       <w:r>
         <w:t xml:space="preserve">Automatizar la recolección y la publicación, respetando buenas prácticas de crawling (robots.txt, identificación, límite de pedidos).</w:t>
@@ -1291,7 +1291,7 @@
       <w:pPr>
         <w:pStyle w:val="Heading1"/>
         <w:keepNext/>
-        <w:spacing w:after="200" w:before="360"/>
+        <w:spacing w:after="140" w:before="300"/>
       </w:pPr>
       <w:bookmarkStart w:name="_Toc6" w:id="6"/>
       <w:r>
@@ -1301,7 +1301,7 @@
     </w:p>
     <w:p>
       <w:pPr>
-        <w:spacing w:after="120" w:line="300"/>
+        <w:spacing w:after="100" w:line="276"/>
       </w:pPr>
       <w:r>
         <w:t xml:space="preserve">Se monitorean 46 medios, clasificados por </w:t>
@@ -1351,7 +1351,7 @@
     </w:p>
     <w:tbl>
       <w:tblPr>
-        <w:tblW w:type="dxa" w:w="9026"/>
+        <w:tblW w:type="dxa" w:w="9638"/>
         <w:tblBorders>
           <w:top w:val="single" w:color="auto" w:sz="4"/>
           <w:left w:val="single" w:color="auto" w:sz="4"/>
@@ -1362,9 +1362,9 @@
         </w:tblBorders>
       </w:tblPr>
       <w:tblGrid>
-        <w:gridCol w:w="1600"/>
-        <w:gridCol w:w="1100"/>
-        <w:gridCol w:w="6326"/>
+        <w:gridCol w:w="1708"/>
+        <w:gridCol w:w="1175"/>
+        <w:gridCol w:w="6755"/>
       </w:tblGrid>
       <w:tr>
         <w:trPr>
@@ -1372,7 +1372,7 @@
         </w:trPr>
         <w:tc>
           <w:tcPr>
-            <w:tcW w:type="dxa" w:w="1600"/>
+            <w:tcW w:type="dxa" w:w="1708"/>
             <w:tcBorders>
               <w:top w:val="single" w:color="D9DCD5" w:sz="4"/>
               <w:left w:val="single" w:color="D9DCD5" w:sz="4"/>
@@ -1402,7 +1402,7 @@
         </w:tc>
         <w:tc>
           <w:tcPr>
-            <w:tcW w:type="dxa" w:w="1100"/>
+            <w:tcW w:type="dxa" w:w="1175"/>
             <w:tcBorders>
               <w:top w:val="single" w:color="D9DCD5" w:sz="4"/>
               <w:left w:val="single" w:color="D9DCD5" w:sz="4"/>
@@ -1432,7 +1432,7 @@
         </w:tc>
         <w:tc>
           <w:tcPr>
-            <w:tcW w:type="dxa" w:w="6326"/>
+            <w:tcW w:type="dxa" w:w="6755"/>
             <w:tcBorders>
               <w:top w:val="single" w:color="D9DCD5" w:sz="4"/>
               <w:left w:val="single" w:color="D9DCD5" w:sz="4"/>
@@ -1467,7 +1467,7 @@
         </w:trPr>
         <w:tc>
           <w:tcPr>
-            <w:tcW w:type="dxa" w:w="1600"/>
+            <w:tcW w:type="dxa" w:w="1708"/>
             <w:tcBorders>
               <w:top w:val="single" w:color="D9DCD5" w:sz="4"/>
               <w:left w:val="single" w:color="D9DCD5" w:sz="4"/>
@@ -1493,7 +1493,7 @@
         </w:tc>
         <w:tc>
           <w:tcPr>
-            <w:tcW w:type="dxa" w:w="1100"/>
+            <w:tcW w:type="dxa" w:w="1175"/>
             <w:tcBorders>
               <w:top w:val="single" w:color="D9DCD5" w:sz="4"/>
               <w:left w:val="single" w:color="D9DCD5" w:sz="4"/>
@@ -1519,7 +1519,7 @@
         </w:tc>
         <w:tc>
           <w:tcPr>
-            <w:tcW w:type="dxa" w:w="6326"/>
+            <w:tcW w:type="dxa" w:w="6755"/>
             <w:tcBorders>
               <w:top w:val="single" w:color="D9DCD5" w:sz="4"/>
               <w:left w:val="single" w:color="D9DCD5" w:sz="4"/>
@@ -1550,7 +1550,7 @@
         </w:trPr>
         <w:tc>
           <w:tcPr>
-            <w:tcW w:type="dxa" w:w="1600"/>
+            <w:tcW w:type="dxa" w:w="1708"/>
             <w:tcBorders>
               <w:top w:val="single" w:color="D9DCD5" w:sz="4"/>
               <w:left w:val="single" w:color="D9DCD5" w:sz="4"/>
@@ -1577,7 +1577,7 @@
         </w:tc>
         <w:tc>
           <w:tcPr>
-            <w:tcW w:type="dxa" w:w="1100"/>
+            <w:tcW w:type="dxa" w:w="1175"/>
             <w:tcBorders>
               <w:top w:val="single" w:color="D9DCD5" w:sz="4"/>
               <w:left w:val="single" w:color="D9DCD5" w:sz="4"/>
@@ -1604,7 +1604,7 @@
         </w:tc>
         <w:tc>
           <w:tcPr>
-            <w:tcW w:type="dxa" w:w="6326"/>
+            <w:tcW w:type="dxa" w:w="6755"/>
             <w:tcBorders>
               <w:top w:val="single" w:color="D9DCD5" w:sz="4"/>
               <w:left w:val="single" w:color="D9DCD5" w:sz="4"/>
@@ -1636,7 +1636,7 @@
         </w:trPr>
         <w:tc>
           <w:tcPr>
-            <w:tcW w:type="dxa" w:w="1600"/>
+            <w:tcW w:type="dxa" w:w="1708"/>
             <w:tcBorders>
               <w:top w:val="single" w:color="D9DCD5" w:sz="4"/>
               <w:left w:val="single" w:color="D9DCD5" w:sz="4"/>
@@ -1662,7 +1662,7 @@
         </w:tc>
         <w:tc>
           <w:tcPr>
-            <w:tcW w:type="dxa" w:w="1100"/>
+            <w:tcW w:type="dxa" w:w="1175"/>
             <w:tcBorders>
               <w:top w:val="single" w:color="D9DCD5" w:sz="4"/>
               <w:left w:val="single" w:color="D9DCD5" w:sz="4"/>
@@ -1688,7 +1688,7 @@
         </w:tc>
         <w:tc>
           <w:tcPr>
-            <w:tcW w:type="dxa" w:w="6326"/>
+            <w:tcW w:type="dxa" w:w="6755"/>
             <w:tcBorders>
               <w:top w:val="single" w:color="D9DCD5" w:sz="4"/>
               <w:left w:val="single" w:color="D9DCD5" w:sz="4"/>
@@ -1737,7 +1737,7 @@
           <w:ilvl w:val="0"/>
           <w:numId w:val="2"/>
         </w:numPr>
-        <w:spacing w:after="60" w:line="288"/>
+        <w:spacing w:after="40" w:line="264"/>
       </w:pPr>
       <w:r>
         <w:rPr>
@@ -1757,7 +1757,7 @@
           <w:ilvl w:val="0"/>
           <w:numId w:val="2"/>
         </w:numPr>
-        <w:spacing w:after="60" w:line="288"/>
+        <w:spacing w:after="40" w:line="264"/>
       </w:pPr>
       <w:r>
         <w:rPr>
@@ -1783,7 +1783,7 @@
     </w:p>
     <w:p>
       <w:pPr>
-        <w:spacing w:after="120" w:line="300"/>
+        <w:spacing w:after="100" w:line="276"/>
       </w:pPr>
       <w:r>
         <w:t xml:space="preserve">En la base, 3.724 de las 5.302 notas llegaron por Google News. Sin un paso adicional, esas notas solo tendrían el título: por eso el sistema decodifica cada enlace y entra a la página real (sección 6.3).</w:t>
@@ -1795,7 +1795,7 @@
           <w:left w:val="single" w:color="1F5F8B" w:sz="18" w:space="8"/>
         </w:pBdr>
         <w:shd w:fill="E8F0F6" w:val="clear"/>
-        <w:spacing w:after="160" w:before="120" w:line="288"/>
+        <w:spacing w:after="140" w:before="100" w:line="264"/>
         <w:ind w:left="200" w:right="200"/>
       </w:pPr>
       <w:r>
@@ -1811,7 +1811,7 @@
       <w:pPr>
         <w:pStyle w:val="Heading1"/>
         <w:keepNext/>
-        <w:spacing w:after="200" w:before="360"/>
+        <w:spacing w:after="140" w:before="300"/>
       </w:pPr>
       <w:bookmarkStart w:name="_Toc8" w:id="8"/>
       <w:r>
@@ -1821,7 +1821,7 @@
     </w:p>
     <w:p>
       <w:pPr>
-        <w:spacing w:after="120" w:line="300"/>
+        <w:spacing w:after="100" w:line="276"/>
       </w:pPr>
       <w:r>
         <w:t xml:space="preserve">El sistema es un pipeline por lotes que corre cada 30 minutos. Todo está en </w:t>
@@ -1851,7 +1851,7 @@
     </w:p>
     <w:tbl>
       <w:tblPr>
-        <w:tblW w:type="dxa" w:w="9026"/>
+        <w:tblW w:type="dxa" w:w="9638"/>
         <w:tblBorders>
           <w:top w:val="single" w:color="auto" w:sz="4"/>
           <w:left w:val="single" w:color="auto" w:sz="4"/>
@@ -1862,9 +1862,9 @@
         </w:tblBorders>
       </w:tblPr>
       <w:tblGrid>
-        <w:gridCol w:w="2000"/>
-        <w:gridCol w:w="5326"/>
-        <w:gridCol w:w="1700"/>
+        <w:gridCol w:w="2136"/>
+        <w:gridCol w:w="5687"/>
+        <w:gridCol w:w="1815"/>
       </w:tblGrid>
       <w:tr>
         <w:trPr>
@@ -1872,7 +1872,7 @@
         </w:trPr>
         <w:tc>
           <w:tcPr>
-            <w:tcW w:type="dxa" w:w="2000"/>
+            <w:tcW w:type="dxa" w:w="2136"/>
             <w:tcBorders>
               <w:top w:val="single" w:color="D9DCD5" w:sz="4"/>
               <w:left w:val="single" w:color="D9DCD5" w:sz="4"/>
@@ -1902,7 +1902,7 @@
         </w:tc>
         <w:tc>
           <w:tcPr>
-            <w:tcW w:type="dxa" w:w="5326"/>
+            <w:tcW w:type="dxa" w:w="5687"/>
             <w:tcBorders>
               <w:top w:val="single" w:color="D9DCD5" w:sz="4"/>
               <w:left w:val="single" w:color="D9DCD5" w:sz="4"/>
@@ -1932,7 +1932,7 @@
         </w:tc>
         <w:tc>
           <w:tcPr>
-            <w:tcW w:type="dxa" w:w="1700"/>
+            <w:tcW w:type="dxa" w:w="1815"/>
             <w:tcBorders>
               <w:top w:val="single" w:color="D9DCD5" w:sz="4"/>
               <w:left w:val="single" w:color="D9DCD5" w:sz="4"/>
@@ -1967,7 +1967,7 @@
         </w:trPr>
         <w:tc>
           <w:tcPr>
-            <w:tcW w:type="dxa" w:w="2000"/>
+            <w:tcW w:type="dxa" w:w="2136"/>
             <w:tcBorders>
               <w:top w:val="single" w:color="D9DCD5" w:sz="4"/>
               <w:left w:val="single" w:color="D9DCD5" w:sz="4"/>
@@ -1993,7 +1993,7 @@
         </w:tc>
         <w:tc>
           <w:tcPr>
-            <w:tcW w:type="dxa" w:w="5326"/>
+            <w:tcW w:type="dxa" w:w="5687"/>
             <w:tcBorders>
               <w:top w:val="single" w:color="D9DCD5" w:sz="4"/>
               <w:left w:val="single" w:color="D9DCD5" w:sz="4"/>
@@ -2019,7 +2019,7 @@
         </w:tc>
         <w:tc>
           <w:tcPr>
-            <w:tcW w:type="dxa" w:w="1700"/>
+            <w:tcW w:type="dxa" w:w="1815"/>
             <w:tcBorders>
               <w:top w:val="single" w:color="D9DCD5" w:sz="4"/>
               <w:left w:val="single" w:color="D9DCD5" w:sz="4"/>
@@ -2050,7 +2050,7 @@
         </w:trPr>
         <w:tc>
           <w:tcPr>
-            <w:tcW w:type="dxa" w:w="2000"/>
+            <w:tcW w:type="dxa" w:w="2136"/>
             <w:tcBorders>
               <w:top w:val="single" w:color="D9DCD5" w:sz="4"/>
               <w:left w:val="single" w:color="D9DCD5" w:sz="4"/>
@@ -2077,7 +2077,7 @@
         </w:tc>
         <w:tc>
           <w:tcPr>
-            <w:tcW w:type="dxa" w:w="5326"/>
+            <w:tcW w:type="dxa" w:w="5687"/>
             <w:tcBorders>
               <w:top w:val="single" w:color="D9DCD5" w:sz="4"/>
               <w:left w:val="single" w:color="D9DCD5" w:sz="4"/>
@@ -2104,7 +2104,7 @@
         </w:tc>
         <w:tc>
           <w:tcPr>
-            <w:tcW w:type="dxa" w:w="1700"/>
+            <w:tcW w:type="dxa" w:w="1815"/>
             <w:tcBorders>
               <w:top w:val="single" w:color="D9DCD5" w:sz="4"/>
               <w:left w:val="single" w:color="D9DCD5" w:sz="4"/>
@@ -2136,7 +2136,7 @@
         </w:trPr>
         <w:tc>
           <w:tcPr>
-            <w:tcW w:type="dxa" w:w="2000"/>
+            <w:tcW w:type="dxa" w:w="2136"/>
             <w:tcBorders>
               <w:top w:val="single" w:color="D9DCD5" w:sz="4"/>
               <w:left w:val="single" w:color="D9DCD5" w:sz="4"/>
@@ -2162,7 +2162,7 @@
         </w:tc>
         <w:tc>
           <w:tcPr>
-            <w:tcW w:type="dxa" w:w="5326"/>
+            <w:tcW w:type="dxa" w:w="5687"/>
             <w:tcBorders>
               <w:top w:val="single" w:color="D9DCD5" w:sz="4"/>
               <w:left w:val="single" w:color="D9DCD5" w:sz="4"/>
@@ -2188,7 +2188,7 @@
         </w:tc>
         <w:tc>
           <w:tcPr>
-            <w:tcW w:type="dxa" w:w="1700"/>
+            <w:tcW w:type="dxa" w:w="1815"/>
             <w:tcBorders>
               <w:top w:val="single" w:color="D9DCD5" w:sz="4"/>
               <w:left w:val="single" w:color="D9DCD5" w:sz="4"/>
@@ -2219,7 +2219,7 @@
         </w:trPr>
         <w:tc>
           <w:tcPr>
-            <w:tcW w:type="dxa" w:w="2000"/>
+            <w:tcW w:type="dxa" w:w="2136"/>
             <w:tcBorders>
               <w:top w:val="single" w:color="D9DCD5" w:sz="4"/>
               <w:left w:val="single" w:color="D9DCD5" w:sz="4"/>
@@ -2246,7 +2246,7 @@
         </w:tc>
         <w:tc>
           <w:tcPr>
-            <w:tcW w:type="dxa" w:w="5326"/>
+            <w:tcW w:type="dxa" w:w="5687"/>
             <w:tcBorders>
               <w:top w:val="single" w:color="D9DCD5" w:sz="4"/>
               <w:left w:val="single" w:color="D9DCD5" w:sz="4"/>
@@ -2273,7 +2273,7 @@
         </w:tc>
         <w:tc>
           <w:tcPr>
-            <w:tcW w:type="dxa" w:w="1700"/>
+            <w:tcW w:type="dxa" w:w="1815"/>
             <w:tcBorders>
               <w:top w:val="single" w:color="D9DCD5" w:sz="4"/>
               <w:left w:val="single" w:color="D9DCD5" w:sz="4"/>
@@ -2305,7 +2305,7 @@
         </w:trPr>
         <w:tc>
           <w:tcPr>
-            <w:tcW w:type="dxa" w:w="2000"/>
+            <w:tcW w:type="dxa" w:w="2136"/>
             <w:tcBorders>
               <w:top w:val="single" w:color="D9DCD5" w:sz="4"/>
               <w:left w:val="single" w:color="D9DCD5" w:sz="4"/>
@@ -2331,7 +2331,7 @@
         </w:tc>
         <w:tc>
           <w:tcPr>
-            <w:tcW w:type="dxa" w:w="5326"/>
+            <w:tcW w:type="dxa" w:w="5687"/>
             <w:tcBorders>
               <w:top w:val="single" w:color="D9DCD5" w:sz="4"/>
               <w:left w:val="single" w:color="D9DCD5" w:sz="4"/>
@@ -2357,7 +2357,7 @@
         </w:tc>
         <w:tc>
           <w:tcPr>
-            <w:tcW w:type="dxa" w:w="1700"/>
+            <w:tcW w:type="dxa" w:w="1815"/>
             <w:tcBorders>
               <w:top w:val="single" w:color="D9DCD5" w:sz="4"/>
               <w:left w:val="single" w:color="D9DCD5" w:sz="4"/>
@@ -2388,7 +2388,7 @@
         </w:trPr>
         <w:tc>
           <w:tcPr>
-            <w:tcW w:type="dxa" w:w="2000"/>
+            <w:tcW w:type="dxa" w:w="2136"/>
             <w:tcBorders>
               <w:top w:val="single" w:color="D9DCD5" w:sz="4"/>
               <w:left w:val="single" w:color="D9DCD5" w:sz="4"/>
@@ -2415,7 +2415,7 @@
         </w:tc>
         <w:tc>
           <w:tcPr>
-            <w:tcW w:type="dxa" w:w="5326"/>
+            <w:tcW w:type="dxa" w:w="5687"/>
             <w:tcBorders>
               <w:top w:val="single" w:color="D9DCD5" w:sz="4"/>
               <w:left w:val="single" w:color="D9DCD5" w:sz="4"/>
@@ -2442,7 +2442,7 @@
         </w:tc>
         <w:tc>
           <w:tcPr>
-            <w:tcW w:type="dxa" w:w="1700"/>
+            <w:tcW w:type="dxa" w:w="1815"/>
             <w:tcBorders>
               <w:top w:val="single" w:color="D9DCD5" w:sz="4"/>
               <w:left w:val="single" w:color="D9DCD5" w:sz="4"/>
@@ -2474,7 +2474,7 @@
         </w:trPr>
         <w:tc>
           <w:tcPr>
-            <w:tcW w:type="dxa" w:w="2000"/>
+            <w:tcW w:type="dxa" w:w="2136"/>
             <w:tcBorders>
               <w:top w:val="single" w:color="D9DCD5" w:sz="4"/>
               <w:left w:val="single" w:color="D9DCD5" w:sz="4"/>
@@ -2500,7 +2500,7 @@
         </w:tc>
         <w:tc>
           <w:tcPr>
-            <w:tcW w:type="dxa" w:w="5326"/>
+            <w:tcW w:type="dxa" w:w="5687"/>
             <w:tcBorders>
               <w:top w:val="single" w:color="D9DCD5" w:sz="4"/>
               <w:left w:val="single" w:color="D9DCD5" w:sz="4"/>
@@ -2526,7 +2526,7 @@
         </w:tc>
         <w:tc>
           <w:tcPr>
-            <w:tcW w:type="dxa" w:w="1700"/>
+            <w:tcW w:type="dxa" w:w="1815"/>
             <w:tcBorders>
               <w:top w:val="single" w:color="D9DCD5" w:sz="4"/>
               <w:left w:val="single" w:color="D9DCD5" w:sz="4"/>
@@ -2557,7 +2557,7 @@
         </w:trPr>
         <w:tc>
           <w:tcPr>
-            <w:tcW w:type="dxa" w:w="2000"/>
+            <w:tcW w:type="dxa" w:w="2136"/>
             <w:tcBorders>
               <w:top w:val="single" w:color="D9DCD5" w:sz="4"/>
               <w:left w:val="single" w:color="D9DCD5" w:sz="4"/>
@@ -2584,7 +2584,7 @@
         </w:tc>
         <w:tc>
           <w:tcPr>
-            <w:tcW w:type="dxa" w:w="5326"/>
+            <w:tcW w:type="dxa" w:w="5687"/>
             <w:tcBorders>
               <w:top w:val="single" w:color="D9DCD5" w:sz="4"/>
               <w:left w:val="single" w:color="D9DCD5" w:sz="4"/>
@@ -2611,7 +2611,7 @@
         </w:tc>
         <w:tc>
           <w:tcPr>
-            <w:tcW w:type="dxa" w:w="1700"/>
+            <w:tcW w:type="dxa" w:w="1815"/>
             <w:tcBorders>
               <w:top w:val="single" w:color="D9DCD5" w:sz="4"/>
               <w:left w:val="single" w:color="D9DCD5" w:sz="4"/>
@@ -2656,7 +2656,7 @@
     </w:p>
     <w:p>
       <w:pPr>
-        <w:spacing w:after="120" w:line="300"/>
+        <w:spacing w:after="100" w:line="276"/>
       </w:pPr>
       <w:r>
         <w:t xml:space="preserve">El workflow </w:t>
@@ -2691,7 +2691,7 @@
           <w:ilvl w:val="0"/>
           <w:numId w:val="4"/>
         </w:numPr>
-        <w:spacing w:after="60" w:line="288"/>
+        <w:spacing w:after="40" w:line="264"/>
       </w:pPr>
       <w:r>
         <w:t xml:space="preserve">Restaura la base comprimida (</w:t>
@@ -2726,7 +2726,7 @@
           <w:ilvl w:val="0"/>
           <w:numId w:val="4"/>
         </w:numPr>
-        <w:spacing w:after="60" w:line="288"/>
+        <w:spacing w:after="40" w:line="264"/>
       </w:pPr>
       <w:r>
         <w:t xml:space="preserve">Instala dependencias, incluido PyTorch para CPU, y recupera el modelo BERT de la caché.</w:t>
@@ -2739,7 +2739,7 @@
           <w:ilvl w:val="0"/>
           <w:numId w:val="4"/>
         </w:numPr>
-        <w:spacing w:after="60" w:line="288"/>
+        <w:spacing w:after="40" w:line="264"/>
       </w:pPr>
       <w:r>
         <w:t xml:space="preserve">Corre </w:t>
@@ -2763,7 +2763,7 @@
           <w:ilvl w:val="0"/>
           <w:numId w:val="4"/>
         </w:numPr>
-        <w:spacing w:after="60" w:line="288"/>
+        <w:spacing w:after="40" w:line="264"/>
       </w:pPr>
       <w:r>
         <w:t xml:space="preserve">Guarda la base actualizada en </w:t>
@@ -2787,7 +2787,7 @@
           <w:ilvl w:val="0"/>
           <w:numId w:val="4"/>
         </w:numPr>
-        <w:spacing w:after="60" w:line="288"/>
+        <w:spacing w:after="40" w:line="264"/>
       </w:pPr>
       <w:r>
         <w:t xml:space="preserve">Publica en GitHub Pages el tablero (</w:t>
@@ -2817,7 +2817,7 @@
     </w:p>
     <w:p>
       <w:pPr>
-        <w:spacing w:after="120" w:line="300"/>
+        <w:spacing w:after="100" w:line="276"/>
       </w:pPr>
       <w:r>
         <w:t xml:space="preserve">La primera corrida con BERT tarda unos 10 minutos (descarga el modelo y procesa el histórico); las siguientes, entre 3 y 6 minutos.</w:t>
@@ -2825,7 +2825,7 @@
     </w:p>
     <w:p>
       <w:pPr>
-        <w:spacing w:after="120" w:line="300"/>
+        <w:spacing w:after="100" w:line="276"/>
       </w:pPr>
       <w:r>
         <w:rPr>
@@ -2851,7 +2851,7 @@
     </w:p>
     <w:p>
       <w:pPr>
-        <w:spacing w:after="120" w:line="300"/>
+        <w:spacing w:after="100" w:line="276"/>
       </w:pPr>
       <w:r>
         <w:rPr>
@@ -2879,7 +2879,7 @@
       <w:pPr>
         <w:pStyle w:val="Heading1"/>
         <w:keepNext/>
-        <w:spacing w:after="200" w:before="360"/>
+        <w:spacing w:after="140" w:before="300"/>
       </w:pPr>
       <w:bookmarkStart w:name="_Toc10" w:id="10"/>
       <w:r>
@@ -2900,7 +2900,7 @@
     </w:p>
     <w:p>
       <w:pPr>
-        <w:spacing w:after="120" w:line="300"/>
+        <w:spacing w:after="100" w:line="276"/>
       </w:pPr>
       <w:r>
         <w:t xml:space="preserve">Siguiendo la distinción vista en clase, el sistema trabaja en dos niveles: las </w:t>
@@ -2961,7 +2961,7 @@
     </w:p>
     <w:p>
       <w:pPr>
-        <w:spacing w:after="120" w:line="300"/>
+        <w:spacing w:after="100" w:line="276"/>
       </w:pPr>
       <w:r>
         <w:t xml:space="preserve">Las clases plantean que un crawler debe ser respetuoso con los sitios. El sistema lo implementa así:</w:t>
@@ -2974,7 +2974,7 @@
           <w:ilvl w:val="0"/>
           <w:numId w:val="2"/>
         </w:numPr>
-        <w:spacing w:after="60" w:line="288"/>
+        <w:spacing w:after="40" w:line="264"/>
       </w:pPr>
       <w:r>
         <w:rPr>
@@ -3005,7 +3005,7 @@
           <w:ilvl w:val="0"/>
           <w:numId w:val="2"/>
         </w:numPr>
-        <w:spacing w:after="60" w:line="288"/>
+        <w:spacing w:after="40" w:line="264"/>
       </w:pPr>
       <w:r>
         <w:rPr>
@@ -3036,7 +3036,7 @@
           <w:ilvl w:val="0"/>
           <w:numId w:val="2"/>
         </w:numPr>
-        <w:spacing w:after="60" w:line="288"/>
+        <w:spacing w:after="40" w:line="264"/>
       </w:pPr>
       <w:r>
         <w:rPr>
@@ -3056,7 +3056,7 @@
           <w:ilvl w:val="0"/>
           <w:numId w:val="2"/>
         </w:numPr>
-        <w:spacing w:after="60" w:line="288"/>
+        <w:spacing w:after="40" w:line="264"/>
       </w:pPr>
       <w:r>
         <w:rPr>
@@ -3076,7 +3076,7 @@
           <w:ilvl w:val="0"/>
           <w:numId w:val="2"/>
         </w:numPr>
-        <w:spacing w:after="60" w:line="288"/>
+        <w:spacing w:after="40" w:line="264"/>
       </w:pPr>
       <w:r>
         <w:rPr>
@@ -3102,7 +3102,7 @@
     </w:p>
     <w:p>
       <w:pPr>
-        <w:spacing w:after="120" w:line="300"/>
+        <w:spacing w:after="100" w:line="276"/>
       </w:pPr>
       <w:r>
         <w:t xml:space="preserve">Los enlaces de Google News (</w:t>
@@ -3159,7 +3159,7 @@
           <w:ilvl w:val="0"/>
           <w:numId w:val="2"/>
         </w:numPr>
-        <w:spacing w:after="60" w:line="288"/>
+        <w:spacing w:after="40" w:line="264"/>
       </w:pPr>
       <w:r>
         <w:rPr>
@@ -3223,7 +3223,7 @@
           <w:ilvl w:val="0"/>
           <w:numId w:val="2"/>
         </w:numPr>
-        <w:spacing w:after="60" w:line="288"/>
+        <w:spacing w:after="40" w:line="264"/>
       </w:pPr>
       <w:r>
         <w:rPr>
@@ -3254,7 +3254,7 @@
           <w:ilvl w:val="0"/>
           <w:numId w:val="2"/>
         </w:numPr>
-        <w:spacing w:after="60" w:line="288"/>
+        <w:spacing w:after="40" w:line="264"/>
       </w:pPr>
       <w:r>
         <w:rPr>
@@ -3269,7 +3269,7 @@
     </w:p>
     <w:p>
       <w:pPr>
-        <w:spacing w:after="120" w:line="300"/>
+        <w:spacing w:after="100" w:line="276"/>
       </w:pPr>
       <w:r>
         <w:t xml:space="preserve">Resultado acumulado: 5.548 intentos de scraping, 5.046 páginas descargadas, 4.613 notas con bajada y 4.803 con JSON-LD.</w:t>
@@ -3288,7 +3288,7 @@
     </w:p>
     <w:p>
       <w:pPr>
-        <w:spacing w:after="120" w:line="300"/>
+        <w:spacing w:after="100" w:line="276"/>
       </w:pPr>
       <w:r>
         <w:t xml:space="preserve">Como se vio en clase, mantener scrapers es costoso porque la web cambia. El sistema registra su propio estado para detectar problemas:</w:t>
@@ -3301,7 +3301,7 @@
           <w:ilvl w:val="0"/>
           <w:numId w:val="2"/>
         </w:numPr>
-        <w:spacing w:after="60" w:line="288"/>
+        <w:spacing w:after="40" w:line="264"/>
       </w:pPr>
       <w:r>
         <w:t xml:space="preserve">Tabla </w:t>
@@ -3344,7 +3344,7 @@
           <w:ilvl w:val="0"/>
           <w:numId w:val="2"/>
         </w:numPr>
-        <w:spacing w:after="60" w:line="288"/>
+        <w:spacing w:after="40" w:line="264"/>
       </w:pPr>
       <w:r>
         <w:t xml:space="preserve">Tabla </w:t>
@@ -3367,7 +3367,7 @@
           <w:ilvl w:val="0"/>
           <w:numId w:val="2"/>
         </w:numPr>
-        <w:spacing w:after="60" w:line="288"/>
+        <w:spacing w:after="40" w:line="264"/>
       </w:pPr>
       <w:r>
         <w:t xml:space="preserve">Tabla </w:t>
@@ -3385,7 +3385,7 @@
     </w:p>
     <w:p>
       <w:pPr>
-        <w:spacing w:after="120" w:line="300"/>
+        <w:spacing w:after="100" w:line="276"/>
       </w:pPr>
       <w:r>
         <w:t xml:space="preserve">Esa instrumentación permitió detectar y corregir problemas reales durante el desarrollo:</w:t>
@@ -3393,7 +3393,7 @@
     </w:p>
     <w:tbl>
       <w:tblPr>
-        <w:tblW w:type="dxa" w:w="9026"/>
+        <w:tblW w:type="dxa" w:w="9638"/>
         <w:tblBorders>
           <w:top w:val="single" w:color="auto" w:sz="4"/>
           <w:left w:val="single" w:color="auto" w:sz="4"/>
@@ -3404,9 +3404,9 @@
         </w:tblBorders>
       </w:tblPr>
       <w:tblGrid>
-        <w:gridCol w:w="2200"/>
-        <w:gridCol w:w="3413"/>
-        <w:gridCol w:w="3413"/>
+        <w:gridCol w:w="2349"/>
+        <w:gridCol w:w="3644"/>
+        <w:gridCol w:w="3645"/>
       </w:tblGrid>
       <w:tr>
         <w:trPr>
@@ -3414,7 +3414,7 @@
         </w:trPr>
         <w:tc>
           <w:tcPr>
-            <w:tcW w:type="dxa" w:w="2200"/>
+            <w:tcW w:type="dxa" w:w="2349"/>
             <w:tcBorders>
               <w:top w:val="single" w:color="D9DCD5" w:sz="4"/>
               <w:left w:val="single" w:color="D9DCD5" w:sz="4"/>
@@ -3444,7 +3444,7 @@
         </w:tc>
         <w:tc>
           <w:tcPr>
-            <w:tcW w:type="dxa" w:w="3413"/>
+            <w:tcW w:type="dxa" w:w="3644"/>
             <w:tcBorders>
               <w:top w:val="single" w:color="D9DCD5" w:sz="4"/>
               <w:left w:val="single" w:color="D9DCD5" w:sz="4"/>
@@ -3474,7 +3474,7 @@
         </w:tc>
         <w:tc>
           <w:tcPr>
-            <w:tcW w:type="dxa" w:w="3413"/>
+            <w:tcW w:type="dxa" w:w="3645"/>
             <w:tcBorders>
               <w:top w:val="single" w:color="D9DCD5" w:sz="4"/>
               <w:left w:val="single" w:color="D9DCD5" w:sz="4"/>
@@ -3509,7 +3509,7 @@
         </w:trPr>
         <w:tc>
           <w:tcPr>
-            <w:tcW w:type="dxa" w:w="2200"/>
+            <w:tcW w:type="dxa" w:w="2349"/>
             <w:tcBorders>
               <w:top w:val="single" w:color="D9DCD5" w:sz="4"/>
               <w:left w:val="single" w:color="D9DCD5" w:sz="4"/>
@@ -3535,7 +3535,7 @@
         </w:tc>
         <w:tc>
           <w:tcPr>
-            <w:tcW w:type="dxa" w:w="3413"/>
+            <w:tcW w:type="dxa" w:w="3644"/>
             <w:tcBorders>
               <w:top w:val="single" w:color="D9DCD5" w:sz="4"/>
               <w:left w:val="single" w:color="D9DCD5" w:sz="4"/>
@@ -3561,7 +3561,7 @@
         </w:tc>
         <w:tc>
           <w:tcPr>
-            <w:tcW w:type="dxa" w:w="3413"/>
+            <w:tcW w:type="dxa" w:w="3645"/>
             <w:tcBorders>
               <w:top w:val="single" w:color="D9DCD5" w:sz="4"/>
               <w:left w:val="single" w:color="D9DCD5" w:sz="4"/>
@@ -3592,7 +3592,7 @@
         </w:trPr>
         <w:tc>
           <w:tcPr>
-            <w:tcW w:type="dxa" w:w="2200"/>
+            <w:tcW w:type="dxa" w:w="2349"/>
             <w:tcBorders>
               <w:top w:val="single" w:color="D9DCD5" w:sz="4"/>
               <w:left w:val="single" w:color="D9DCD5" w:sz="4"/>
@@ -3619,7 +3619,7 @@
         </w:tc>
         <w:tc>
           <w:tcPr>
-            <w:tcW w:type="dxa" w:w="3413"/>
+            <w:tcW w:type="dxa" w:w="3644"/>
             <w:tcBorders>
               <w:top w:val="single" w:color="D9DCD5" w:sz="4"/>
               <w:left w:val="single" w:color="D9DCD5" w:sz="4"/>
@@ -3646,7 +3646,7 @@
         </w:tc>
         <w:tc>
           <w:tcPr>
-            <w:tcW w:type="dxa" w:w="3413"/>
+            <w:tcW w:type="dxa" w:w="3645"/>
             <w:tcBorders>
               <w:top w:val="single" w:color="D9DCD5" w:sz="4"/>
               <w:left w:val="single" w:color="D9DCD5" w:sz="4"/>
@@ -3678,7 +3678,7 @@
         </w:trPr>
         <w:tc>
           <w:tcPr>
-            <w:tcW w:type="dxa" w:w="2200"/>
+            <w:tcW w:type="dxa" w:w="2349"/>
             <w:tcBorders>
               <w:top w:val="single" w:color="D9DCD5" w:sz="4"/>
               <w:left w:val="single" w:color="D9DCD5" w:sz="4"/>
@@ -3704,7 +3704,7 @@
         </w:tc>
         <w:tc>
           <w:tcPr>
-            <w:tcW w:type="dxa" w:w="3413"/>
+            <w:tcW w:type="dxa" w:w="3644"/>
             <w:tcBorders>
               <w:top w:val="single" w:color="D9DCD5" w:sz="4"/>
               <w:left w:val="single" w:color="D9DCD5" w:sz="4"/>
@@ -3730,7 +3730,7 @@
         </w:tc>
         <w:tc>
           <w:tcPr>
-            <w:tcW w:type="dxa" w:w="3413"/>
+            <w:tcW w:type="dxa" w:w="3645"/>
             <w:tcBorders>
               <w:top w:val="single" w:color="D9DCD5" w:sz="4"/>
               <w:left w:val="single" w:color="D9DCD5" w:sz="4"/>
@@ -3761,7 +3761,7 @@
         </w:trPr>
         <w:tc>
           <w:tcPr>
-            <w:tcW w:type="dxa" w:w="2200"/>
+            <w:tcW w:type="dxa" w:w="2349"/>
             <w:tcBorders>
               <w:top w:val="single" w:color="D9DCD5" w:sz="4"/>
               <w:left w:val="single" w:color="D9DCD5" w:sz="4"/>
@@ -3788,7 +3788,7 @@
         </w:tc>
         <w:tc>
           <w:tcPr>
-            <w:tcW w:type="dxa" w:w="3413"/>
+            <w:tcW w:type="dxa" w:w="3644"/>
             <w:tcBorders>
               <w:top w:val="single" w:color="D9DCD5" w:sz="4"/>
               <w:left w:val="single" w:color="D9DCD5" w:sz="4"/>
@@ -3815,7 +3815,7 @@
         </w:tc>
         <w:tc>
           <w:tcPr>
-            <w:tcW w:type="dxa" w:w="3413"/>
+            <w:tcW w:type="dxa" w:w="3645"/>
             <w:tcBorders>
               <w:top w:val="single" w:color="D9DCD5" w:sz="4"/>
               <w:left w:val="single" w:color="D9DCD5" w:sz="4"/>
@@ -3847,7 +3847,7 @@
         </w:trPr>
         <w:tc>
           <w:tcPr>
-            <w:tcW w:type="dxa" w:w="2200"/>
+            <w:tcW w:type="dxa" w:w="2349"/>
             <w:tcBorders>
               <w:top w:val="single" w:color="D9DCD5" w:sz="4"/>
               <w:left w:val="single" w:color="D9DCD5" w:sz="4"/>
@@ -3873,7 +3873,7 @@
         </w:tc>
         <w:tc>
           <w:tcPr>
-            <w:tcW w:type="dxa" w:w="3413"/>
+            <w:tcW w:type="dxa" w:w="3644"/>
             <w:tcBorders>
               <w:top w:val="single" w:color="D9DCD5" w:sz="4"/>
               <w:left w:val="single" w:color="D9DCD5" w:sz="4"/>
@@ -3899,7 +3899,7 @@
         </w:tc>
         <w:tc>
           <w:tcPr>
-            <w:tcW w:type="dxa" w:w="3413"/>
+            <w:tcW w:type="dxa" w:w="3645"/>
             <w:tcBorders>
               <w:top w:val="single" w:color="D9DCD5" w:sz="4"/>
               <w:left w:val="single" w:color="D9DCD5" w:sz="4"/>
@@ -3932,7 +3932,7 @@
     </w:p>
     <w:p>
       <w:pPr>
-        <w:spacing w:after="120" w:line="300"/>
+        <w:spacing w:after="100" w:line="276"/>
       </w:pPr>
       <w:r>
         <w:t xml:space="preserve">Además, en cada corrida se vuelven a depurar las bajadas ya guardadas que presentan esos síntomas, de modo que una corrección del scraper también limpia el histórico.</w:t>
@@ -3942,7 +3942,7 @@
       <w:pPr>
         <w:pStyle w:val="Heading1"/>
         <w:keepNext/>
-        <w:spacing w:after="200" w:before="360"/>
+        <w:spacing w:after="140" w:before="300"/>
       </w:pPr>
       <w:bookmarkStart w:name="_Toc16" w:id="16"/>
       <w:r>
@@ -3963,7 +3963,7 @@
     </w:p>
     <w:p>
       <w:pPr>
-        <w:spacing w:after="120" w:line="300"/>
+        <w:spacing w:after="100" w:line="276"/>
       </w:pPr>
       <w:r>
         <w:t xml:space="preserve">Se normaliza el texto (minúsculas, sin tildes vía descomposición Unicode), se tokeniza con expresiones regulares, se eliminan stopwords en español y números, y se generan bigramas. La representación es una </w:t>
@@ -3992,7 +3992,7 @@
     </w:p>
     <w:p>
       <w:pPr>
-        <w:spacing w:after="120" w:line="300"/>
+        <w:spacing w:after="100" w:line="276"/>
       </w:pPr>
       <w:r>
         <w:t xml:space="preserve">Cada nota recibe hasta dos temas entre 15 (política, economía y trabajo, seguridad y justicia, fútbol, espectáculos, internacional, etc.).</w:t>
@@ -4005,7 +4005,7 @@
           <w:ilvl w:val="0"/>
           <w:numId w:val="2"/>
         </w:numPr>
-        <w:spacing w:after="60" w:line="288"/>
+        <w:spacing w:after="40" w:line="264"/>
       </w:pPr>
       <w:r>
         <w:rPr>
@@ -4025,7 +4025,7 @@
           <w:ilvl w:val="0"/>
           <w:numId w:val="2"/>
         </w:numPr>
-        <w:spacing w:after="60" w:line="288"/>
+        <w:spacing w:after="40" w:line="264"/>
       </w:pPr>
       <w:r>
         <w:rPr>
@@ -4062,7 +4062,7 @@
     </w:p>
     <w:p>
       <w:pPr>
-        <w:spacing w:after="120" w:line="300"/>
+        <w:spacing w:after="100" w:line="276"/>
       </w:pPr>
       <w:r>
         <w:rPr>
@@ -4077,7 +4077,7 @@
     </w:p>
     <w:p>
       <w:pPr>
-        <w:spacing w:after="120" w:line="300"/>
+        <w:spacing w:after="100" w:line="276"/>
       </w:pPr>
       <w:r>
         <w:rPr>
@@ -4124,7 +4124,7 @@
     </w:p>
     <w:p>
       <w:pPr>
-        <w:spacing w:after="120" w:line="300"/>
+        <w:spacing w:after="100" w:line="276"/>
       </w:pPr>
       <w:r>
         <w:t xml:space="preserve">El tono mide si </w:t>
@@ -4147,7 +4147,7 @@
           <w:ilvl w:val="0"/>
           <w:numId w:val="5"/>
         </w:numPr>
-        <w:spacing w:after="60" w:line="288"/>
+        <w:spacing w:after="40" w:line="264"/>
       </w:pPr>
       <w:r>
         <w:rPr>
@@ -4167,7 +4167,7 @@
           <w:ilvl w:val="0"/>
           <w:numId w:val="5"/>
         </w:numPr>
-        <w:spacing w:after="60" w:line="288"/>
+        <w:spacing w:after="40" w:line="264"/>
       </w:pPr>
       <w:r>
         <w:rPr>
@@ -4187,7 +4187,7 @@
           <w:ilvl w:val="0"/>
           <w:numId w:val="5"/>
         </w:numPr>
-        <w:spacing w:after="60" w:line="288"/>
+        <w:spacing w:after="40" w:line="264"/>
       </w:pPr>
       <w:r>
         <w:rPr>
@@ -4213,7 +4213,7 @@
     </w:p>
     <w:p>
       <w:pPr>
-        <w:spacing w:after="120" w:line="300"/>
+        <w:spacing w:after="100" w:line="276"/>
       </w:pPr>
       <w:r>
         <w:t xml:space="preserve">Se compararon 8 enfoques sobre </w:t>
@@ -4242,7 +4242,7 @@
     </w:p>
     <w:tbl>
       <w:tblPr>
-        <w:tblW w:type="dxa" w:w="9026"/>
+        <w:tblW w:type="dxa" w:w="9638"/>
         <w:tblBorders>
           <w:top w:val="single" w:color="auto" w:sz="4"/>
           <w:left w:val="single" w:color="auto" w:sz="4"/>
@@ -4253,11 +4253,11 @@
         </w:tblBorders>
       </w:tblPr>
       <w:tblGrid>
-        <w:gridCol w:w="3826"/>
-        <w:gridCol w:w="1300"/>
-        <w:gridCol w:w="1300"/>
-        <w:gridCol w:w="1300"/>
-        <w:gridCol w:w="1300"/>
+        <w:gridCol w:w="4085"/>
+        <w:gridCol w:w="1388"/>
+        <w:gridCol w:w="1388"/>
+        <w:gridCol w:w="1388"/>
+        <w:gridCol w:w="1389"/>
       </w:tblGrid>
       <w:tr>
         <w:trPr>
@@ -4265,7 +4265,7 @@
         </w:trPr>
         <w:tc>
           <w:tcPr>
-            <w:tcW w:type="dxa" w:w="3826"/>
+            <w:tcW w:type="dxa" w:w="4085"/>
             <w:tcBorders>
               <w:top w:val="single" w:color="D9DCD5" w:sz="4"/>
               <w:left w:val="single" w:color="D9DCD5" w:sz="4"/>
@@ -4295,7 +4295,7 @@
         </w:tc>
         <w:tc>
           <w:tcPr>
-            <w:tcW w:type="dxa" w:w="1300"/>
+            <w:tcW w:type="dxa" w:w="1388"/>
             <w:tcBorders>
               <w:top w:val="single" w:color="D9DCD5" w:sz="4"/>
               <w:left w:val="single" w:color="D9DCD5" w:sz="4"/>
@@ -4325,7 +4325,7 @@
         </w:tc>
         <w:tc>
           <w:tcPr>
-            <w:tcW w:type="dxa" w:w="1300"/>
+            <w:tcW w:type="dxa" w:w="1388"/>
             <w:tcBorders>
               <w:top w:val="single" w:color="D9DCD5" w:sz="4"/>
               <w:left w:val="single" w:color="D9DCD5" w:sz="4"/>
@@ -4355,7 +4355,7 @@
         </w:tc>
         <w:tc>
           <w:tcPr>
-            <w:tcW w:type="dxa" w:w="1300"/>
+            <w:tcW w:type="dxa" w:w="1388"/>
             <w:tcBorders>
               <w:top w:val="single" w:color="D9DCD5" w:sz="4"/>
               <w:left w:val="single" w:color="D9DCD5" w:sz="4"/>
@@ -4385,7 +4385,7 @@
         </w:tc>
         <w:tc>
           <w:tcPr>
-            <w:tcW w:type="dxa" w:w="1300"/>
+            <w:tcW w:type="dxa" w:w="1389"/>
             <w:tcBorders>
               <w:top w:val="single" w:color="D9DCD5" w:sz="4"/>
               <w:left w:val="single" w:color="D9DCD5" w:sz="4"/>
@@ -4420,7 +4420,7 @@
         </w:trPr>
         <w:tc>
           <w:tcPr>
-            <w:tcW w:type="dxa" w:w="3826"/>
+            <w:tcW w:type="dxa" w:w="4085"/>
             <w:tcBorders>
               <w:top w:val="single" w:color="D9DCD5" w:sz="4"/>
               <w:left w:val="single" w:color="D9DCD5" w:sz="4"/>
@@ -4446,7 +4446,7 @@
         </w:tc>
         <w:tc>
           <w:tcPr>
-            <w:tcW w:type="dxa" w:w="1300"/>
+            <w:tcW w:type="dxa" w:w="1388"/>
             <w:tcBorders>
               <w:top w:val="single" w:color="D9DCD5" w:sz="4"/>
               <w:left w:val="single" w:color="D9DCD5" w:sz="4"/>
@@ -4472,7 +4472,7 @@
         </w:tc>
         <w:tc>
           <w:tcPr>
-            <w:tcW w:type="dxa" w:w="1300"/>
+            <w:tcW w:type="dxa" w:w="1388"/>
             <w:tcBorders>
               <w:top w:val="single" w:color="D9DCD5" w:sz="4"/>
               <w:left w:val="single" w:color="D9DCD5" w:sz="4"/>
@@ -4498,7 +4498,7 @@
         </w:tc>
         <w:tc>
           <w:tcPr>
-            <w:tcW w:type="dxa" w:w="1300"/>
+            <w:tcW w:type="dxa" w:w="1388"/>
             <w:tcBorders>
               <w:top w:val="single" w:color="D9DCD5" w:sz="4"/>
               <w:left w:val="single" w:color="D9DCD5" w:sz="4"/>
@@ -4524,7 +4524,7 @@
         </w:tc>
         <w:tc>
           <w:tcPr>
-            <w:tcW w:type="dxa" w:w="1300"/>
+            <w:tcW w:type="dxa" w:w="1389"/>
             <w:tcBorders>
               <w:top w:val="single" w:color="D9DCD5" w:sz="4"/>
               <w:left w:val="single" w:color="D9DCD5" w:sz="4"/>
@@ -4555,7 +4555,7 @@
         </w:trPr>
         <w:tc>
           <w:tcPr>
-            <w:tcW w:type="dxa" w:w="3826"/>
+            <w:tcW w:type="dxa" w:w="4085"/>
             <w:tcBorders>
               <w:top w:val="single" w:color="D9DCD5" w:sz="4"/>
               <w:left w:val="single" w:color="D9DCD5" w:sz="4"/>
@@ -4582,7 +4582,7 @@
         </w:tc>
         <w:tc>
           <w:tcPr>
-            <w:tcW w:type="dxa" w:w="1300"/>
+            <w:tcW w:type="dxa" w:w="1388"/>
             <w:tcBorders>
               <w:top w:val="single" w:color="D9DCD5" w:sz="4"/>
               <w:left w:val="single" w:color="D9DCD5" w:sz="4"/>
@@ -4609,7 +4609,7 @@
         </w:tc>
         <w:tc>
           <w:tcPr>
-            <w:tcW w:type="dxa" w:w="1300"/>
+            <w:tcW w:type="dxa" w:w="1388"/>
             <w:tcBorders>
               <w:top w:val="single" w:color="D9DCD5" w:sz="4"/>
               <w:left w:val="single" w:color="D9DCD5" w:sz="4"/>
@@ -4636,7 +4636,7 @@
         </w:tc>
         <w:tc>
           <w:tcPr>
-            <w:tcW w:type="dxa" w:w="1300"/>
+            <w:tcW w:type="dxa" w:w="1388"/>
             <w:tcBorders>
               <w:top w:val="single" w:color="D9DCD5" w:sz="4"/>
               <w:left w:val="single" w:color="D9DCD5" w:sz="4"/>
@@ -4663,7 +4663,7 @@
         </w:tc>
         <w:tc>
           <w:tcPr>
-            <w:tcW w:type="dxa" w:w="1300"/>
+            <w:tcW w:type="dxa" w:w="1389"/>
             <w:tcBorders>
               <w:top w:val="single" w:color="D9DCD5" w:sz="4"/>
               <w:left w:val="single" w:color="D9DCD5" w:sz="4"/>
@@ -4695,7 +4695,7 @@
         </w:trPr>
         <w:tc>
           <w:tcPr>
-            <w:tcW w:type="dxa" w:w="3826"/>
+            <w:tcW w:type="dxa" w:w="4085"/>
             <w:tcBorders>
               <w:top w:val="single" w:color="D9DCD5" w:sz="4"/>
               <w:left w:val="single" w:color="D9DCD5" w:sz="4"/>
@@ -4721,7 +4721,7 @@
         </w:tc>
         <w:tc>
           <w:tcPr>
-            <w:tcW w:type="dxa" w:w="1300"/>
+            <w:tcW w:type="dxa" w:w="1388"/>
             <w:tcBorders>
               <w:top w:val="single" w:color="D9DCD5" w:sz="4"/>
               <w:left w:val="single" w:color="D9DCD5" w:sz="4"/>
@@ -4747,7 +4747,7 @@
         </w:tc>
         <w:tc>
           <w:tcPr>
-            <w:tcW w:type="dxa" w:w="1300"/>
+            <w:tcW w:type="dxa" w:w="1388"/>
             <w:tcBorders>
               <w:top w:val="single" w:color="D9DCD5" w:sz="4"/>
               <w:left w:val="single" w:color="D9DCD5" w:sz="4"/>
@@ -4773,7 +4773,7 @@
         </w:tc>
         <w:tc>
           <w:tcPr>
-            <w:tcW w:type="dxa" w:w="1300"/>
+            <w:tcW w:type="dxa" w:w="1388"/>
             <w:tcBorders>
               <w:top w:val="single" w:color="D9DCD5" w:sz="4"/>
               <w:left w:val="single" w:color="D9DCD5" w:sz="4"/>
@@ -4799,7 +4799,7 @@
         </w:tc>
         <w:tc>
           <w:tcPr>
-            <w:tcW w:type="dxa" w:w="1300"/>
+            <w:tcW w:type="dxa" w:w="1389"/>
             <w:tcBorders>
               <w:top w:val="single" w:color="D9DCD5" w:sz="4"/>
               <w:left w:val="single" w:color="D9DCD5" w:sz="4"/>
@@ -4830,7 +4830,7 @@
         </w:trPr>
         <w:tc>
           <w:tcPr>
-            <w:tcW w:type="dxa" w:w="3826"/>
+            <w:tcW w:type="dxa" w:w="4085"/>
             <w:tcBorders>
               <w:top w:val="single" w:color="D9DCD5" w:sz="4"/>
               <w:left w:val="single" w:color="D9DCD5" w:sz="4"/>
@@ -4857,7 +4857,7 @@
         </w:tc>
         <w:tc>
           <w:tcPr>
-            <w:tcW w:type="dxa" w:w="1300"/>
+            <w:tcW w:type="dxa" w:w="1388"/>
             <w:tcBorders>
               <w:top w:val="single" w:color="D9DCD5" w:sz="4"/>
               <w:left w:val="single" w:color="D9DCD5" w:sz="4"/>
@@ -4884,7 +4884,7 @@
         </w:tc>
         <w:tc>
           <w:tcPr>
-            <w:tcW w:type="dxa" w:w="1300"/>
+            <w:tcW w:type="dxa" w:w="1388"/>
             <w:tcBorders>
               <w:top w:val="single" w:color="D9DCD5" w:sz="4"/>
               <w:left w:val="single" w:color="D9DCD5" w:sz="4"/>
@@ -4911,7 +4911,7 @@
         </w:tc>
         <w:tc>
           <w:tcPr>
-            <w:tcW w:type="dxa" w:w="1300"/>
+            <w:tcW w:type="dxa" w:w="1388"/>
             <w:tcBorders>
               <w:top w:val="single" w:color="D9DCD5" w:sz="4"/>
               <w:left w:val="single" w:color="D9DCD5" w:sz="4"/>
@@ -4938,7 +4938,7 @@
         </w:tc>
         <w:tc>
           <w:tcPr>
-            <w:tcW w:type="dxa" w:w="1300"/>
+            <w:tcW w:type="dxa" w:w="1389"/>
             <w:tcBorders>
               <w:top w:val="single" w:color="D9DCD5" w:sz="4"/>
               <w:left w:val="single" w:color="D9DCD5" w:sz="4"/>
@@ -4970,7 +4970,7 @@
         </w:trPr>
         <w:tc>
           <w:tcPr>
-            <w:tcW w:type="dxa" w:w="3826"/>
+            <w:tcW w:type="dxa" w:w="4085"/>
             <w:tcBorders>
               <w:top w:val="single" w:color="D9DCD5" w:sz="4"/>
               <w:left w:val="single" w:color="D9DCD5" w:sz="4"/>
@@ -4996,7 +4996,7 @@
         </w:tc>
         <w:tc>
           <w:tcPr>
-            <w:tcW w:type="dxa" w:w="1300"/>
+            <w:tcW w:type="dxa" w:w="1388"/>
             <w:tcBorders>
               <w:top w:val="single" w:color="D9DCD5" w:sz="4"/>
               <w:left w:val="single" w:color="D9DCD5" w:sz="4"/>
@@ -5022,7 +5022,7 @@
         </w:tc>
         <w:tc>
           <w:tcPr>
-            <w:tcW w:type="dxa" w:w="1300"/>
+            <w:tcW w:type="dxa" w:w="1388"/>
             <w:tcBorders>
               <w:top w:val="single" w:color="D9DCD5" w:sz="4"/>
               <w:left w:val="single" w:color="D9DCD5" w:sz="4"/>
@@ -5048,7 +5048,7 @@
         </w:tc>
         <w:tc>
           <w:tcPr>
-            <w:tcW w:type="dxa" w:w="1300"/>
+            <w:tcW w:type="dxa" w:w="1388"/>
             <w:tcBorders>
               <w:top w:val="single" w:color="D9DCD5" w:sz="4"/>
               <w:left w:val="single" w:color="D9DCD5" w:sz="4"/>
@@ -5074,7 +5074,7 @@
         </w:tc>
         <w:tc>
           <w:tcPr>
-            <w:tcW w:type="dxa" w:w="1300"/>
+            <w:tcW w:type="dxa" w:w="1389"/>
             <w:tcBorders>
               <w:top w:val="single" w:color="D9DCD5" w:sz="4"/>
               <w:left w:val="single" w:color="D9DCD5" w:sz="4"/>
@@ -5105,7 +5105,7 @@
         </w:trPr>
         <w:tc>
           <w:tcPr>
-            <w:tcW w:type="dxa" w:w="3826"/>
+            <w:tcW w:type="dxa" w:w="4085"/>
             <w:tcBorders>
               <w:top w:val="single" w:color="D9DCD5" w:sz="4"/>
               <w:left w:val="single" w:color="D9DCD5" w:sz="4"/>
@@ -5134,7 +5134,7 @@
         </w:tc>
         <w:tc>
           <w:tcPr>
-            <w:tcW w:type="dxa" w:w="1300"/>
+            <w:tcW w:type="dxa" w:w="1388"/>
             <w:tcBorders>
               <w:top w:val="single" w:color="D9DCD5" w:sz="4"/>
               <w:left w:val="single" w:color="D9DCD5" w:sz="4"/>
@@ -5163,7 +5163,7 @@
         </w:tc>
         <w:tc>
           <w:tcPr>
-            <w:tcW w:type="dxa" w:w="1300"/>
+            <w:tcW w:type="dxa" w:w="1388"/>
             <w:tcBorders>
               <w:top w:val="single" w:color="D9DCD5" w:sz="4"/>
               <w:left w:val="single" w:color="D9DCD5" w:sz="4"/>
@@ -5192,7 +5192,7 @@
         </w:tc>
         <w:tc>
           <w:tcPr>
-            <w:tcW w:type="dxa" w:w="1300"/>
+            <w:tcW w:type="dxa" w:w="1388"/>
             <w:tcBorders>
               <w:top w:val="single" w:color="D9DCD5" w:sz="4"/>
               <w:left w:val="single" w:color="D9DCD5" w:sz="4"/>
@@ -5221,7 +5221,7 @@
         </w:tc>
         <w:tc>
           <w:tcPr>
-            <w:tcW w:type="dxa" w:w="1300"/>
+            <w:tcW w:type="dxa" w:w="1389"/>
             <w:tcBorders>
               <w:top w:val="single" w:color="D9DCD5" w:sz="4"/>
               <w:left w:val="single" w:color="D9DCD5" w:sz="4"/>
@@ -5255,7 +5255,7 @@
         </w:trPr>
         <w:tc>
           <w:tcPr>
-            <w:tcW w:type="dxa" w:w="3826"/>
+            <w:tcW w:type="dxa" w:w="4085"/>
             <w:tcBorders>
               <w:top w:val="single" w:color="D9DCD5" w:sz="4"/>
               <w:left w:val="single" w:color="D9DCD5" w:sz="4"/>
@@ -5281,7 +5281,7 @@
         </w:tc>
         <w:tc>
           <w:tcPr>
-            <w:tcW w:type="dxa" w:w="1300"/>
+            <w:tcW w:type="dxa" w:w="1388"/>
             <w:tcBorders>
               <w:top w:val="single" w:color="D9DCD5" w:sz="4"/>
               <w:left w:val="single" w:color="D9DCD5" w:sz="4"/>
@@ -5307,7 +5307,7 @@
         </w:tc>
         <w:tc>
           <w:tcPr>
-            <w:tcW w:type="dxa" w:w="1300"/>
+            <w:tcW w:type="dxa" w:w="1388"/>
             <w:tcBorders>
               <w:top w:val="single" w:color="D9DCD5" w:sz="4"/>
               <w:left w:val="single" w:color="D9DCD5" w:sz="4"/>
@@ -5333,7 +5333,7 @@
         </w:tc>
         <w:tc>
           <w:tcPr>
-            <w:tcW w:type="dxa" w:w="1300"/>
+            <w:tcW w:type="dxa" w:w="1388"/>
             <w:tcBorders>
               <w:top w:val="single" w:color="D9DCD5" w:sz="4"/>
               <w:left w:val="single" w:color="D9DCD5" w:sz="4"/>
@@ -5359,7 +5359,7 @@
         </w:tc>
         <w:tc>
           <w:tcPr>
-            <w:tcW w:type="dxa" w:w="1300"/>
+            <w:tcW w:type="dxa" w:w="1389"/>
             <w:tcBorders>
               <w:top w:val="single" w:color="D9DCD5" w:sz="4"/>
               <w:left w:val="single" w:color="D9DCD5" w:sz="4"/>
@@ -5390,7 +5390,7 @@
         </w:trPr>
         <w:tc>
           <w:tcPr>
-            <w:tcW w:type="dxa" w:w="3826"/>
+            <w:tcW w:type="dxa" w:w="4085"/>
             <w:tcBorders>
               <w:top w:val="single" w:color="D9DCD5" w:sz="4"/>
               <w:left w:val="single" w:color="D9DCD5" w:sz="4"/>
@@ -5417,7 +5417,7 @@
         </w:tc>
         <w:tc>
           <w:tcPr>
-            <w:tcW w:type="dxa" w:w="1300"/>
+            <w:tcW w:type="dxa" w:w="1388"/>
             <w:tcBorders>
               <w:top w:val="single" w:color="D9DCD5" w:sz="4"/>
               <w:left w:val="single" w:color="D9DCD5" w:sz="4"/>
@@ -5444,7 +5444,7 @@
         </w:tc>
         <w:tc>
           <w:tcPr>
-            <w:tcW w:type="dxa" w:w="1300"/>
+            <w:tcW w:type="dxa" w:w="1388"/>
             <w:tcBorders>
               <w:top w:val="single" w:color="D9DCD5" w:sz="4"/>
               <w:left w:val="single" w:color="D9DCD5" w:sz="4"/>
@@ -5471,7 +5471,7 @@
         </w:tc>
         <w:tc>
           <w:tcPr>
-            <w:tcW w:type="dxa" w:w="1300"/>
+            <w:tcW w:type="dxa" w:w="1388"/>
             <w:tcBorders>
               <w:top w:val="single" w:color="D9DCD5" w:sz="4"/>
               <w:left w:val="single" w:color="D9DCD5" w:sz="4"/>
@@ -5498,7 +5498,7 @@
         </w:tc>
         <w:tc>
           <w:tcPr>
-            <w:tcW w:type="dxa" w:w="1300"/>
+            <w:tcW w:type="dxa" w:w="1389"/>
             <w:tcBorders>
               <w:top w:val="single" w:color="D9DCD5" w:sz="4"/>
               <w:left w:val="single" w:color="D9DCD5" w:sz="4"/>
@@ -5532,7 +5532,7 @@
     </w:p>
     <w:p>
       <w:pPr>
-        <w:spacing w:after="120" w:line="300"/>
+        <w:spacing w:after="100" w:line="276"/>
       </w:pPr>
       <w:r>
         <w:t xml:space="preserve">Dos hallazgos: un BERT entrenado con tuits (pysentimiento) rinde peor que el modelo simple sobre titulares, porque mide la emoción de quien escribe y no si el hecho es bueno o malo; y la combinación de rasgos propios con BERT supera a cada parte por separado.</w:t>
@@ -5540,7 +5540,7 @@
     </w:p>
     <w:p>
       <w:pPr>
-        <w:spacing w:after="120" w:line="300"/>
+        <w:spacing w:after="100" w:line="276"/>
       </w:pPr>
       <w:r>
         <w:rPr>
@@ -5577,7 +5577,7 @@
     </w:p>
     <w:p>
       <w:pPr>
-        <w:spacing w:after="120" w:line="300"/>
+        <w:spacing w:after="100" w:line="276"/>
       </w:pPr>
       <w:r>
         <w:rPr>
@@ -5592,7 +5592,7 @@
     </w:p>
     <w:p>
       <w:pPr>
-        <w:spacing w:after="120" w:line="300"/>
+        <w:spacing w:after="100" w:line="276"/>
       </w:pPr>
       <w:r>
         <w:rPr>
@@ -5623,7 +5623,7 @@
           <w:ilvl w:val="0"/>
           <w:numId w:val="2"/>
         </w:numPr>
-        <w:spacing w:after="60" w:line="288"/>
+        <w:spacing w:after="40" w:line="264"/>
       </w:pPr>
       <w:r>
         <w:rPr>
@@ -5653,7 +5653,7 @@
           <w:ilvl w:val="0"/>
           <w:numId w:val="2"/>
         </w:numPr>
-        <w:spacing w:after="60" w:line="288"/>
+        <w:spacing w:after="40" w:line="264"/>
       </w:pPr>
       <w:r>
         <w:rPr>
@@ -5673,7 +5673,7 @@
           <w:ilvl w:val="0"/>
           <w:numId w:val="2"/>
         </w:numPr>
-        <w:spacing w:after="60" w:line="288"/>
+        <w:spacing w:after="40" w:line="264"/>
       </w:pPr>
       <w:r>
         <w:rPr>
@@ -5699,7 +5699,7 @@
     </w:p>
     <w:p>
       <w:pPr>
-        <w:spacing w:after="120" w:line="300"/>
+        <w:spacing w:after="100" w:line="276"/>
       </w:pPr>
       <w:r>
         <w:t xml:space="preserve">Cada nota se representa con un </w:t>
@@ -5733,7 +5733,7 @@
           <w:ilvl w:val="0"/>
           <w:numId w:val="2"/>
         </w:numPr>
-        <w:spacing w:after="60" w:line="288"/>
+        <w:spacing w:after="40" w:line="264"/>
       </w:pPr>
       <w:r>
         <w:rPr>
@@ -5753,7 +5753,7 @@
           <w:ilvl w:val="0"/>
           <w:numId w:val="2"/>
         </w:numPr>
-        <w:spacing w:after="60" w:line="288"/>
+        <w:spacing w:after="40" w:line="264"/>
       </w:pPr>
       <w:r>
         <w:rPr>
@@ -5779,7 +5779,7 @@
     </w:p>
     <w:p>
       <w:pPr>
-        <w:spacing w:after="120" w:line="300"/>
+        <w:spacing w:after="100" w:line="276"/>
       </w:pPr>
       <w:r>
         <w:t xml:space="preserve">Es el modelo vectorial de la clase llevado a un espacio denso: la similitud coseno sigue siendo la medida, pero los vectores capturan significado y no solo palabras compartidas.</w:t>
@@ -5798,7 +5798,7 @@
     </w:p>
     <w:p>
       <w:pPr>
-        <w:spacing w:after="120" w:line="300"/>
+        <w:spacing w:after="100" w:line="276"/>
       </w:pPr>
       <w:r>
         <w:t xml:space="preserve">Además de clasificar cada nota, el sistema compara a los medios entre sí:</w:t>
@@ -5811,7 +5811,7 @@
           <w:ilvl w:val="0"/>
           <w:numId w:val="2"/>
         </w:numPr>
-        <w:spacing w:after="60" w:line="288"/>
+        <w:spacing w:after="40" w:line="264"/>
       </w:pPr>
       <w:r>
         <w:rPr>
@@ -5831,7 +5831,7 @@
           <w:ilvl w:val="0"/>
           <w:numId w:val="2"/>
         </w:numPr>
-        <w:spacing w:after="60" w:line="288"/>
+        <w:spacing w:after="40" w:line="264"/>
       </w:pPr>
       <w:r>
         <w:rPr>
@@ -5851,7 +5851,7 @@
           <w:ilvl w:val="0"/>
           <w:numId w:val="2"/>
         </w:numPr>
-        <w:spacing w:after="60" w:line="288"/>
+        <w:spacing w:after="40" w:line="264"/>
       </w:pPr>
       <w:r>
         <w:rPr>
@@ -5871,7 +5871,7 @@
           <w:ilvl w:val="0"/>
           <w:numId w:val="2"/>
         </w:numPr>
-        <w:spacing w:after="60" w:line="288"/>
+        <w:spacing w:after="40" w:line="264"/>
       </w:pPr>
       <w:r>
         <w:rPr>
@@ -5891,7 +5891,7 @@
           <w:ilvl w:val="0"/>
           <w:numId w:val="2"/>
         </w:numPr>
-        <w:spacing w:after="60" w:line="288"/>
+        <w:spacing w:after="40" w:line="264"/>
       </w:pPr>
       <w:r>
         <w:rPr>
@@ -5921,7 +5921,7 @@
           <w:ilvl w:val="0"/>
           <w:numId w:val="2"/>
         </w:numPr>
-        <w:spacing w:after="60" w:line="288"/>
+        <w:spacing w:after="40" w:line="264"/>
       </w:pPr>
       <w:r>
         <w:rPr>
@@ -5948,7 +5948,7 @@
       <w:pPr>
         <w:pStyle w:val="Heading1"/>
         <w:keepNext/>
-        <w:spacing w:after="200" w:before="360"/>
+        <w:spacing w:after="140" w:before="300"/>
       </w:pPr>
       <w:bookmarkStart w:name="_Toc24" w:id="24"/>
       <w:r>
@@ -5958,7 +5958,7 @@
     </w:p>
     <w:p>
       <w:pPr>
-        <w:spacing w:after="120" w:line="300"/>
+        <w:spacing w:after="100" w:line="276"/>
       </w:pPr>
       <w:r>
         <w:t xml:space="preserve">La base es un archivo </w:t>
@@ -5987,7 +5987,7 @@
     </w:p>
     <w:tbl>
       <w:tblPr>
-        <w:tblW w:type="dxa" w:w="9026"/>
+        <w:tblW w:type="dxa" w:w="9638"/>
         <w:tblBorders>
           <w:top w:val="single" w:color="auto" w:sz="4"/>
           <w:left w:val="single" w:color="auto" w:sz="4"/>
@@ -5998,8 +5998,8 @@
         </w:tblBorders>
       </w:tblPr>
       <w:tblGrid>
-        <w:gridCol w:w="1600"/>
-        <w:gridCol w:w="7426"/>
+        <w:gridCol w:w="1708"/>
+        <w:gridCol w:w="7930"/>
       </w:tblGrid>
       <w:tr>
         <w:trPr>
@@ -6007,7 +6007,7 @@
         </w:trPr>
         <w:tc>
           <w:tcPr>
-            <w:tcW w:type="dxa" w:w="1600"/>
+            <w:tcW w:type="dxa" w:w="1708"/>
             <w:tcBorders>
               <w:top w:val="single" w:color="D9DCD5" w:sz="4"/>
               <w:left w:val="single" w:color="D9DCD5" w:sz="4"/>
@@ -6037,7 +6037,7 @@
         </w:tc>
         <w:tc>
           <w:tcPr>
-            <w:tcW w:type="dxa" w:w="7426"/>
+            <w:tcW w:type="dxa" w:w="7930"/>
             <w:tcBorders>
               <w:top w:val="single" w:color="D9DCD5" w:sz="4"/>
               <w:left w:val="single" w:color="D9DCD5" w:sz="4"/>
@@ -6072,7 +6072,7 @@
         </w:trPr>
         <w:tc>
           <w:tcPr>
-            <w:tcW w:type="dxa" w:w="1600"/>
+            <w:tcW w:type="dxa" w:w="1708"/>
             <w:tcBorders>
               <w:top w:val="single" w:color="D9DCD5" w:sz="4"/>
               <w:left w:val="single" w:color="D9DCD5" w:sz="4"/>
@@ -6098,7 +6098,7 @@
         </w:tc>
         <w:tc>
           <w:tcPr>
-            <w:tcW w:type="dxa" w:w="7426"/>
+            <w:tcW w:type="dxa" w:w="7930"/>
             <w:tcBorders>
               <w:top w:val="single" w:color="D9DCD5" w:sz="4"/>
               <w:left w:val="single" w:color="D9DCD5" w:sz="4"/>
@@ -6129,7 +6129,7 @@
         </w:trPr>
         <w:tc>
           <w:tcPr>
-            <w:tcW w:type="dxa" w:w="1600"/>
+            <w:tcW w:type="dxa" w:w="1708"/>
             <w:tcBorders>
               <w:top w:val="single" w:color="D9DCD5" w:sz="4"/>
               <w:left w:val="single" w:color="D9DCD5" w:sz="4"/>
@@ -6156,7 +6156,7 @@
         </w:tc>
         <w:tc>
           <w:tcPr>
-            <w:tcW w:type="dxa" w:w="7426"/>
+            <w:tcW w:type="dxa" w:w="7930"/>
             <w:tcBorders>
               <w:top w:val="single" w:color="D9DCD5" w:sz="4"/>
               <w:left w:val="single" w:color="D9DCD5" w:sz="4"/>
@@ -6188,7 +6188,7 @@
         </w:trPr>
         <w:tc>
           <w:tcPr>
-            <w:tcW w:type="dxa" w:w="1600"/>
+            <w:tcW w:type="dxa" w:w="1708"/>
             <w:tcBorders>
               <w:top w:val="single" w:color="D9DCD5" w:sz="4"/>
               <w:left w:val="single" w:color="D9DCD5" w:sz="4"/>
@@ -6214,7 +6214,7 @@
         </w:tc>
         <w:tc>
           <w:tcPr>
-            <w:tcW w:type="dxa" w:w="7426"/>
+            <w:tcW w:type="dxa" w:w="7930"/>
             <w:tcBorders>
               <w:top w:val="single" w:color="D9DCD5" w:sz="4"/>
               <w:left w:val="single" w:color="D9DCD5" w:sz="4"/>
@@ -6245,7 +6245,7 @@
         </w:trPr>
         <w:tc>
           <w:tcPr>
-            <w:tcW w:type="dxa" w:w="1600"/>
+            <w:tcW w:type="dxa" w:w="1708"/>
             <w:tcBorders>
               <w:top w:val="single" w:color="D9DCD5" w:sz="4"/>
               <w:left w:val="single" w:color="D9DCD5" w:sz="4"/>
@@ -6272,7 +6272,7 @@
         </w:tc>
         <w:tc>
           <w:tcPr>
-            <w:tcW w:type="dxa" w:w="7426"/>
+            <w:tcW w:type="dxa" w:w="7930"/>
             <w:tcBorders>
               <w:top w:val="single" w:color="D9DCD5" w:sz="4"/>
               <w:left w:val="single" w:color="D9DCD5" w:sz="4"/>
@@ -6304,7 +6304,7 @@
         </w:trPr>
         <w:tc>
           <w:tcPr>
-            <w:tcW w:type="dxa" w:w="1600"/>
+            <w:tcW w:type="dxa" w:w="1708"/>
             <w:tcBorders>
               <w:top w:val="single" w:color="D9DCD5" w:sz="4"/>
               <w:left w:val="single" w:color="D9DCD5" w:sz="4"/>
@@ -6330,7 +6330,7 @@
         </w:tc>
         <w:tc>
           <w:tcPr>
-            <w:tcW w:type="dxa" w:w="7426"/>
+            <w:tcW w:type="dxa" w:w="7930"/>
             <w:tcBorders>
               <w:top w:val="single" w:color="D9DCD5" w:sz="4"/>
               <w:left w:val="single" w:color="D9DCD5" w:sz="4"/>
@@ -6361,7 +6361,7 @@
         </w:trPr>
         <w:tc>
           <w:tcPr>
-            <w:tcW w:type="dxa" w:w="1600"/>
+            <w:tcW w:type="dxa" w:w="1708"/>
             <w:tcBorders>
               <w:top w:val="single" w:color="D9DCD5" w:sz="4"/>
               <w:left w:val="single" w:color="D9DCD5" w:sz="4"/>
@@ -6388,7 +6388,7 @@
         </w:tc>
         <w:tc>
           <w:tcPr>
-            <w:tcW w:type="dxa" w:w="7426"/>
+            <w:tcW w:type="dxa" w:w="7930"/>
             <w:tcBorders>
               <w:top w:val="single" w:color="D9DCD5" w:sz="4"/>
               <w:left w:val="single" w:color="D9DCD5" w:sz="4"/>
@@ -6438,7 +6438,7 @@
           <w:ilvl w:val="0"/>
           <w:numId w:val="2"/>
         </w:numPr>
-        <w:spacing w:after="60" w:line="288"/>
+        <w:spacing w:after="40" w:line="264"/>
       </w:pPr>
       <w:r>
         <w:rPr>
@@ -6468,7 +6468,7 @@
           <w:ilvl w:val="0"/>
           <w:numId w:val="2"/>
         </w:numPr>
-        <w:spacing w:after="60" w:line="288"/>
+        <w:spacing w:after="40" w:line="264"/>
       </w:pPr>
       <w:r>
         <w:rPr>
@@ -6488,7 +6488,7 @@
           <w:ilvl w:val="0"/>
           <w:numId w:val="2"/>
         </w:numPr>
-        <w:spacing w:after="60" w:line="288"/>
+        <w:spacing w:after="40" w:line="264"/>
       </w:pPr>
       <w:r>
         <w:rPr>
@@ -6530,7 +6530,7 @@
           <w:ilvl w:val="0"/>
           <w:numId w:val="2"/>
         </w:numPr>
-        <w:spacing w:after="60" w:line="288"/>
+        <w:spacing w:after="40" w:line="264"/>
       </w:pPr>
       <w:r>
         <w:rPr>
@@ -6558,7 +6558,7 @@
       <w:pPr>
         <w:pStyle w:val="Heading1"/>
         <w:keepNext/>
-        <w:spacing w:after="200" w:before="360"/>
+        <w:spacing w:after="140" w:before="300"/>
       </w:pPr>
       <w:bookmarkStart w:name="_Toc26" w:id="26"/>
       <w:r>
@@ -6568,7 +6568,7 @@
     </w:p>
     <w:tbl>
       <w:tblPr>
-        <w:tblW w:type="dxa" w:w="9026"/>
+        <w:tblW w:type="dxa" w:w="9638"/>
         <w:tblBorders>
           <w:top w:val="single" w:color="auto" w:sz="4"/>
           <w:left w:val="single" w:color="auto" w:sz="4"/>
@@ -6579,9 +6579,9 @@
         </w:tblBorders>
       </w:tblPr>
       <w:tblGrid>
-        <w:gridCol w:w="1900"/>
-        <w:gridCol w:w="5026"/>
-        <w:gridCol w:w="2100"/>
+        <w:gridCol w:w="2029"/>
+        <w:gridCol w:w="5367"/>
+        <w:gridCol w:w="2242"/>
       </w:tblGrid>
       <w:tr>
         <w:trPr>
@@ -6589,7 +6589,7 @@
         </w:trPr>
         <w:tc>
           <w:tcPr>
-            <w:tcW w:type="dxa" w:w="1900"/>
+            <w:tcW w:type="dxa" w:w="2029"/>
             <w:tcBorders>
               <w:top w:val="single" w:color="D9DCD5" w:sz="4"/>
               <w:left w:val="single" w:color="D9DCD5" w:sz="4"/>
@@ -6619,7 +6619,7 @@
         </w:tc>
         <w:tc>
           <w:tcPr>
-            <w:tcW w:type="dxa" w:w="5026"/>
+            <w:tcW w:type="dxa" w:w="5367"/>
             <w:tcBorders>
               <w:top w:val="single" w:color="D9DCD5" w:sz="4"/>
               <w:left w:val="single" w:color="D9DCD5" w:sz="4"/>
@@ -6649,7 +6649,7 @@
         </w:tc>
         <w:tc>
           <w:tcPr>
-            <w:tcW w:type="dxa" w:w="2100"/>
+            <w:tcW w:type="dxa" w:w="2242"/>
             <w:tcBorders>
               <w:top w:val="single" w:color="D9DCD5" w:sz="4"/>
               <w:left w:val="single" w:color="D9DCD5" w:sz="4"/>
@@ -6684,7 +6684,7 @@
         </w:trPr>
         <w:tc>
           <w:tcPr>
-            <w:tcW w:type="dxa" w:w="1900"/>
+            <w:tcW w:type="dxa" w:w="2029"/>
             <w:tcBorders>
               <w:top w:val="single" w:color="D9DCD5" w:sz="4"/>
               <w:left w:val="single" w:color="D9DCD5" w:sz="4"/>
@@ -6710,7 +6710,7 @@
         </w:tc>
         <w:tc>
           <w:tcPr>
-            <w:tcW w:type="dxa" w:w="5026"/>
+            <w:tcW w:type="dxa" w:w="5367"/>
             <w:tcBorders>
               <w:top w:val="single" w:color="D9DCD5" w:sz="4"/>
               <w:left w:val="single" w:color="D9DCD5" w:sz="4"/>
@@ -6736,7 +6736,7 @@
         </w:tc>
         <w:tc>
           <w:tcPr>
-            <w:tcW w:type="dxa" w:w="2100"/>
+            <w:tcW w:type="dxa" w:w="2242"/>
             <w:tcBorders>
               <w:top w:val="single" w:color="D9DCD5" w:sz="4"/>
               <w:left w:val="single" w:color="D9DCD5" w:sz="4"/>
@@ -6767,7 +6767,7 @@
         </w:trPr>
         <w:tc>
           <w:tcPr>
-            <w:tcW w:type="dxa" w:w="1900"/>
+            <w:tcW w:type="dxa" w:w="2029"/>
             <w:tcBorders>
               <w:top w:val="single" w:color="D9DCD5" w:sz="4"/>
               <w:left w:val="single" w:color="D9DCD5" w:sz="4"/>
@@ -6794,7 +6794,7 @@
         </w:tc>
         <w:tc>
           <w:tcPr>
-            <w:tcW w:type="dxa" w:w="5026"/>
+            <w:tcW w:type="dxa" w:w="5367"/>
             <w:tcBorders>
               <w:top w:val="single" w:color="D9DCD5" w:sz="4"/>
               <w:left w:val="single" w:color="D9DCD5" w:sz="4"/>
@@ -6821,7 +6821,7 @@
         </w:tc>
         <w:tc>
           <w:tcPr>
-            <w:tcW w:type="dxa" w:w="2100"/>
+            <w:tcW w:type="dxa" w:w="2242"/>
             <w:tcBorders>
               <w:top w:val="single" w:color="D9DCD5" w:sz="4"/>
               <w:left w:val="single" w:color="D9DCD5" w:sz="4"/>
@@ -6853,7 +6853,7 @@
         </w:trPr>
         <w:tc>
           <w:tcPr>
-            <w:tcW w:type="dxa" w:w="1900"/>
+            <w:tcW w:type="dxa" w:w="2029"/>
             <w:tcBorders>
               <w:top w:val="single" w:color="D9DCD5" w:sz="4"/>
               <w:left w:val="single" w:color="D9DCD5" w:sz="4"/>
@@ -6879,7 +6879,7 @@
         </w:tc>
         <w:tc>
           <w:tcPr>
-            <w:tcW w:type="dxa" w:w="5026"/>
+            <w:tcW w:type="dxa" w:w="5367"/>
             <w:tcBorders>
               <w:top w:val="single" w:color="D9DCD5" w:sz="4"/>
               <w:left w:val="single" w:color="D9DCD5" w:sz="4"/>
@@ -6905,7 +6905,7 @@
         </w:tc>
         <w:tc>
           <w:tcPr>
-            <w:tcW w:type="dxa" w:w="2100"/>
+            <w:tcW w:type="dxa" w:w="2242"/>
             <w:tcBorders>
               <w:top w:val="single" w:color="D9DCD5" w:sz="4"/>
               <w:left w:val="single" w:color="D9DCD5" w:sz="4"/>
@@ -6936,7 +6936,7 @@
         </w:trPr>
         <w:tc>
           <w:tcPr>
-            <w:tcW w:type="dxa" w:w="1900"/>
+            <w:tcW w:type="dxa" w:w="2029"/>
             <w:tcBorders>
               <w:top w:val="single" w:color="D9DCD5" w:sz="4"/>
               <w:left w:val="single" w:color="D9DCD5" w:sz="4"/>
@@ -6963,7 +6963,7 @@
         </w:tc>
         <w:tc>
           <w:tcPr>
-            <w:tcW w:type="dxa" w:w="5026"/>
+            <w:tcW w:type="dxa" w:w="5367"/>
             <w:tcBorders>
               <w:top w:val="single" w:color="D9DCD5" w:sz="4"/>
               <w:left w:val="single" w:color="D9DCD5" w:sz="4"/>
@@ -6990,7 +6990,7 @@
         </w:tc>
         <w:tc>
           <w:tcPr>
-            <w:tcW w:type="dxa" w:w="2100"/>
+            <w:tcW w:type="dxa" w:w="2242"/>
             <w:tcBorders>
               <w:top w:val="single" w:color="D9DCD5" w:sz="4"/>
               <w:left w:val="single" w:color="D9DCD5" w:sz="4"/>
@@ -7022,7 +7022,7 @@
         </w:trPr>
         <w:tc>
           <w:tcPr>
-            <w:tcW w:type="dxa" w:w="1900"/>
+            <w:tcW w:type="dxa" w:w="2029"/>
             <w:tcBorders>
               <w:top w:val="single" w:color="D9DCD5" w:sz="4"/>
               <w:left w:val="single" w:color="D9DCD5" w:sz="4"/>
@@ -7048,7 +7048,7 @@
         </w:tc>
         <w:tc>
           <w:tcPr>
-            <w:tcW w:type="dxa" w:w="5026"/>
+            <w:tcW w:type="dxa" w:w="5367"/>
             <w:tcBorders>
               <w:top w:val="single" w:color="D9DCD5" w:sz="4"/>
               <w:left w:val="single" w:color="D9DCD5" w:sz="4"/>
@@ -7074,7 +7074,7 @@
         </w:tc>
         <w:tc>
           <w:tcPr>
-            <w:tcW w:type="dxa" w:w="2100"/>
+            <w:tcW w:type="dxa" w:w="2242"/>
             <w:tcBorders>
               <w:top w:val="single" w:color="D9DCD5" w:sz="4"/>
               <w:left w:val="single" w:color="D9DCD5" w:sz="4"/>
@@ -7105,7 +7105,7 @@
         </w:trPr>
         <w:tc>
           <w:tcPr>
-            <w:tcW w:type="dxa" w:w="1900"/>
+            <w:tcW w:type="dxa" w:w="2029"/>
             <w:tcBorders>
               <w:top w:val="single" w:color="D9DCD5" w:sz="4"/>
               <w:left w:val="single" w:color="D9DCD5" w:sz="4"/>
@@ -7132,7 +7132,7 @@
         </w:tc>
         <w:tc>
           <w:tcPr>
-            <w:tcW w:type="dxa" w:w="5026"/>
+            <w:tcW w:type="dxa" w:w="5367"/>
             <w:tcBorders>
               <w:top w:val="single" w:color="D9DCD5" w:sz="4"/>
               <w:left w:val="single" w:color="D9DCD5" w:sz="4"/>
@@ -7159,7 +7159,7 @@
         </w:tc>
         <w:tc>
           <w:tcPr>
-            <w:tcW w:type="dxa" w:w="2100"/>
+            <w:tcW w:type="dxa" w:w="2242"/>
             <w:tcBorders>
               <w:top w:val="single" w:color="D9DCD5" w:sz="4"/>
               <w:left w:val="single" w:color="D9DCD5" w:sz="4"/>
@@ -7191,7 +7191,7 @@
         </w:trPr>
         <w:tc>
           <w:tcPr>
-            <w:tcW w:type="dxa" w:w="1900"/>
+            <w:tcW w:type="dxa" w:w="2029"/>
             <w:tcBorders>
               <w:top w:val="single" w:color="D9DCD5" w:sz="4"/>
               <w:left w:val="single" w:color="D9DCD5" w:sz="4"/>
@@ -7217,7 +7217,7 @@
         </w:tc>
         <w:tc>
           <w:tcPr>
-            <w:tcW w:type="dxa" w:w="5026"/>
+            <w:tcW w:type="dxa" w:w="5367"/>
             <w:tcBorders>
               <w:top w:val="single" w:color="D9DCD5" w:sz="4"/>
               <w:left w:val="single" w:color="D9DCD5" w:sz="4"/>
@@ -7243,7 +7243,7 @@
         </w:tc>
         <w:tc>
           <w:tcPr>
-            <w:tcW w:type="dxa" w:w="2100"/>
+            <w:tcW w:type="dxa" w:w="2242"/>
             <w:tcBorders>
               <w:top w:val="single" w:color="D9DCD5" w:sz="4"/>
               <w:left w:val="single" w:color="D9DCD5" w:sz="4"/>
@@ -7274,7 +7274,7 @@
         </w:trPr>
         <w:tc>
           <w:tcPr>
-            <w:tcW w:type="dxa" w:w="1900"/>
+            <w:tcW w:type="dxa" w:w="2029"/>
             <w:tcBorders>
               <w:top w:val="single" w:color="D9DCD5" w:sz="4"/>
               <w:left w:val="single" w:color="D9DCD5" w:sz="4"/>
@@ -7301,7 +7301,7 @@
         </w:tc>
         <w:tc>
           <w:tcPr>
-            <w:tcW w:type="dxa" w:w="5026"/>
+            <w:tcW w:type="dxa" w:w="5367"/>
             <w:tcBorders>
               <w:top w:val="single" w:color="D9DCD5" w:sz="4"/>
               <w:left w:val="single" w:color="D9DCD5" w:sz="4"/>
@@ -7328,7 +7328,7 @@
         </w:tc>
         <w:tc>
           <w:tcPr>
-            <w:tcW w:type="dxa" w:w="2100"/>
+            <w:tcW w:type="dxa" w:w="2242"/>
             <w:tcBorders>
               <w:top w:val="single" w:color="D9DCD5" w:sz="4"/>
               <w:left w:val="single" w:color="D9DCD5" w:sz="4"/>
@@ -7360,7 +7360,7 @@
         </w:trPr>
         <w:tc>
           <w:tcPr>
-            <w:tcW w:type="dxa" w:w="1900"/>
+            <w:tcW w:type="dxa" w:w="2029"/>
             <w:tcBorders>
               <w:top w:val="single" w:color="D9DCD5" w:sz="4"/>
               <w:left w:val="single" w:color="D9DCD5" w:sz="4"/>
@@ -7386,7 +7386,7 @@
         </w:tc>
         <w:tc>
           <w:tcPr>
-            <w:tcW w:type="dxa" w:w="5026"/>
+            <w:tcW w:type="dxa" w:w="5367"/>
             <w:tcBorders>
               <w:top w:val="single" w:color="D9DCD5" w:sz="4"/>
               <w:left w:val="single" w:color="D9DCD5" w:sz="4"/>
@@ -7412,7 +7412,7 @@
         </w:tc>
         <w:tc>
           <w:tcPr>
-            <w:tcW w:type="dxa" w:w="2100"/>
+            <w:tcW w:type="dxa" w:w="2242"/>
             <w:tcBorders>
               <w:top w:val="single" w:color="D9DCD5" w:sz="4"/>
               <w:left w:val="single" w:color="D9DCD5" w:sz="4"/>
@@ -7443,7 +7443,7 @@
         </w:trPr>
         <w:tc>
           <w:tcPr>
-            <w:tcW w:type="dxa" w:w="1900"/>
+            <w:tcW w:type="dxa" w:w="2029"/>
             <w:tcBorders>
               <w:top w:val="single" w:color="D9DCD5" w:sz="4"/>
               <w:left w:val="single" w:color="D9DCD5" w:sz="4"/>
@@ -7470,7 +7470,7 @@
         </w:tc>
         <w:tc>
           <w:tcPr>
-            <w:tcW w:type="dxa" w:w="5026"/>
+            <w:tcW w:type="dxa" w:w="5367"/>
             <w:tcBorders>
               <w:top w:val="single" w:color="D9DCD5" w:sz="4"/>
               <w:left w:val="single" w:color="D9DCD5" w:sz="4"/>
@@ -7497,7 +7497,7 @@
         </w:tc>
         <w:tc>
           <w:tcPr>
-            <w:tcW w:type="dxa" w:w="2100"/>
+            <w:tcW w:type="dxa" w:w="2242"/>
             <w:tcBorders>
               <w:top w:val="single" w:color="D9DCD5" w:sz="4"/>
               <w:left w:val="single" w:color="D9DCD5" w:sz="4"/>
@@ -7529,7 +7529,7 @@
         </w:trPr>
         <w:tc>
           <w:tcPr>
-            <w:tcW w:type="dxa" w:w="1900"/>
+            <w:tcW w:type="dxa" w:w="2029"/>
             <w:tcBorders>
               <w:top w:val="single" w:color="D9DCD5" w:sz="4"/>
               <w:left w:val="single" w:color="D9DCD5" w:sz="4"/>
@@ -7555,7 +7555,7 @@
         </w:tc>
         <w:tc>
           <w:tcPr>
-            <w:tcW w:type="dxa" w:w="5026"/>
+            <w:tcW w:type="dxa" w:w="5367"/>
             <w:tcBorders>
               <w:top w:val="single" w:color="D9DCD5" w:sz="4"/>
               <w:left w:val="single" w:color="D9DCD5" w:sz="4"/>
@@ -7581,7 +7581,7 @@
         </w:tc>
         <w:tc>
           <w:tcPr>
-            <w:tcW w:type="dxa" w:w="2100"/>
+            <w:tcW w:type="dxa" w:w="2242"/>
             <w:tcBorders>
               <w:top w:val="single" w:color="D9DCD5" w:sz="4"/>
               <w:left w:val="single" w:color="D9DCD5" w:sz="4"/>
@@ -7612,7 +7612,7 @@
         </w:trPr>
         <w:tc>
           <w:tcPr>
-            <w:tcW w:type="dxa" w:w="1900"/>
+            <w:tcW w:type="dxa" w:w="2029"/>
             <w:tcBorders>
               <w:top w:val="single" w:color="D9DCD5" w:sz="4"/>
               <w:left w:val="single" w:color="D9DCD5" w:sz="4"/>
@@ -7639,7 +7639,7 @@
         </w:tc>
         <w:tc>
           <w:tcPr>
-            <w:tcW w:type="dxa" w:w="5026"/>
+            <w:tcW w:type="dxa" w:w="5367"/>
             <w:tcBorders>
               <w:top w:val="single" w:color="D9DCD5" w:sz="4"/>
               <w:left w:val="single" w:color="D9DCD5" w:sz="4"/>
@@ -7666,7 +7666,7 @@
         </w:tc>
         <w:tc>
           <w:tcPr>
-            <w:tcW w:type="dxa" w:w="2100"/>
+            <w:tcW w:type="dxa" w:w="2242"/>
             <w:tcBorders>
               <w:top w:val="single" w:color="D9DCD5" w:sz="4"/>
               <w:left w:val="single" w:color="D9DCD5" w:sz="4"/>
@@ -7698,7 +7698,7 @@
         </w:trPr>
         <w:tc>
           <w:tcPr>
-            <w:tcW w:type="dxa" w:w="1900"/>
+            <w:tcW w:type="dxa" w:w="2029"/>
             <w:tcBorders>
               <w:top w:val="single" w:color="D9DCD5" w:sz="4"/>
               <w:left w:val="single" w:color="D9DCD5" w:sz="4"/>
@@ -7724,7 +7724,7 @@
         </w:tc>
         <w:tc>
           <w:tcPr>
-            <w:tcW w:type="dxa" w:w="5026"/>
+            <w:tcW w:type="dxa" w:w="5367"/>
             <w:tcBorders>
               <w:top w:val="single" w:color="D9DCD5" w:sz="4"/>
               <w:left w:val="single" w:color="D9DCD5" w:sz="4"/>
@@ -7750,7 +7750,7 @@
         </w:tc>
         <w:tc>
           <w:tcPr>
-            <w:tcW w:type="dxa" w:w="2100"/>
+            <w:tcW w:type="dxa" w:w="2242"/>
             <w:tcBorders>
               <w:top w:val="single" w:color="D9DCD5" w:sz="4"/>
               <w:left w:val="single" w:color="D9DCD5" w:sz="4"/>
@@ -7781,7 +7781,7 @@
         </w:trPr>
         <w:tc>
           <w:tcPr>
-            <w:tcW w:type="dxa" w:w="1900"/>
+            <w:tcW w:type="dxa" w:w="2029"/>
             <w:tcBorders>
               <w:top w:val="single" w:color="D9DCD5" w:sz="4"/>
               <w:left w:val="single" w:color="D9DCD5" w:sz="4"/>
@@ -7808,7 +7808,7 @@
         </w:tc>
         <w:tc>
           <w:tcPr>
-            <w:tcW w:type="dxa" w:w="5026"/>
+            <w:tcW w:type="dxa" w:w="5367"/>
             <w:tcBorders>
               <w:top w:val="single" w:color="D9DCD5" w:sz="4"/>
               <w:left w:val="single" w:color="D9DCD5" w:sz="4"/>
@@ -7835,7 +7835,7 @@
         </w:tc>
         <w:tc>
           <w:tcPr>
-            <w:tcW w:type="dxa" w:w="2100"/>
+            <w:tcW w:type="dxa" w:w="2242"/>
             <w:tcBorders>
               <w:top w:val="single" w:color="D9DCD5" w:sz="4"/>
               <w:left w:val="single" w:color="D9DCD5" w:sz="4"/>
@@ -7867,7 +7867,7 @@
         </w:trPr>
         <w:tc>
           <w:tcPr>
-            <w:tcW w:type="dxa" w:w="1900"/>
+            <w:tcW w:type="dxa" w:w="2029"/>
             <w:tcBorders>
               <w:top w:val="single" w:color="D9DCD5" w:sz="4"/>
               <w:left w:val="single" w:color="D9DCD5" w:sz="4"/>
@@ -7893,7 +7893,7 @@
         </w:tc>
         <w:tc>
           <w:tcPr>
-            <w:tcW w:type="dxa" w:w="5026"/>
+            <w:tcW w:type="dxa" w:w="5367"/>
             <w:tcBorders>
               <w:top w:val="single" w:color="D9DCD5" w:sz="4"/>
               <w:left w:val="single" w:color="D9DCD5" w:sz="4"/>
@@ -7919,7 +7919,7 @@
         </w:tc>
         <w:tc>
           <w:tcPr>
-            <w:tcW w:type="dxa" w:w="2100"/>
+            <w:tcW w:type="dxa" w:w="2242"/>
             <w:tcBorders>
               <w:top w:val="single" w:color="D9DCD5" w:sz="4"/>
               <w:left w:val="single" w:color="D9DCD5" w:sz="4"/>
@@ -7950,7 +7950,7 @@
         </w:trPr>
         <w:tc>
           <w:tcPr>
-            <w:tcW w:type="dxa" w:w="1900"/>
+            <w:tcW w:type="dxa" w:w="2029"/>
             <w:tcBorders>
               <w:top w:val="single" w:color="D9DCD5" w:sz="4"/>
               <w:left w:val="single" w:color="D9DCD5" w:sz="4"/>
@@ -7977,7 +7977,7 @@
         </w:tc>
         <w:tc>
           <w:tcPr>
-            <w:tcW w:type="dxa" w:w="5026"/>
+            <w:tcW w:type="dxa" w:w="5367"/>
             <w:tcBorders>
               <w:top w:val="single" w:color="D9DCD5" w:sz="4"/>
               <w:left w:val="single" w:color="D9DCD5" w:sz="4"/>
@@ -8004,7 +8004,7 @@
         </w:tc>
         <w:tc>
           <w:tcPr>
-            <w:tcW w:type="dxa" w:w="2100"/>
+            <w:tcW w:type="dxa" w:w="2242"/>
             <w:tcBorders>
               <w:top w:val="single" w:color="D9DCD5" w:sz="4"/>
               <w:left w:val="single" w:color="D9DCD5" w:sz="4"/>
@@ -8035,7 +8035,7 @@
       <w:pPr>
         <w:pStyle w:val="Heading1"/>
         <w:keepNext/>
-        <w:spacing w:after="200" w:before="360"/>
+        <w:spacing w:after="140" w:before="300"/>
       </w:pPr>
       <w:bookmarkStart w:name="_Toc27" w:id="27"/>
       <w:r>
@@ -8045,7 +8045,7 @@
     </w:p>
     <w:p>
       <w:pPr>
-        <w:spacing w:after="120" w:line="300"/>
+        <w:spacing w:after="100" w:line="276"/>
       </w:pPr>
       <w:r>
         <w:t xml:space="preserve">El tablero es una página estática generada en cada corrida (</w:t>
@@ -8064,7 +8064,7 @@
     </w:p>
     <w:tbl>
       <w:tblPr>
-        <w:tblW w:type="dxa" w:w="9026"/>
+        <w:tblW w:type="dxa" w:w="9638"/>
         <w:tblBorders>
           <w:top w:val="single" w:color="auto" w:sz="4"/>
           <w:left w:val="single" w:color="auto" w:sz="4"/>
@@ -8075,8 +8075,8 @@
         </w:tblBorders>
       </w:tblPr>
       <w:tblGrid>
-        <w:gridCol w:w="1900"/>
-        <w:gridCol w:w="7126"/>
+        <w:gridCol w:w="2029"/>
+        <w:gridCol w:w="7609"/>
       </w:tblGrid>
       <w:tr>
         <w:trPr>
@@ -8084,7 +8084,7 @@
         </w:trPr>
         <w:tc>
           <w:tcPr>
-            <w:tcW w:type="dxa" w:w="1900"/>
+            <w:tcW w:type="dxa" w:w="2029"/>
             <w:tcBorders>
               <w:top w:val="single" w:color="D9DCD5" w:sz="4"/>
               <w:left w:val="single" w:color="D9DCD5" w:sz="4"/>
@@ -8114,7 +8114,7 @@
         </w:tc>
         <w:tc>
           <w:tcPr>
-            <w:tcW w:type="dxa" w:w="7126"/>
+            <w:tcW w:type="dxa" w:w="7609"/>
             <w:tcBorders>
               <w:top w:val="single" w:color="D9DCD5" w:sz="4"/>
               <w:left w:val="single" w:color="D9DCD5" w:sz="4"/>
@@ -8149,7 +8149,7 @@
         </w:trPr>
         <w:tc>
           <w:tcPr>
-            <w:tcW w:type="dxa" w:w="1900"/>
+            <w:tcW w:type="dxa" w:w="2029"/>
             <w:tcBorders>
               <w:top w:val="single" w:color="D9DCD5" w:sz="4"/>
               <w:left w:val="single" w:color="D9DCD5" w:sz="4"/>
@@ -8175,7 +8175,7 @@
         </w:tc>
         <w:tc>
           <w:tcPr>
-            <w:tcW w:type="dxa" w:w="7126"/>
+            <w:tcW w:type="dxa" w:w="7609"/>
             <w:tcBorders>
               <w:top w:val="single" w:color="D9DCD5" w:sz="4"/>
               <w:left w:val="single" w:color="D9DCD5" w:sz="4"/>
@@ -8206,7 +8206,7 @@
         </w:trPr>
         <w:tc>
           <w:tcPr>
-            <w:tcW w:type="dxa" w:w="1900"/>
+            <w:tcW w:type="dxa" w:w="2029"/>
             <w:tcBorders>
               <w:top w:val="single" w:color="D9DCD5" w:sz="4"/>
               <w:left w:val="single" w:color="D9DCD5" w:sz="4"/>
@@ -8233,7 +8233,7 @@
         </w:tc>
         <w:tc>
           <w:tcPr>
-            <w:tcW w:type="dxa" w:w="7126"/>
+            <w:tcW w:type="dxa" w:w="7609"/>
             <w:tcBorders>
               <w:top w:val="single" w:color="D9DCD5" w:sz="4"/>
               <w:left w:val="single" w:color="D9DCD5" w:sz="4"/>
@@ -8265,7 +8265,7 @@
         </w:trPr>
         <w:tc>
           <w:tcPr>
-            <w:tcW w:type="dxa" w:w="1900"/>
+            <w:tcW w:type="dxa" w:w="2029"/>
             <w:tcBorders>
               <w:top w:val="single" w:color="D9DCD5" w:sz="4"/>
               <w:left w:val="single" w:color="D9DCD5" w:sz="4"/>
@@ -8291,7 +8291,7 @@
         </w:tc>
         <w:tc>
           <w:tcPr>
-            <w:tcW w:type="dxa" w:w="7126"/>
+            <w:tcW w:type="dxa" w:w="7609"/>
             <w:tcBorders>
               <w:top w:val="single" w:color="D9DCD5" w:sz="4"/>
               <w:left w:val="single" w:color="D9DCD5" w:sz="4"/>
@@ -8322,7 +8322,7 @@
         </w:trPr>
         <w:tc>
           <w:tcPr>
-            <w:tcW w:type="dxa" w:w="1900"/>
+            <w:tcW w:type="dxa" w:w="2029"/>
             <w:tcBorders>
               <w:top w:val="single" w:color="D9DCD5" w:sz="4"/>
               <w:left w:val="single" w:color="D9DCD5" w:sz="4"/>
@@ -8349,7 +8349,7 @@
         </w:tc>
         <w:tc>
           <w:tcPr>
-            <w:tcW w:type="dxa" w:w="7126"/>
+            <w:tcW w:type="dxa" w:w="7609"/>
             <w:tcBorders>
               <w:top w:val="single" w:color="D9DCD5" w:sz="4"/>
               <w:left w:val="single" w:color="D9DCD5" w:sz="4"/>
@@ -8381,7 +8381,7 @@
         </w:trPr>
         <w:tc>
           <w:tcPr>
-            <w:tcW w:type="dxa" w:w="1900"/>
+            <w:tcW w:type="dxa" w:w="2029"/>
             <w:tcBorders>
               <w:top w:val="single" w:color="D9DCD5" w:sz="4"/>
               <w:left w:val="single" w:color="D9DCD5" w:sz="4"/>
@@ -8407,7 +8407,7 @@
         </w:tc>
         <w:tc>
           <w:tcPr>
-            <w:tcW w:type="dxa" w:w="7126"/>
+            <w:tcW w:type="dxa" w:w="7609"/>
             <w:tcBorders>
               <w:top w:val="single" w:color="D9DCD5" w:sz="4"/>
               <w:left w:val="single" w:color="D9DCD5" w:sz="4"/>
@@ -8438,7 +8438,7 @@
         </w:trPr>
         <w:tc>
           <w:tcPr>
-            <w:tcW w:type="dxa" w:w="1900"/>
+            <w:tcW w:type="dxa" w:w="2029"/>
             <w:tcBorders>
               <w:top w:val="single" w:color="D9DCD5" w:sz="4"/>
               <w:left w:val="single" w:color="D9DCD5" w:sz="4"/>
@@ -8465,7 +8465,7 @@
         </w:tc>
         <w:tc>
           <w:tcPr>
-            <w:tcW w:type="dxa" w:w="7126"/>
+            <w:tcW w:type="dxa" w:w="7609"/>
             <w:tcBorders>
               <w:top w:val="single" w:color="D9DCD5" w:sz="4"/>
               <w:left w:val="single" w:color="D9DCD5" w:sz="4"/>
@@ -8497,7 +8497,7 @@
         </w:trPr>
         <w:tc>
           <w:tcPr>
-            <w:tcW w:type="dxa" w:w="1900"/>
+            <w:tcW w:type="dxa" w:w="2029"/>
             <w:tcBorders>
               <w:top w:val="single" w:color="D9DCD5" w:sz="4"/>
               <w:left w:val="single" w:color="D9DCD5" w:sz="4"/>
@@ -8523,7 +8523,7 @@
         </w:tc>
         <w:tc>
           <w:tcPr>
-            <w:tcW w:type="dxa" w:w="7126"/>
+            <w:tcW w:type="dxa" w:w="7609"/>
             <w:tcBorders>
               <w:top w:val="single" w:color="D9DCD5" w:sz="4"/>
               <w:left w:val="single" w:color="D9DCD5" w:sz="4"/>
@@ -8554,7 +8554,7 @@
         </w:trPr>
         <w:tc>
           <w:tcPr>
-            <w:tcW w:type="dxa" w:w="1900"/>
+            <w:tcW w:type="dxa" w:w="2029"/>
             <w:tcBorders>
               <w:top w:val="single" w:color="D9DCD5" w:sz="4"/>
               <w:left w:val="single" w:color="D9DCD5" w:sz="4"/>
@@ -8581,7 +8581,7 @@
         </w:tc>
         <w:tc>
           <w:tcPr>
-            <w:tcW w:type="dxa" w:w="7126"/>
+            <w:tcW w:type="dxa" w:w="7609"/>
             <w:tcBorders>
               <w:top w:val="single" w:color="D9DCD5" w:sz="4"/>
               <w:left w:val="single" w:color="D9DCD5" w:sz="4"/>
@@ -8612,7 +8612,7 @@
       <w:pPr>
         <w:pStyle w:val="Heading1"/>
         <w:keepNext/>
-        <w:spacing w:after="200" w:before="360"/>
+        <w:spacing w:after="140" w:before="300"/>
       </w:pPr>
       <w:bookmarkStart w:name="_Toc28" w:id="28"/>
       <w:r>
@@ -8626,7 +8626,7 @@
           <w:left w:val="single" w:color="1F5F8B" w:sz="18" w:space="8"/>
         </w:pBdr>
         <w:shd w:fill="E8F0F6" w:val="clear"/>
-        <w:spacing w:after="160" w:before="120" w:line="288"/>
+        <w:spacing w:after="140" w:before="100" w:line="264"/>
         <w:ind w:left="200" w:right="200"/>
       </w:pPr>
       <w:r>
@@ -8645,7 +8645,7 @@
           <w:ilvl w:val="0"/>
           <w:numId w:val="2"/>
         </w:numPr>
-        <w:spacing w:after="60" w:line="288"/>
+        <w:spacing w:after="40" w:line="264"/>
       </w:pPr>
       <w:r>
         <w:rPr>
@@ -8665,7 +8665,7 @@
           <w:ilvl w:val="0"/>
           <w:numId w:val="2"/>
         </w:numPr>
-        <w:spacing w:after="60" w:line="288"/>
+        <w:spacing w:after="40" w:line="264"/>
       </w:pPr>
       <w:r>
         <w:rPr>
@@ -8685,7 +8685,7 @@
           <w:ilvl w:val="0"/>
           <w:numId w:val="2"/>
         </w:numPr>
-        <w:spacing w:after="60" w:line="288"/>
+        <w:spacing w:after="40" w:line="264"/>
       </w:pPr>
       <w:r>
         <w:rPr>
@@ -8705,7 +8705,7 @@
           <w:ilvl w:val="0"/>
           <w:numId w:val="2"/>
         </w:numPr>
-        <w:spacing w:after="60" w:line="288"/>
+        <w:spacing w:after="40" w:line="264"/>
       </w:pPr>
       <w:r>
         <w:rPr>
@@ -8725,7 +8725,7 @@
           <w:ilvl w:val="0"/>
           <w:numId w:val="2"/>
         </w:numPr>
-        <w:spacing w:after="60" w:line="288"/>
+        <w:spacing w:after="40" w:line="264"/>
       </w:pPr>
       <w:r>
         <w:rPr>
@@ -8745,7 +8745,7 @@
           <w:ilvl w:val="0"/>
           <w:numId w:val="2"/>
         </w:numPr>
-        <w:spacing w:after="60" w:line="288"/>
+        <w:spacing w:after="40" w:line="264"/>
       </w:pPr>
       <w:r>
         <w:rPr>
@@ -8765,7 +8765,7 @@
           <w:ilvl w:val="0"/>
           <w:numId w:val="2"/>
         </w:numPr>
-        <w:spacing w:after="60" w:line="288"/>
+        <w:spacing w:after="40" w:line="264"/>
       </w:pPr>
       <w:r>
         <w:rPr>
@@ -8785,7 +8785,7 @@
           <w:ilvl w:val="0"/>
           <w:numId w:val="2"/>
         </w:numPr>
-        <w:spacing w:after="60" w:line="288"/>
+        <w:spacing w:after="40" w:line="264"/>
       </w:pPr>
       <w:r>
         <w:rPr>
@@ -8802,7 +8802,7 @@
       <w:pPr>
         <w:pStyle w:val="Heading1"/>
         <w:keepNext/>
-        <w:spacing w:after="200" w:before="360"/>
+        <w:spacing w:after="140" w:before="300"/>
       </w:pPr>
       <w:bookmarkStart w:name="_Toc29" w:id="29"/>
       <w:r>
@@ -8812,7 +8812,7 @@
     </w:p>
     <w:tbl>
       <w:tblPr>
-        <w:tblW w:type="dxa" w:w="9026"/>
+        <w:tblW w:type="dxa" w:w="9638"/>
         <w:tblBorders>
           <w:top w:val="single" w:color="auto" w:sz="4"/>
           <w:left w:val="single" w:color="auto" w:sz="4"/>
@@ -8823,8 +8823,8 @@
         </w:tblBorders>
       </w:tblPr>
       <w:tblGrid>
-        <w:gridCol w:w="3200"/>
-        <w:gridCol w:w="5826"/>
+        <w:gridCol w:w="3417"/>
+        <w:gridCol w:w="6221"/>
       </w:tblGrid>
       <w:tr>
         <w:trPr>
@@ -8832,7 +8832,7 @@
         </w:trPr>
         <w:tc>
           <w:tcPr>
-            <w:tcW w:type="dxa" w:w="3200"/>
+            <w:tcW w:type="dxa" w:w="3417"/>
             <w:tcBorders>
               <w:top w:val="single" w:color="D9DCD5" w:sz="4"/>
               <w:left w:val="single" w:color="D9DCD5" w:sz="4"/>
@@ -8862,7 +8862,7 @@
         </w:tc>
         <w:tc>
           <w:tcPr>
-            <w:tcW w:type="dxa" w:w="5826"/>
+            <w:tcW w:type="dxa" w:w="6221"/>
             <w:tcBorders>
               <w:top w:val="single" w:color="D9DCD5" w:sz="4"/>
               <w:left w:val="single" w:color="D9DCD5" w:sz="4"/>
@@ -8897,7 +8897,7 @@
         </w:trPr>
         <w:tc>
           <w:tcPr>
-            <w:tcW w:type="dxa" w:w="3200"/>
+            <w:tcW w:type="dxa" w:w="3417"/>
             <w:tcBorders>
               <w:top w:val="single" w:color="D9DCD5" w:sz="4"/>
               <w:left w:val="single" w:color="D9DCD5" w:sz="4"/>
@@ -8923,7 +8923,7 @@
         </w:tc>
         <w:tc>
           <w:tcPr>
-            <w:tcW w:type="dxa" w:w="5826"/>
+            <w:tcW w:type="dxa" w:w="6221"/>
             <w:tcBorders>
               <w:top w:val="single" w:color="D9DCD5" w:sz="4"/>
               <w:left w:val="single" w:color="D9DCD5" w:sz="4"/>
@@ -8954,7 +8954,7 @@
         </w:trPr>
         <w:tc>
           <w:tcPr>
-            <w:tcW w:type="dxa" w:w="3200"/>
+            <w:tcW w:type="dxa" w:w="3417"/>
             <w:tcBorders>
               <w:top w:val="single" w:color="D9DCD5" w:sz="4"/>
               <w:left w:val="single" w:color="D9DCD5" w:sz="4"/>
@@ -8981,7 +8981,7 @@
         </w:tc>
         <w:tc>
           <w:tcPr>
-            <w:tcW w:type="dxa" w:w="5826"/>
+            <w:tcW w:type="dxa" w:w="6221"/>
             <w:tcBorders>
               <w:top w:val="single" w:color="D9DCD5" w:sz="4"/>
               <w:left w:val="single" w:color="D9DCD5" w:sz="4"/>
@@ -9013,7 +9013,7 @@
         </w:trPr>
         <w:tc>
           <w:tcPr>
-            <w:tcW w:type="dxa" w:w="3200"/>
+            <w:tcW w:type="dxa" w:w="3417"/>
             <w:tcBorders>
               <w:top w:val="single" w:color="D9DCD5" w:sz="4"/>
               <w:left w:val="single" w:color="D9DCD5" w:sz="4"/>
@@ -9039,7 +9039,7 @@
         </w:tc>
         <w:tc>
           <w:tcPr>
-            <w:tcW w:type="dxa" w:w="5826"/>
+            <w:tcW w:type="dxa" w:w="6221"/>
             <w:tcBorders>
               <w:top w:val="single" w:color="D9DCD5" w:sz="4"/>
               <w:left w:val="single" w:color="D9DCD5" w:sz="4"/>
@@ -9070,7 +9070,7 @@
         </w:trPr>
         <w:tc>
           <w:tcPr>
-            <w:tcW w:type="dxa" w:w="3200"/>
+            <w:tcW w:type="dxa" w:w="3417"/>
             <w:tcBorders>
               <w:top w:val="single" w:color="D9DCD5" w:sz="4"/>
               <w:left w:val="single" w:color="D9DCD5" w:sz="4"/>
@@ -9097,7 +9097,7 @@
         </w:tc>
         <w:tc>
           <w:tcPr>
-            <w:tcW w:type="dxa" w:w="5826"/>
+            <w:tcW w:type="dxa" w:w="6221"/>
             <w:tcBorders>
               <w:top w:val="single" w:color="D9DCD5" w:sz="4"/>
               <w:left w:val="single" w:color="D9DCD5" w:sz="4"/>
@@ -9129,7 +9129,7 @@
         </w:trPr>
         <w:tc>
           <w:tcPr>
-            <w:tcW w:type="dxa" w:w="3200"/>
+            <w:tcW w:type="dxa" w:w="3417"/>
             <w:tcBorders>
               <w:top w:val="single" w:color="D9DCD5" w:sz="4"/>
               <w:left w:val="single" w:color="D9DCD5" w:sz="4"/>
@@ -9155,7 +9155,7 @@
         </w:tc>
         <w:tc>
           <w:tcPr>
-            <w:tcW w:type="dxa" w:w="5826"/>
+            <w:tcW w:type="dxa" w:w="6221"/>
             <w:tcBorders>
               <w:top w:val="single" w:color="D9DCD5" w:sz="4"/>
               <w:left w:val="single" w:color="D9DCD5" w:sz="4"/>
@@ -9186,7 +9186,7 @@
         </w:trPr>
         <w:tc>
           <w:tcPr>
-            <w:tcW w:type="dxa" w:w="3200"/>
+            <w:tcW w:type="dxa" w:w="3417"/>
             <w:tcBorders>
               <w:top w:val="single" w:color="D9DCD5" w:sz="4"/>
               <w:left w:val="single" w:color="D9DCD5" w:sz="4"/>
@@ -9213,7 +9213,7 @@
         </w:tc>
         <w:tc>
           <w:tcPr>
-            <w:tcW w:type="dxa" w:w="5826"/>
+            <w:tcW w:type="dxa" w:w="6221"/>
             <w:tcBorders>
               <w:top w:val="single" w:color="D9DCD5" w:sz="4"/>
               <w:left w:val="single" w:color="D9DCD5" w:sz="4"/>
@@ -9245,7 +9245,7 @@
         </w:trPr>
         <w:tc>
           <w:tcPr>
-            <w:tcW w:type="dxa" w:w="3200"/>
+            <w:tcW w:type="dxa" w:w="3417"/>
             <w:tcBorders>
               <w:top w:val="single" w:color="D9DCD5" w:sz="4"/>
               <w:left w:val="single" w:color="D9DCD5" w:sz="4"/>
@@ -9271,7 +9271,7 @@
         </w:tc>
         <w:tc>
           <w:tcPr>
-            <w:tcW w:type="dxa" w:w="5826"/>
+            <w:tcW w:type="dxa" w:w="6221"/>
             <w:tcBorders>
               <w:top w:val="single" w:color="D9DCD5" w:sz="4"/>
               <w:left w:val="single" w:color="D9DCD5" w:sz="4"/>
@@ -9302,7 +9302,7 @@
         </w:trPr>
         <w:tc>
           <w:tcPr>
-            <w:tcW w:type="dxa" w:w="3200"/>
+            <w:tcW w:type="dxa" w:w="3417"/>
             <w:tcBorders>
               <w:top w:val="single" w:color="D9DCD5" w:sz="4"/>
               <w:left w:val="single" w:color="D9DCD5" w:sz="4"/>
@@ -9329,7 +9329,7 @@
         </w:tc>
         <w:tc>
           <w:tcPr>
-            <w:tcW w:type="dxa" w:w="5826"/>
+            <w:tcW w:type="dxa" w:w="6221"/>
             <w:tcBorders>
               <w:top w:val="single" w:color="D9DCD5" w:sz="4"/>
               <w:left w:val="single" w:color="D9DCD5" w:sz="4"/>
@@ -9361,7 +9361,7 @@
         </w:trPr>
         <w:tc>
           <w:tcPr>
-            <w:tcW w:type="dxa" w:w="3200"/>
+            <w:tcW w:type="dxa" w:w="3417"/>
             <w:tcBorders>
               <w:top w:val="single" w:color="D9DCD5" w:sz="4"/>
               <w:left w:val="single" w:color="D9DCD5" w:sz="4"/>
@@ -9387,7 +9387,7 @@
         </w:tc>
         <w:tc>
           <w:tcPr>
-            <w:tcW w:type="dxa" w:w="5826"/>
+            <w:tcW w:type="dxa" w:w="6221"/>
             <w:tcBorders>
               <w:top w:val="single" w:color="D9DCD5" w:sz="4"/>
               <w:left w:val="single" w:color="D9DCD5" w:sz="4"/>
@@ -9418,7 +9418,7 @@
         </w:trPr>
         <w:tc>
           <w:tcPr>
-            <w:tcW w:type="dxa" w:w="3200"/>
+            <w:tcW w:type="dxa" w:w="3417"/>
             <w:tcBorders>
               <w:top w:val="single" w:color="D9DCD5" w:sz="4"/>
               <w:left w:val="single" w:color="D9DCD5" w:sz="4"/>
@@ -9445,7 +9445,7 @@
         </w:tc>
         <w:tc>
           <w:tcPr>
-            <w:tcW w:type="dxa" w:w="5826"/>
+            <w:tcW w:type="dxa" w:w="6221"/>
             <w:tcBorders>
               <w:top w:val="single" w:color="D9DCD5" w:sz="4"/>
               <w:left w:val="single" w:color="D9DCD5" w:sz="4"/>
@@ -9477,7 +9477,7 @@
         </w:trPr>
         <w:tc>
           <w:tcPr>
-            <w:tcW w:type="dxa" w:w="3200"/>
+            <w:tcW w:type="dxa" w:w="3417"/>
             <w:tcBorders>
               <w:top w:val="single" w:color="D9DCD5" w:sz="4"/>
               <w:left w:val="single" w:color="D9DCD5" w:sz="4"/>
@@ -9503,7 +9503,7 @@
         </w:tc>
         <w:tc>
           <w:tcPr>
-            <w:tcW w:type="dxa" w:w="5826"/>
+            <w:tcW w:type="dxa" w:w="6221"/>
             <w:tcBorders>
               <w:top w:val="single" w:color="D9DCD5" w:sz="4"/>
               <w:left w:val="single" w:color="D9DCD5" w:sz="4"/>
@@ -9534,7 +9534,7 @@
         </w:trPr>
         <w:tc>
           <w:tcPr>
-            <w:tcW w:type="dxa" w:w="3200"/>
+            <w:tcW w:type="dxa" w:w="3417"/>
             <w:tcBorders>
               <w:top w:val="single" w:color="D9DCD5" w:sz="4"/>
               <w:left w:val="single" w:color="D9DCD5" w:sz="4"/>
@@ -9561,7 +9561,7 @@
         </w:tc>
         <w:tc>
           <w:tcPr>
-            <w:tcW w:type="dxa" w:w="5826"/>
+            <w:tcW w:type="dxa" w:w="6221"/>
             <w:tcBorders>
               <w:top w:val="single" w:color="D9DCD5" w:sz="4"/>
               <w:left w:val="single" w:color="D9DCD5" w:sz="4"/>
@@ -9593,7 +9593,7 @@
         </w:trPr>
         <w:tc>
           <w:tcPr>
-            <w:tcW w:type="dxa" w:w="3200"/>
+            <w:tcW w:type="dxa" w:w="3417"/>
             <w:tcBorders>
               <w:top w:val="single" w:color="D9DCD5" w:sz="4"/>
               <w:left w:val="single" w:color="D9DCD5" w:sz="4"/>
@@ -9619,7 +9619,7 @@
         </w:tc>
         <w:tc>
           <w:tcPr>
-            <w:tcW w:type="dxa" w:w="5826"/>
+            <w:tcW w:type="dxa" w:w="6221"/>
             <w:tcBorders>
               <w:top w:val="single" w:color="D9DCD5" w:sz="4"/>
               <w:left w:val="single" w:color="D9DCD5" w:sz="4"/>
@@ -9650,7 +9650,7 @@
         </w:trPr>
         <w:tc>
           <w:tcPr>
-            <w:tcW w:type="dxa" w:w="3200"/>
+            <w:tcW w:type="dxa" w:w="3417"/>
             <w:tcBorders>
               <w:top w:val="single" w:color="D9DCD5" w:sz="4"/>
               <w:left w:val="single" w:color="D9DCD5" w:sz="4"/>
@@ -9677,7 +9677,7 @@
         </w:tc>
         <w:tc>
           <w:tcPr>
-            <w:tcW w:type="dxa" w:w="5826"/>
+            <w:tcW w:type="dxa" w:w="6221"/>
             <w:tcBorders>
               <w:top w:val="single" w:color="D9DCD5" w:sz="4"/>
               <w:left w:val="single" w:color="D9DCD5" w:sz="4"/>
@@ -9709,7 +9709,7 @@
         </w:trPr>
         <w:tc>
           <w:tcPr>
-            <w:tcW w:type="dxa" w:w="3200"/>
+            <w:tcW w:type="dxa" w:w="3417"/>
             <w:tcBorders>
               <w:top w:val="single" w:color="D9DCD5" w:sz="4"/>
               <w:left w:val="single" w:color="D9DCD5" w:sz="4"/>
@@ -9735,7 +9735,7 @@
         </w:tc>
         <w:tc>
           <w:tcPr>
-            <w:tcW w:type="dxa" w:w="5826"/>
+            <w:tcW w:type="dxa" w:w="6221"/>
             <w:tcBorders>
               <w:top w:val="single" w:color="D9DCD5" w:sz="4"/>
               <w:left w:val="single" w:color="D9DCD5" w:sz="4"/>
@@ -9765,7 +9765,7 @@
       <w:pPr>
         <w:pStyle w:val="Heading1"/>
         <w:keepNext/>
-        <w:spacing w:after="200" w:before="360"/>
+        <w:spacing w:after="140" w:before="300"/>
       </w:pPr>
       <w:bookmarkStart w:name="_Toc30" w:id="30"/>
       <w:r>
@@ -9775,7 +9775,7 @@
     </w:p>
     <w:p>
       <w:pPr>
-        <w:spacing w:after="120" w:line="300"/>
+        <w:spacing w:after="100" w:line="276"/>
       </w:pPr>
       <w:r>
         <w:t xml:space="preserve">Ninguno de los trabajos de referencia de 2025 trata este punto, que forma parte de la definición de un crawler "bien educado":</w:t>
@@ -9788,7 +9788,7 @@
           <w:ilvl w:val="0"/>
           <w:numId w:val="2"/>
         </w:numPr>
-        <w:spacing w:after="60" w:line="288"/>
+        <w:spacing w:after="40" w:line="264"/>
       </w:pPr>
       <w:r>
         <w:rPr>
@@ -9808,7 +9808,7 @@
           <w:ilvl w:val="0"/>
           <w:numId w:val="2"/>
         </w:numPr>
-        <w:spacing w:after="60" w:line="288"/>
+        <w:spacing w:after="40" w:line="264"/>
       </w:pPr>
       <w:r>
         <w:rPr>
@@ -9828,7 +9828,7 @@
           <w:ilvl w:val="0"/>
           <w:numId w:val="2"/>
         </w:numPr>
-        <w:spacing w:after="60" w:line="288"/>
+        <w:spacing w:after="40" w:line="264"/>
       </w:pPr>
       <w:r>
         <w:rPr>
@@ -9848,7 +9848,7 @@
           <w:ilvl w:val="0"/>
           <w:numId w:val="2"/>
         </w:numPr>
-        <w:spacing w:after="60" w:line="288"/>
+        <w:spacing w:after="40" w:line="264"/>
       </w:pPr>
       <w:r>
         <w:rPr>
@@ -9868,7 +9868,7 @@
           <w:ilvl w:val="0"/>
           <w:numId w:val="2"/>
         </w:numPr>
-        <w:spacing w:after="60" w:line="288"/>
+        <w:spacing w:after="40" w:line="264"/>
       </w:pPr>
       <w:r>
         <w:rPr>
@@ -9885,7 +9885,7 @@
       <w:pPr>
         <w:pStyle w:val="Heading1"/>
         <w:keepNext/>
-        <w:spacing w:after="200" w:before="360"/>
+        <w:spacing w:after="140" w:before="300"/>
       </w:pPr>
       <w:bookmarkStart w:name="_Toc31" w:id="31"/>
       <w:r>
@@ -9900,7 +9900,7 @@
           <w:ilvl w:val="0"/>
           <w:numId w:val="2"/>
         </w:numPr>
-        <w:spacing w:after="60" w:line="288"/>
+        <w:spacing w:after="40" w:line="264"/>
       </w:pPr>
       <w:r>
         <w:rPr>
@@ -9920,7 +9920,7 @@
           <w:ilvl w:val="0"/>
           <w:numId w:val="2"/>
         </w:numPr>
-        <w:spacing w:after="60" w:line="288"/>
+        <w:spacing w:after="40" w:line="264"/>
       </w:pPr>
       <w:r>
         <w:rPr>
@@ -9940,7 +9940,7 @@
           <w:ilvl w:val="0"/>
           <w:numId w:val="2"/>
         </w:numPr>
-        <w:spacing w:after="60" w:line="288"/>
+        <w:spacing w:after="40" w:line="264"/>
       </w:pPr>
       <w:r>
         <w:rPr>
@@ -9960,7 +9960,7 @@
           <w:ilvl w:val="0"/>
           <w:numId w:val="2"/>
         </w:numPr>
-        <w:spacing w:after="60" w:line="288"/>
+        <w:spacing w:after="40" w:line="264"/>
       </w:pPr>
       <w:r>
         <w:rPr>
@@ -9980,7 +9980,7 @@
           <w:ilvl w:val="0"/>
           <w:numId w:val="2"/>
         </w:numPr>
-        <w:spacing w:after="60" w:line="288"/>
+        <w:spacing w:after="40" w:line="264"/>
       </w:pPr>
       <w:r>
         <w:rPr>
@@ -10000,7 +10000,7 @@
           <w:ilvl w:val="0"/>
           <w:numId w:val="2"/>
         </w:numPr>
-        <w:spacing w:after="60" w:line="288"/>
+        <w:spacing w:after="40" w:line="264"/>
       </w:pPr>
       <w:r>
         <w:rPr>
@@ -10020,7 +10020,7 @@
           <w:ilvl w:val="0"/>
           <w:numId w:val="2"/>
         </w:numPr>
-        <w:spacing w:after="60" w:line="288"/>
+        <w:spacing w:after="40" w:line="264"/>
       </w:pPr>
       <w:r>
         <w:rPr>
@@ -10037,7 +10037,7 @@
       <w:pPr>
         <w:pStyle w:val="Heading1"/>
         <w:keepNext/>
-        <w:spacing w:after="200" w:before="360"/>
+        <w:spacing w:after="140" w:before="300"/>
       </w:pPr>
       <w:bookmarkStart w:name="_Toc32" w:id="32"/>
       <w:r>
@@ -10052,7 +10052,7 @@
           <w:ilvl w:val="0"/>
           <w:numId w:val="2"/>
         </w:numPr>
-        <w:spacing w:after="60" w:line="288"/>
+        <w:spacing w:after="40" w:line="264"/>
       </w:pPr>
       <w:r>
         <w:t xml:space="preserve">Seguir la evolución de las comunidades del mapa de medios a lo largo de las semanas.</w:t>
@@ -10065,7 +10065,7 @@
           <w:ilvl w:val="0"/>
           <w:numId w:val="2"/>
         </w:numPr>
-        <w:spacing w:after="60" w:line="288"/>
+        <w:spacing w:after="40" w:line="264"/>
       </w:pPr>
       <w:r>
         <w:t xml:space="preserve">Con semanas de datos, medir si el clima mediático acompaña al dólar y sumar otros indicadores (inflación, riesgo país).</w:t>
@@ -10078,7 +10078,7 @@
           <w:ilvl w:val="0"/>
           <w:numId w:val="2"/>
         </w:numPr>
-        <w:spacing w:after="60" w:line="288"/>
+        <w:spacing w:after="40" w:line="264"/>
       </w:pPr>
       <w:r>
         <w:t xml:space="preserve">Resumen diario redactado con un modelo de lenguaje y enviado por correo o Telegram.</w:t>
@@ -10091,7 +10091,7 @@
           <w:ilvl w:val="0"/>
           <w:numId w:val="2"/>
         </w:numPr>
-        <w:spacing w:after="60" w:line="288"/>
+        <w:spacing w:after="40" w:line="264"/>
       </w:pPr>
       <w:r>
         <w:t xml:space="preserve">Ampliar las etiquetas manuales (con varios anotadores y acuerdo entre ellos) y ajustar un BERT en español con ellas.</w:t>
@@ -10101,7 +10101,7 @@
       <w:pPr>
         <w:pStyle w:val="Heading1"/>
         <w:keepNext/>
-        <w:spacing w:after="200" w:before="360"/>
+        <w:spacing w:after="140" w:before="300"/>
       </w:pPr>
       <w:bookmarkStart w:name="_Toc33" w:id="33"/>
       <w:r>
@@ -10213,7 +10213,7 @@
     </w:p>
     <w:p>
       <w:pPr>
-        <w:spacing w:after="120" w:line="300"/>
+        <w:spacing w:after="100" w:line="276"/>
       </w:pPr>
       <w:r>
         <w:t xml:space="preserve">En la nube no hace falta nada: el workflow corre solo cada 30 minutos y se puede lanzar a mano desde la pestaña Actions del repositorio.</w:t>
@@ -10223,7 +10223,7 @@
       <w:pPr>
         <w:pStyle w:val="Heading1"/>
         <w:keepNext/>
-        <w:spacing w:after="200" w:before="360"/>
+        <w:spacing w:after="140" w:before="300"/>
       </w:pPr>
       <w:bookmarkStart w:name="_Toc34" w:id="34"/>
       <w:r>
@@ -10233,7 +10233,7 @@
     </w:p>
     <w:p>
       <w:pPr>
-        <w:spacing w:after="120" w:line="300"/>
+        <w:spacing w:after="100" w:line="276"/>
       </w:pPr>
       <w:r>
         <w:t xml:space="preserve">Se pueden ejecutar en Datasette Lite desde el botón del tablero.</w:t>
@@ -10499,7 +10499,7 @@
     <w:sectPr>
       <w:footerReference w:type="default" r:id="rId6"/>
       <w:pgSz w:w="11906" w:h="16838" w:orient="portrait"/>
-      <w:pgMar w:top="1440" w:right="1440" w:bottom="1440" w:left="1440" w:header="708" w:footer="708" w:gutter="0"/>
+      <w:pgMar w:top="1134" w:right="1134" w:bottom="1134" w:left="1134" w:header="708" w:footer="500" w:gutter="0"/>
       <w:pgNumType/>
       <w:docGrid w:linePitch="360"/>
     </w:sectPr>
@@ -11102,7 +11102,7 @@
     <w:next w:val="Normal"/>
     <w:qFormat/>
     <w:pPr>
-      <w:spacing w:after="200" w:before="120"/>
+      <w:spacing w:after="140" w:before="120"/>
       <w:outlineLvl w:val="0"/>
     </w:pPr>
     <w:rPr>
@@ -11120,7 +11120,7 @@
     <w:next w:val="Normal"/>
     <w:qFormat/>
     <w:pPr>
-      <w:spacing w:after="120" w:before="240"/>
+      <w:spacing w:after="80" w:before="200"/>
       <w:outlineLvl w:val="1"/>
     </w:pPr>
     <w:rPr>

</xml_diff>